<commit_message>
Fix historical CI environment and include local presentation updates
</commit_message>
<xml_diff>
--- a/复赛冲刺材料-20261018/03-阶段汇报说明-20261018.docx
+++ b/复赛冲刺材料-20261018/03-阶段汇报说明-20261018.docx
@@ -55,7 +55,7 @@
           <w:rFonts w:ascii="PingFang SC" w:cs="PingFang SC" w:eastAsia="PingFang SC" w:hAnsi="PingFang SC"/>
           <w:color w:val="1F2937"/>
         </w:rPr>
-        <w:t>：先读第 1 节，把项目用一句大白话记住；再按第 2 节的顺序把页面点一遍；第 5 节是每个页面的"讲什么、点哪里"；第 7 节是名词小词典，遇到看不懂的词就去查；第 8 节是老师可能会问的问题。</w:t>
+        <w:t>：先读第 1 节，把项目用一句大白话记住；再按第 2 节的顺序把页面点一遍；第 5 节是每个页面的"讲什么、点哪里"；第 7 节是名词小词典，遇到看不懂的词就去查；第 8 节是老师可能会问的问题；老师追问 OAuth 时看第 9 节。</w:t>
       </w:r>
     </w:p>
     <w:p>
@@ -2174,7 +2174,7 @@
           <w:rFonts w:ascii="PingFang SC" w:cs="PingFang SC" w:eastAsia="PingFang SC" w:hAnsi="PingFang SC"/>
           <w:color w:val="1F2937"/>
         </w:rPr>
-        <w:t xml:space="preserve">：箭头方向很重要：令牌是 AS 发给代理的，不是父代理发给子代理的。</w:t>
+        <w:t>：箭头方向很重要：令牌是 AS 发给代理的，不是父代理发给子代理的。老师追问 OAuth 的细节时，按第 9 节回答。</w:t>
       </w:r>
     </w:p>
     <w:p>
@@ -6064,6 +6064,2087 @@
           <w:color w:val="1F2937"/>
         </w:rPr>
         <w:t xml:space="preserve">：如实说"这一点我们还没有验证，回去确认后再答复老师"，比临场编造好得多。</w:t>
+      </w:r>
+    </w:p>
+    <w:p>
+      <w:pPr>
+        <w:pStyle w:val="Heading1"/>
+        <w:spacing w:after="160" w:before="360"/>
+      </w:pPr>
+      <w:r>
+        <w:rPr>
+          <w:rFonts w:ascii="PingFang SC" w:cs="PingFang SC" w:eastAsia="PingFang SC" w:hAnsi="PingFang SC"/>
+        </w:rPr>
+        <w:t>9. 专题：OAuth 在我们这里怎么用、改进了什么</w:t>
+      </w:r>
+    </w:p>
+    <w:p>
+      <w:pPr>
+        <w:spacing w:after="120" w:line="320"/>
+      </w:pPr>
+      <w:r>
+        <w:rPr>
+          <w:rFonts w:ascii="PingFang SC" w:cs="PingFang SC" w:eastAsia="PingFang SC" w:hAnsi="PingFang SC"/>
+          <w:b/>
+          <w:bCs/>
+          <w:color w:val="1F2937"/>
+        </w:rPr>
+        <w:t>先记住一句话</w:t>
+      </w:r>
+      <w:r>
+        <w:rPr>
+          <w:rFonts w:ascii="PingFang SC" w:cs="PingFang SC" w:eastAsia="PingFang SC" w:hAnsi="PingFang SC"/>
+          <w:color w:val="1F2937"/>
+        </w:rPr>
+        <w:t>：OAuth 是骨架，我们没有改 OAuth 协议本身；我们做的是在它上面补齐 OAuth 管不到的事，并且把签名全部换成国密。论文里这部分写在 4.1"基础机制"，不列为创新点。复赛的创新点是双域共签，而双域共签里授权域核验的，正是这里由 OAuth 签发出来的委托链——这句话是把 OAuth 和创新点连起来的关键。</w:t>
+      </w:r>
+    </w:p>
+    <w:p>
+      <w:pPr>
+        <w:pStyle w:val="Heading2"/>
+        <w:spacing w:after="120" w:before="240"/>
+      </w:pPr>
+      <w:r>
+        <w:rPr>
+          <w:rFonts w:ascii="PingFang SC" w:cs="PingFang SC" w:eastAsia="PingFang SC" w:hAnsi="PingFang SC"/>
+        </w:rPr>
+        <w:t>9.1 一笔采购里 OAuth 走了哪几步</w:t>
+      </w:r>
+    </w:p>
+    <w:p>
+      <w:pPr>
+        <w:spacing w:after="120" w:line="320"/>
+      </w:pPr>
+      <w:r>
+        <w:rPr>
+          <w:rFonts w:ascii="PingFang SC" w:cs="PingFang SC" w:eastAsia="PingFang SC" w:hAnsi="PingFang SC"/>
+          <w:b/>
+          <w:bCs/>
+          <w:color w:val="1F2937"/>
+        </w:rPr>
+        <w:t>① 登录与同意</w:t>
+      </w:r>
+      <w:r>
+        <w:rPr>
+          <w:rFonts w:ascii="PingFang SC" w:cs="PingFang SC" w:eastAsia="PingFang SC" w:hAnsi="PingFang SC"/>
+          <w:color w:val="1F2937"/>
+        </w:rPr>
+        <w:t>：OIDC 授权码流程 + PKCE（RFC 7636）。"登录"和"同意这次采购的范围"分开记录；登录得到的 ID Token 只证明"谁登录了"，不能拿去下单。</w:t>
+      </w:r>
+    </w:p>
+    <w:p>
+      <w:pPr>
+        <w:spacing w:after="120" w:line="320"/>
+      </w:pPr>
+      <w:r>
+        <w:rPr>
+          <w:rFonts w:ascii="PingFang SC" w:cs="PingFang SC" w:eastAsia="PingFang SC" w:hAnsi="PingFang SC"/>
+          <w:b/>
+          <w:bCs/>
+          <w:color w:val="1F2937"/>
+        </w:rPr>
+        <w:t>② 签发根令牌</w:t>
+      </w:r>
+      <w:r>
+        <w:rPr>
+          <w:rFonts w:ascii="PingFang SC" w:cs="PingFang SC" w:eastAsia="PingFang SC" w:hAnsi="PingFang SC"/>
+          <w:color w:val="1F2937"/>
+        </w:rPr>
+        <w:t>：授权服务器给统筹代理签发根令牌（Access Token），令牌用 SM2 签名，写明持有者、任务、额度、工具、资源和有效期。</w:t>
+      </w:r>
+    </w:p>
+    <w:p>
+      <w:pPr>
+        <w:spacing w:after="120" w:line="320"/>
+      </w:pPr>
+      <w:r>
+        <w:rPr>
+          <w:rFonts w:ascii="PingFang SC" w:cs="PingFang SC" w:eastAsia="PingFang SC" w:hAnsi="PingFang SC"/>
+          <w:b/>
+          <w:bCs/>
+          <w:color w:val="1F2937"/>
+        </w:rPr>
+        <w:t>③ 两级委托</w:t>
+      </w:r>
+      <w:r>
+        <w:rPr>
+          <w:rFonts w:ascii="PingFang SC" w:cs="PingFang SC" w:eastAsia="PingFang SC" w:hAnsi="PingFang SC"/>
+          <w:color w:val="1F2937"/>
+        </w:rPr>
+        <w:t>：统筹代理 → 选品代理 → 执行代理，每一级都用 OAuth 令牌交换（Token Exchange，RFC 8693）向授权服务器申请，由授权服务器签发更小的子令牌。代理之间不能私自发令牌。</w:t>
+      </w:r>
+    </w:p>
+    <w:p>
+      <w:pPr>
+        <w:spacing w:after="120" w:line="320"/>
+      </w:pPr>
+      <w:r>
+        <w:rPr>
+          <w:rFonts w:ascii="PingFang SC" w:cs="PingFang SC" w:eastAsia="PingFang SC" w:hAnsi="PingFang SC"/>
+          <w:b/>
+          <w:bCs/>
+          <w:color w:val="1F2937"/>
+        </w:rPr>
+        <w:t>④ 调用工具</w:t>
+      </w:r>
+      <w:r>
+        <w:rPr>
+          <w:rFonts w:ascii="PingFang SC" w:cs="PingFang SC" w:eastAsia="PingFang SC" w:hAnsi="PingFang SC"/>
+          <w:color w:val="1F2937"/>
+        </w:rPr>
+        <w:t>：执行代理出示令牌，同时附一份用自己私钥签的 AG-Proof（每次请求一份）。</w:t>
+      </w:r>
+    </w:p>
+    <w:p>
+      <w:pPr>
+        <w:spacing w:after="120" w:line="320"/>
+      </w:pPr>
+      <w:r>
+        <w:rPr>
+          <w:rFonts w:ascii="PingFang SC" w:cs="PingFang SC" w:eastAsia="PingFang SC" w:hAnsi="PingFang SC"/>
+          <w:b/>
+          <w:bCs/>
+          <w:color w:val="1F2937"/>
+        </w:rPr>
+        <w:t>⑤ 网关把关</w:t>
+      </w:r>
+      <w:r>
+        <w:rPr>
+          <w:rFonts w:ascii="PingFang SC" w:cs="PingFang SC" w:eastAsia="PingFang SC" w:hAnsi="PingFang SC"/>
+          <w:color w:val="1F2937"/>
+        </w:rPr>
+        <w:t>：执行网关（OAuth 里的"资源服务器"）验令牌、验 AG-Proof，再在接受事务里查撤销和预算，全部通过才放行。</w:t>
+      </w:r>
+    </w:p>
+    <w:tbl>
+      <w:tblPr>
+        <w:tblW w:type="dxa" w:w="9026"/>
+        <w:tblBorders>
+          <w:top w:val="single" w:color="auto" w:sz="4"/>
+          <w:left w:val="single" w:color="auto" w:sz="4"/>
+          <w:bottom w:val="single" w:color="auto" w:sz="4"/>
+          <w:right w:val="single" w:color="auto" w:sz="4"/>
+          <w:insideH w:val="single" w:color="auto" w:sz="4"/>
+          <w:insideV w:val="single" w:color="auto" w:sz="4"/>
+        </w:tblBorders>
+      </w:tblPr>
+      <w:tblGrid>
+        <w:gridCol w:w="2700"/>
+        <w:gridCol w:w="6326"/>
+      </w:tblGrid>
+      <w:tr>
+        <w:trPr>
+          <w:tblHeader/>
+        </w:trPr>
+        <w:tc>
+          <w:tcPr>
+            <w:tcW w:type="dxa" w:w="2700"/>
+            <w:shd w:fill="E8EDF7" w:color="auto" w:val="clear"/>
+            <w:tcMar>
+              <w:top w:type="dxa" w:w="80"/>
+              <w:left w:type="dxa" w:w="110"/>
+              <w:bottom w:type="dxa" w:w="80"/>
+              <w:right w:type="dxa" w:w="110"/>
+            </w:tcMar>
+          </w:tcPr>
+          <w:p>
+            <w:pPr>
+              <w:spacing w:after="40" w:line="280"/>
+            </w:pPr>
+            <w:r>
+              <w:rPr>
+                <w:rFonts w:ascii="PingFang SC" w:cs="PingFang SC" w:eastAsia="PingFang SC" w:hAnsi="PingFang SC"/>
+                <w:b/>
+                <w:bCs/>
+                <w:color w:val="1F2937"/>
+                <w:sz w:val="19"/>
+                <w:szCs w:val="19"/>
+              </w:rPr>
+              <w:t>OAuth 里的角色</w:t>
+            </w:r>
+          </w:p>
+        </w:tc>
+        <w:tc>
+          <w:tcPr>
+            <w:tcW w:type="dxa" w:w="6326"/>
+            <w:shd w:fill="E8EDF7" w:color="auto" w:val="clear"/>
+            <w:tcMar>
+              <w:top w:type="dxa" w:w="80"/>
+              <w:left w:type="dxa" w:w="110"/>
+              <w:bottom w:type="dxa" w:w="80"/>
+              <w:right w:type="dxa" w:w="110"/>
+            </w:tcMar>
+          </w:tcPr>
+          <w:p>
+            <w:pPr>
+              <w:spacing w:after="40" w:line="280"/>
+            </w:pPr>
+            <w:r>
+              <w:rPr>
+                <w:rFonts w:ascii="PingFang SC" w:cs="PingFang SC" w:eastAsia="PingFang SC" w:hAnsi="PingFang SC"/>
+                <w:b/>
+                <w:bCs/>
+                <w:color w:val="1F2937"/>
+                <w:sz w:val="19"/>
+                <w:szCs w:val="19"/>
+              </w:rPr>
+              <w:t>在我们系统里是谁</w:t>
+            </w:r>
+          </w:p>
+        </w:tc>
+      </w:tr>
+      <w:tr>
+        <w:tc>
+          <w:tcPr>
+            <w:tcW w:type="dxa" w:w="2700"/>
+            <w:tcMar>
+              <w:top w:type="dxa" w:w="80"/>
+              <w:left w:type="dxa" w:w="110"/>
+              <w:bottom w:type="dxa" w:w="80"/>
+              <w:right w:type="dxa" w:w="110"/>
+            </w:tcMar>
+          </w:tcPr>
+          <w:p>
+            <w:pPr>
+              <w:spacing w:after="40" w:line="280"/>
+            </w:pPr>
+            <w:r>
+              <w:rPr>
+                <w:rFonts w:ascii="PingFang SC" w:cs="PingFang SC" w:eastAsia="PingFang SC" w:hAnsi="PingFang SC"/>
+                <w:b w:val="false"/>
+                <w:bCs w:val="false"/>
+                <w:color w:val="1F2937"/>
+                <w:sz w:val="19"/>
+                <w:szCs w:val="19"/>
+              </w:rPr>
+              <w:t>资源所有者（Resource Owner）</w:t>
+            </w:r>
+          </w:p>
+        </w:tc>
+        <w:tc>
+          <w:tcPr>
+            <w:tcW w:type="dxa" w:w="6326"/>
+            <w:tcMar>
+              <w:top w:type="dxa" w:w="80"/>
+              <w:left w:type="dxa" w:w="110"/>
+              <w:bottom w:type="dxa" w:w="80"/>
+              <w:right w:type="dxa" w:w="110"/>
+            </w:tcMar>
+          </w:tcPr>
+          <w:p>
+            <w:pPr>
+              <w:spacing w:after="40" w:line="280"/>
+            </w:pPr>
+            <w:r>
+              <w:rPr>
+                <w:rFonts w:ascii="PingFang SC" w:cs="PingFang SC" w:eastAsia="PingFang SC" w:hAnsi="PingFang SC"/>
+                <w:b w:val="false"/>
+                <w:bCs w:val="false"/>
+                <w:color w:val="1F2937"/>
+                <w:sz w:val="19"/>
+                <w:szCs w:val="19"/>
+              </w:rPr>
+              <w:t>批准采购的用户</w:t>
+            </w:r>
+          </w:p>
+        </w:tc>
+      </w:tr>
+      <w:tr>
+        <w:tc>
+          <w:tcPr>
+            <w:tcW w:type="dxa" w:w="2700"/>
+            <w:tcMar>
+              <w:top w:type="dxa" w:w="80"/>
+              <w:left w:type="dxa" w:w="110"/>
+              <w:bottom w:type="dxa" w:w="80"/>
+              <w:right w:type="dxa" w:w="110"/>
+            </w:tcMar>
+          </w:tcPr>
+          <w:p>
+            <w:pPr>
+              <w:spacing w:after="40" w:line="280"/>
+            </w:pPr>
+            <w:r>
+              <w:rPr>
+                <w:rFonts w:ascii="PingFang SC" w:cs="PingFang SC" w:eastAsia="PingFang SC" w:hAnsi="PingFang SC"/>
+                <w:b w:val="false"/>
+                <w:bCs w:val="false"/>
+                <w:color w:val="1F2937"/>
+                <w:sz w:val="19"/>
+                <w:szCs w:val="19"/>
+              </w:rPr>
+              <w:t>授权服务器（AS），兼 OIDC 身份提供方</w:t>
+            </w:r>
+          </w:p>
+        </w:tc>
+        <w:tc>
+          <w:tcPr>
+            <w:tcW w:type="dxa" w:w="6326"/>
+            <w:tcMar>
+              <w:top w:type="dxa" w:w="80"/>
+              <w:left w:type="dxa" w:w="110"/>
+              <w:bottom w:type="dxa" w:w="80"/>
+              <w:right w:type="dxa" w:w="110"/>
+            </w:tcMar>
+          </w:tcPr>
+          <w:p>
+            <w:pPr>
+              <w:spacing w:after="40" w:line="280"/>
+            </w:pPr>
+            <w:r>
+              <w:rPr>
+                <w:rFonts w:ascii="PingFang SC" w:cs="PingFang SC" w:eastAsia="PingFang SC" w:hAnsi="PingFang SC"/>
+                <w:b w:val="false"/>
+                <w:bCs w:val="false"/>
+                <w:color w:val="1F2937"/>
+                <w:sz w:val="19"/>
+                <w:szCs w:val="19"/>
+              </w:rPr>
+              <w:t>授权服务器：登录、记录同意、签发 / 交换 / 撤销令牌</w:t>
+            </w:r>
+          </w:p>
+        </w:tc>
+      </w:tr>
+      <w:tr>
+        <w:tc>
+          <w:tcPr>
+            <w:tcW w:type="dxa" w:w="2700"/>
+            <w:tcMar>
+              <w:top w:type="dxa" w:w="80"/>
+              <w:left w:type="dxa" w:w="110"/>
+              <w:bottom w:type="dxa" w:w="80"/>
+              <w:right w:type="dxa" w:w="110"/>
+            </w:tcMar>
+          </w:tcPr>
+          <w:p>
+            <w:pPr>
+              <w:spacing w:after="40" w:line="280"/>
+            </w:pPr>
+            <w:r>
+              <w:rPr>
+                <w:rFonts w:ascii="PingFang SC" w:cs="PingFang SC" w:eastAsia="PingFang SC" w:hAnsi="PingFang SC"/>
+                <w:b w:val="false"/>
+                <w:bCs w:val="false"/>
+                <w:color w:val="1F2937"/>
+                <w:sz w:val="19"/>
+                <w:szCs w:val="19"/>
+              </w:rPr>
+              <w:t>客户端（Client）</w:t>
+            </w:r>
+          </w:p>
+        </w:tc>
+        <w:tc>
+          <w:tcPr>
+            <w:tcW w:type="dxa" w:w="6326"/>
+            <w:tcMar>
+              <w:top w:type="dxa" w:w="80"/>
+              <w:left w:type="dxa" w:w="110"/>
+              <w:bottom w:type="dxa" w:w="80"/>
+              <w:right w:type="dxa" w:w="110"/>
+            </w:tcMar>
+          </w:tcPr>
+          <w:p>
+            <w:pPr>
+              <w:spacing w:after="40" w:line="280"/>
+            </w:pPr>
+            <w:r>
+              <w:rPr>
+                <w:rFonts w:ascii="PingFang SC" w:cs="PingFang SC" w:eastAsia="PingFang SC" w:hAnsi="PingFang SC"/>
+                <w:b w:val="false"/>
+                <w:bCs w:val="false"/>
+                <w:color w:val="1F2937"/>
+                <w:sz w:val="19"/>
+                <w:szCs w:val="19"/>
+              </w:rPr>
+              <w:t>统筹、选品、执行三个代理的后端，各自有独立 client_id 和 SM2 私钥</w:t>
+            </w:r>
+          </w:p>
+        </w:tc>
+      </w:tr>
+      <w:tr>
+        <w:tc>
+          <w:tcPr>
+            <w:tcW w:type="dxa" w:w="2700"/>
+            <w:tcMar>
+              <w:top w:type="dxa" w:w="80"/>
+              <w:left w:type="dxa" w:w="110"/>
+              <w:bottom w:type="dxa" w:w="80"/>
+              <w:right w:type="dxa" w:w="110"/>
+            </w:tcMar>
+          </w:tcPr>
+          <w:p>
+            <w:pPr>
+              <w:spacing w:after="40" w:line="280"/>
+            </w:pPr>
+            <w:r>
+              <w:rPr>
+                <w:rFonts w:ascii="PingFang SC" w:cs="PingFang SC" w:eastAsia="PingFang SC" w:hAnsi="PingFang SC"/>
+                <w:b w:val="false"/>
+                <w:bCs w:val="false"/>
+                <w:color w:val="1F2937"/>
+                <w:sz w:val="19"/>
+                <w:szCs w:val="19"/>
+              </w:rPr>
+              <w:t>资源服务器（Resource Server）</w:t>
+            </w:r>
+          </w:p>
+        </w:tc>
+        <w:tc>
+          <w:tcPr>
+            <w:tcW w:type="dxa" w:w="6326"/>
+            <w:tcMar>
+              <w:top w:type="dxa" w:w="80"/>
+              <w:left w:type="dxa" w:w="110"/>
+              <w:bottom w:type="dxa" w:w="80"/>
+              <w:right w:type="dxa" w:w="110"/>
+            </w:tcMar>
+          </w:tcPr>
+          <w:p>
+            <w:pPr>
+              <w:spacing w:after="40" w:line="280"/>
+            </w:pPr>
+            <w:r>
+              <w:rPr>
+                <w:rFonts w:ascii="PingFang SC" w:cs="PingFang SC" w:eastAsia="PingFang SC" w:hAnsi="PingFang SC"/>
+                <w:b w:val="false"/>
+                <w:bCs w:val="false"/>
+                <w:color w:val="1F2937"/>
+                <w:sz w:val="19"/>
+                <w:szCs w:val="19"/>
+              </w:rPr>
+              <w:t>执行网关；下游订单服务只信任网关</w:t>
+            </w:r>
+          </w:p>
+        </w:tc>
+      </w:tr>
+      <w:tr>
+        <w:tc>
+          <w:tcPr>
+            <w:tcW w:type="dxa" w:w="2700"/>
+            <w:tcMar>
+              <w:top w:type="dxa" w:w="80"/>
+              <w:left w:type="dxa" w:w="110"/>
+              <w:bottom w:type="dxa" w:w="80"/>
+              <w:right w:type="dxa" w:w="110"/>
+            </w:tcMar>
+          </w:tcPr>
+          <w:p>
+            <w:pPr>
+              <w:spacing w:after="40" w:line="280"/>
+            </w:pPr>
+            <w:r>
+              <w:rPr>
+                <w:rFonts w:ascii="PingFang SC" w:cs="PingFang SC" w:eastAsia="PingFang SC" w:hAnsi="PingFang SC"/>
+                <w:b w:val="false"/>
+                <w:bCs w:val="false"/>
+                <w:color w:val="1F2937"/>
+                <w:sz w:val="19"/>
+                <w:szCs w:val="19"/>
+              </w:rPr>
+              <w:t>依赖方（Relying Party）</w:t>
+            </w:r>
+          </w:p>
+        </w:tc>
+        <w:tc>
+          <w:tcPr>
+            <w:tcW w:type="dxa" w:w="6326"/>
+            <w:tcMar>
+              <w:top w:type="dxa" w:w="80"/>
+              <w:left w:type="dxa" w:w="110"/>
+              <w:bottom w:type="dxa" w:w="80"/>
+              <w:right w:type="dxa" w:w="110"/>
+            </w:tcMar>
+          </w:tcPr>
+          <w:p>
+            <w:pPr>
+              <w:spacing w:after="40" w:line="280"/>
+            </w:pPr>
+            <w:r>
+              <w:rPr>
+                <w:rFonts w:ascii="PingFang SC" w:cs="PingFang SC" w:eastAsia="PingFang SC" w:hAnsi="PingFang SC"/>
+                <w:b w:val="false"/>
+                <w:bCs w:val="false"/>
+                <w:color w:val="1F2937"/>
+                <w:sz w:val="19"/>
+                <w:szCs w:val="19"/>
+              </w:rPr>
+              <w:t>统筹代理的后端，用户从这里登录</w:t>
+            </w:r>
+          </w:p>
+        </w:tc>
+      </w:tr>
+    </w:tbl>
+    <w:p>
+      <w:pPr>
+        <w:pStyle w:val="Heading2"/>
+        <w:spacing w:after="120" w:before="240"/>
+      </w:pPr>
+      <w:r>
+        <w:rPr>
+          <w:rFonts w:ascii="PingFang SC" w:cs="PingFang SC" w:eastAsia="PingFang SC" w:hAnsi="PingFang SC"/>
+        </w:rPr>
+        <w:t>9.2 我们在 OAuth 之上补了什么（核心，八条）</w:t>
+      </w:r>
+    </w:p>
+    <w:tbl>
+      <w:tblPr>
+        <w:tblW w:type="dxa" w:w="9026"/>
+        <w:tblBorders>
+          <w:top w:val="single" w:color="auto" w:sz="4"/>
+          <w:left w:val="single" w:color="auto" w:sz="4"/>
+          <w:bottom w:val="single" w:color="auto" w:sz="4"/>
+          <w:right w:val="single" w:color="auto" w:sz="4"/>
+          <w:insideH w:val="single" w:color="auto" w:sz="4"/>
+          <w:insideV w:val="single" w:color="auto" w:sz="4"/>
+        </w:tblBorders>
+      </w:tblPr>
+      <w:tblGrid>
+        <w:gridCol w:w="2700"/>
+        <w:gridCol w:w="3000"/>
+        <w:gridCol w:w="3326"/>
+      </w:tblGrid>
+      <w:tr>
+        <w:trPr>
+          <w:tblHeader/>
+        </w:trPr>
+        <w:tc>
+          <w:tcPr>
+            <w:tcW w:type="dxa" w:w="2700"/>
+            <w:shd w:fill="E8EDF7" w:color="auto" w:val="clear"/>
+            <w:tcMar>
+              <w:top w:type="dxa" w:w="80"/>
+              <w:left w:type="dxa" w:w="110"/>
+              <w:bottom w:type="dxa" w:w="80"/>
+              <w:right w:type="dxa" w:w="110"/>
+            </w:tcMar>
+          </w:tcPr>
+          <w:p>
+            <w:pPr>
+              <w:spacing w:after="40" w:line="280"/>
+            </w:pPr>
+            <w:r>
+              <w:rPr>
+                <w:rFonts w:ascii="PingFang SC" w:cs="PingFang SC" w:eastAsia="PingFang SC" w:hAnsi="PingFang SC"/>
+                <w:b/>
+                <w:bCs/>
+                <w:color w:val="1F2937"/>
+                <w:sz w:val="19"/>
+                <w:szCs w:val="19"/>
+              </w:rPr>
+              <w:t>问题</w:t>
+            </w:r>
+          </w:p>
+        </w:tc>
+        <w:tc>
+          <w:tcPr>
+            <w:tcW w:type="dxa" w:w="3000"/>
+            <w:shd w:fill="E8EDF7" w:color="auto" w:val="clear"/>
+            <w:tcMar>
+              <w:top w:type="dxa" w:w="80"/>
+              <w:left w:type="dxa" w:w="110"/>
+              <w:bottom w:type="dxa" w:w="80"/>
+              <w:right w:type="dxa" w:w="110"/>
+            </w:tcMar>
+          </w:tcPr>
+          <w:p>
+            <w:pPr>
+              <w:spacing w:after="40" w:line="280"/>
+            </w:pPr>
+            <w:r>
+              <w:rPr>
+                <w:rFonts w:ascii="PingFang SC" w:cs="PingFang SC" w:eastAsia="PingFang SC" w:hAnsi="PingFang SC"/>
+                <w:b/>
+                <w:bCs/>
+                <w:color w:val="1F2937"/>
+                <w:sz w:val="19"/>
+                <w:szCs w:val="19"/>
+              </w:rPr>
+              <w:t>标准 OAuth 的情况</w:t>
+            </w:r>
+          </w:p>
+        </w:tc>
+        <w:tc>
+          <w:tcPr>
+            <w:tcW w:type="dxa" w:w="3326"/>
+            <w:shd w:fill="E8EDF7" w:color="auto" w:val="clear"/>
+            <w:tcMar>
+              <w:top w:type="dxa" w:w="80"/>
+              <w:left w:type="dxa" w:w="110"/>
+              <w:bottom w:type="dxa" w:w="80"/>
+              <w:right w:type="dxa" w:w="110"/>
+            </w:tcMar>
+          </w:tcPr>
+          <w:p>
+            <w:pPr>
+              <w:spacing w:after="40" w:line="280"/>
+            </w:pPr>
+            <w:r>
+              <w:rPr>
+                <w:rFonts w:ascii="PingFang SC" w:cs="PingFang SC" w:eastAsia="PingFang SC" w:hAnsi="PingFang SC"/>
+                <w:b/>
+                <w:bCs/>
+                <w:color w:val="1F2937"/>
+                <w:sz w:val="19"/>
+                <w:szCs w:val="19"/>
+              </w:rPr>
+              <w:t>我们补了什么（对应页面）</w:t>
+            </w:r>
+          </w:p>
+        </w:tc>
+      </w:tr>
+      <w:tr>
+        <w:tc>
+          <w:tcPr>
+            <w:tcW w:type="dxa" w:w="2700"/>
+            <w:tcMar>
+              <w:top w:type="dxa" w:w="80"/>
+              <w:left w:type="dxa" w:w="110"/>
+              <w:bottom w:type="dxa" w:w="80"/>
+              <w:right w:type="dxa" w:w="110"/>
+            </w:tcMar>
+          </w:tcPr>
+          <w:p>
+            <w:pPr>
+              <w:spacing w:after="40" w:line="280"/>
+            </w:pPr>
+            <w:r>
+              <w:rPr>
+                <w:rFonts w:ascii="PingFang SC" w:cs="PingFang SC" w:eastAsia="PingFang SC" w:hAnsi="PingFang SC"/>
+                <w:b w:val="false"/>
+                <w:bCs w:val="false"/>
+                <w:color w:val="1F2937"/>
+                <w:sz w:val="19"/>
+                <w:szCs w:val="19"/>
+              </w:rPr>
+              <w:t>签名算法</w:t>
+            </w:r>
+          </w:p>
+        </w:tc>
+        <w:tc>
+          <w:tcPr>
+            <w:tcW w:type="dxa" w:w="3000"/>
+            <w:tcMar>
+              <w:top w:type="dxa" w:w="80"/>
+              <w:left w:type="dxa" w:w="110"/>
+              <w:bottom w:type="dxa" w:w="80"/>
+              <w:right w:type="dxa" w:w="110"/>
+            </w:tcMar>
+          </w:tcPr>
+          <w:p>
+            <w:pPr>
+              <w:spacing w:after="40" w:line="280"/>
+            </w:pPr>
+            <w:r>
+              <w:rPr>
+                <w:rFonts w:ascii="PingFang SC" w:cs="PingFang SC" w:eastAsia="PingFang SC" w:hAnsi="PingFang SC"/>
+                <w:b w:val="false"/>
+                <w:bCs w:val="false"/>
+                <w:color w:val="1F2937"/>
+                <w:sz w:val="19"/>
+                <w:szCs w:val="19"/>
+              </w:rPr>
+              <w:t>常见是 RSA / ECDSA，没有国密</w:t>
+            </w:r>
+          </w:p>
+        </w:tc>
+        <w:tc>
+          <w:tcPr>
+            <w:tcW w:type="dxa" w:w="3326"/>
+            <w:tcMar>
+              <w:top w:type="dxa" w:w="80"/>
+              <w:left w:type="dxa" w:w="110"/>
+              <w:bottom w:type="dxa" w:w="80"/>
+              <w:right w:type="dxa" w:w="110"/>
+            </w:tcMar>
+          </w:tcPr>
+          <w:p>
+            <w:pPr>
+              <w:spacing w:after="40" w:line="280"/>
+            </w:pPr>
+            <w:r>
+              <w:rPr>
+                <w:rFonts w:ascii="PingFang SC" w:cs="PingFang SC" w:eastAsia="PingFang SC" w:hAnsi="PingFang SC"/>
+                <w:b w:val="false"/>
+                <w:bCs w:val="false"/>
+                <w:color w:val="1F2937"/>
+                <w:sz w:val="19"/>
+                <w:szCs w:val="19"/>
+              </w:rPr>
+              <w:t>令牌、ID Token、请求证明全部 SM2 签名、SM3 摘要（配置名 GM-MVP-1）；不同用途的令牌用 typ 区分，不能串用</w:t>
+            </w:r>
+          </w:p>
+        </w:tc>
+      </w:tr>
+      <w:tr>
+        <w:tc>
+          <w:tcPr>
+            <w:tcW w:type="dxa" w:w="2700"/>
+            <w:tcMar>
+              <w:top w:type="dxa" w:w="80"/>
+              <w:left w:type="dxa" w:w="110"/>
+              <w:bottom w:type="dxa" w:w="80"/>
+              <w:right w:type="dxa" w:w="110"/>
+            </w:tcMar>
+          </w:tcPr>
+          <w:p>
+            <w:pPr>
+              <w:spacing w:after="40" w:line="280"/>
+            </w:pPr>
+            <w:r>
+              <w:rPr>
+                <w:rFonts w:ascii="PingFang SC" w:cs="PingFang SC" w:eastAsia="PingFang SC" w:hAnsi="PingFang SC"/>
+                <w:b w:val="false"/>
+                <w:bCs w:val="false"/>
+                <w:color w:val="1F2937"/>
+                <w:sz w:val="19"/>
+                <w:szCs w:val="19"/>
+              </w:rPr>
+              <w:t>令牌被偷</w:t>
+            </w:r>
+          </w:p>
+        </w:tc>
+        <w:tc>
+          <w:tcPr>
+            <w:tcW w:type="dxa" w:w="3000"/>
+            <w:tcMar>
+              <w:top w:type="dxa" w:w="80"/>
+              <w:left w:type="dxa" w:w="110"/>
+              <w:bottom w:type="dxa" w:w="80"/>
+              <w:right w:type="dxa" w:w="110"/>
+            </w:tcMar>
+          </w:tcPr>
+          <w:p>
+            <w:pPr>
+              <w:spacing w:after="40" w:line="280"/>
+            </w:pPr>
+            <w:r>
+              <w:rPr>
+                <w:rFonts w:ascii="PingFang SC" w:cs="PingFang SC" w:eastAsia="PingFang SC" w:hAnsi="PingFang SC"/>
+                <w:b w:val="false"/>
+                <w:bCs w:val="false"/>
+                <w:color w:val="1F2937"/>
+                <w:sz w:val="19"/>
+                <w:szCs w:val="19"/>
+              </w:rPr>
+              <w:t>Bearer 令牌拿到就能用；DPoP 能绑定密钥，但默认不签请求体，摘要固定 SHA-256</w:t>
+            </w:r>
+          </w:p>
+        </w:tc>
+        <w:tc>
+          <w:tcPr>
+            <w:tcW w:type="dxa" w:w="3326"/>
+            <w:tcMar>
+              <w:top w:type="dxa" w:w="80"/>
+              <w:left w:type="dxa" w:w="110"/>
+              <w:bottom w:type="dxa" w:w="80"/>
+              <w:right w:type="dxa" w:w="110"/>
+            </w:tcMar>
+          </w:tcPr>
+          <w:p>
+            <w:pPr>
+              <w:spacing w:after="40" w:line="280"/>
+            </w:pPr>
+            <w:r>
+              <w:rPr>
+                <w:rFonts w:ascii="PingFang SC" w:cs="PingFang SC" w:eastAsia="PingFang SC" w:hAnsi="PingFang SC"/>
+                <w:b w:val="false"/>
+                <w:bCs w:val="false"/>
+                <w:color w:val="1F2937"/>
+                <w:sz w:val="19"/>
+                <w:szCs w:val="19"/>
+              </w:rPr>
+              <w:t>令牌用 ag_cnf 绑定持有者公钥（经 DID 文档和企业登记表确认）；每次请求附 AG-Proof，用 SM3 绑定令牌和完整请求体，并区分用途、防重放（持有者绑定、参数篡改、重放幂等）</w:t>
+            </w:r>
+          </w:p>
+        </w:tc>
+      </w:tr>
+      <w:tr>
+        <w:tc>
+          <w:tcPr>
+            <w:tcW w:type="dxa" w:w="2700"/>
+            <w:tcMar>
+              <w:top w:type="dxa" w:w="80"/>
+              <w:left w:type="dxa" w:w="110"/>
+              <w:bottom w:type="dxa" w:w="80"/>
+              <w:right w:type="dxa" w:w="110"/>
+            </w:tcMar>
+          </w:tcPr>
+          <w:p>
+            <w:pPr>
+              <w:spacing w:after="40" w:line="280"/>
+            </w:pPr>
+            <w:r>
+              <w:rPr>
+                <w:rFonts w:ascii="PingFang SC" w:cs="PingFang SC" w:eastAsia="PingFang SC" w:hAnsi="PingFang SC"/>
+                <w:b w:val="false"/>
+                <w:bCs w:val="false"/>
+                <w:color w:val="1F2937"/>
+                <w:sz w:val="19"/>
+                <w:szCs w:val="19"/>
+              </w:rPr>
+              <w:t>委托收窄</w:t>
+            </w:r>
+          </w:p>
+        </w:tc>
+        <w:tc>
+          <w:tcPr>
+            <w:tcW w:type="dxa" w:w="3000"/>
+            <w:tcMar>
+              <w:top w:type="dxa" w:w="80"/>
+              <w:left w:type="dxa" w:w="110"/>
+              <w:bottom w:type="dxa" w:w="80"/>
+              <w:right w:type="dxa" w:w="110"/>
+            </w:tcMar>
+          </w:tcPr>
+          <w:p>
+            <w:pPr>
+              <w:spacing w:after="40" w:line="280"/>
+            </w:pPr>
+            <w:r>
+              <w:rPr>
+                <w:rFonts w:ascii="PingFang SC" w:cs="PingFang SC" w:eastAsia="PingFang SC" w:hAnsi="PingFang SC"/>
+                <w:b w:val="false"/>
+                <w:bCs w:val="false"/>
+                <w:color w:val="1F2937"/>
+                <w:sz w:val="19"/>
+                <w:szCs w:val="19"/>
+              </w:rPr>
+              <w:t>RFC 8693 只规定"怎么换"，不保证子令牌更小</w:t>
+            </w:r>
+          </w:p>
+        </w:tc>
+        <w:tc>
+          <w:tcPr>
+            <w:tcW w:type="dxa" w:w="3326"/>
+            <w:tcMar>
+              <w:top w:type="dxa" w:w="80"/>
+              <w:left w:type="dxa" w:w="110"/>
+              <w:bottom w:type="dxa" w:w="80"/>
+              <w:right w:type="dxa" w:w="110"/>
+            </w:tcMar>
+          </w:tcPr>
+          <w:p>
+            <w:pPr>
+              <w:spacing w:after="40" w:line="280"/>
+            </w:pPr>
+            <w:r>
+              <w:rPr>
+                <w:rFonts w:ascii="PingFang SC" w:cs="PingFang SC" w:eastAsia="PingFang SC" w:hAnsi="PingFang SC"/>
+                <w:b w:val="false"/>
+                <w:bCs w:val="false"/>
+                <w:color w:val="1F2937"/>
+                <w:sz w:val="19"/>
+                <w:szCs w:val="19"/>
+              </w:rPr>
+              <w:t>授权服务器逐维比较金额、次数、期限、深度、工具、受众、接收方和资源清单，子授权必须包含于父授权；超出一点就拒绝，不悄悄缩小（委托收窄）</w:t>
+            </w:r>
+          </w:p>
+        </w:tc>
+      </w:tr>
+      <w:tr>
+        <w:tc>
+          <w:tcPr>
+            <w:tcW w:type="dxa" w:w="2700"/>
+            <w:tcMar>
+              <w:top w:type="dxa" w:w="80"/>
+              <w:left w:type="dxa" w:w="110"/>
+              <w:bottom w:type="dxa" w:w="80"/>
+              <w:right w:type="dxa" w:w="110"/>
+            </w:tcMar>
+          </w:tcPr>
+          <w:p>
+            <w:pPr>
+              <w:spacing w:after="40" w:line="280"/>
+            </w:pPr>
+            <w:r>
+              <w:rPr>
+                <w:rFonts w:ascii="PingFang SC" w:cs="PingFang SC" w:eastAsia="PingFang SC" w:hAnsi="PingFang SC"/>
+                <w:b w:val="false"/>
+                <w:bCs w:val="false"/>
+                <w:color w:val="1F2937"/>
+                <w:sz w:val="19"/>
+                <w:szCs w:val="19"/>
+              </w:rPr>
+              <w:t>谁来签发</w:t>
+            </w:r>
+          </w:p>
+        </w:tc>
+        <w:tc>
+          <w:tcPr>
+            <w:tcW w:type="dxa" w:w="3000"/>
+            <w:tcMar>
+              <w:top w:type="dxa" w:w="80"/>
+              <w:left w:type="dxa" w:w="110"/>
+              <w:bottom w:type="dxa" w:w="80"/>
+              <w:right w:type="dxa" w:w="110"/>
+            </w:tcMar>
+          </w:tcPr>
+          <w:p>
+            <w:pPr>
+              <w:spacing w:after="40" w:line="280"/>
+            </w:pPr>
+            <w:r>
+              <w:rPr>
+                <w:rFonts w:ascii="PingFang SC" w:cs="PingFang SC" w:eastAsia="PingFang SC" w:hAnsi="PingFang SC"/>
+                <w:b w:val="false"/>
+                <w:bCs w:val="false"/>
+                <w:color w:val="1F2937"/>
+                <w:sz w:val="19"/>
+                <w:szCs w:val="19"/>
+              </w:rPr>
+              <w:t>委托可以设计成由上级自己签</w:t>
+            </w:r>
+          </w:p>
+        </w:tc>
+        <w:tc>
+          <w:tcPr>
+            <w:tcW w:type="dxa" w:w="3326"/>
+            <w:tcMar>
+              <w:top w:type="dxa" w:w="80"/>
+              <w:left w:type="dxa" w:w="110"/>
+              <w:bottom w:type="dxa" w:w="80"/>
+              <w:right w:type="dxa" w:w="110"/>
+            </w:tcMar>
+          </w:tcPr>
+          <w:p>
+            <w:pPr>
+              <w:spacing w:after="40" w:line="280"/>
+            </w:pPr>
+            <w:r>
+              <w:rPr>
+                <w:rFonts w:ascii="PingFang SC" w:cs="PingFang SC" w:eastAsia="PingFang SC" w:hAnsi="PingFang SC"/>
+                <w:b w:val="false"/>
+                <w:bCs w:val="false"/>
+                <w:color w:val="1F2937"/>
+                <w:sz w:val="19"/>
+                <w:szCs w:val="19"/>
+              </w:rPr>
+              <w:t>只有授权服务器能签令牌；上级代理只能签"委托申请"；下级的公钥从登记表查，申请方不能随便填</w:t>
+            </w:r>
+          </w:p>
+        </w:tc>
+      </w:tr>
+      <w:tr>
+        <w:tc>
+          <w:tcPr>
+            <w:tcW w:type="dxa" w:w="2700"/>
+            <w:tcMar>
+              <w:top w:type="dxa" w:w="80"/>
+              <w:left w:type="dxa" w:w="110"/>
+              <w:bottom w:type="dxa" w:w="80"/>
+              <w:right w:type="dxa" w:w="110"/>
+            </w:tcMar>
+          </w:tcPr>
+          <w:p>
+            <w:pPr>
+              <w:spacing w:after="40" w:line="280"/>
+            </w:pPr>
+            <w:r>
+              <w:rPr>
+                <w:rFonts w:ascii="PingFang SC" w:cs="PingFang SC" w:eastAsia="PingFang SC" w:hAnsi="PingFang SC"/>
+                <w:b w:val="false"/>
+                <w:bCs w:val="false"/>
+                <w:color w:val="1F2937"/>
+                <w:sz w:val="19"/>
+                <w:szCs w:val="19"/>
+              </w:rPr>
+              <w:t>累计预算</w:t>
+            </w:r>
+          </w:p>
+        </w:tc>
+        <w:tc>
+          <w:tcPr>
+            <w:tcW w:type="dxa" w:w="3000"/>
+            <w:tcMar>
+              <w:top w:type="dxa" w:w="80"/>
+              <w:left w:type="dxa" w:w="110"/>
+              <w:bottom w:type="dxa" w:w="80"/>
+              <w:right w:type="dxa" w:w="110"/>
+            </w:tcMar>
+          </w:tcPr>
+          <w:p>
+            <w:pPr>
+              <w:spacing w:after="40" w:line="280"/>
+            </w:pPr>
+            <w:r>
+              <w:rPr>
+                <w:rFonts w:ascii="PingFang SC" w:cs="PingFang SC" w:eastAsia="PingFang SC" w:hAnsi="PingFang SC"/>
+                <w:b w:val="false"/>
+                <w:bCs w:val="false"/>
+                <w:color w:val="1F2937"/>
+                <w:sz w:val="19"/>
+                <w:szCs w:val="19"/>
+              </w:rPr>
+              <w:t>OAuth 没有累计额度的概念</w:t>
+            </w:r>
+          </w:p>
+        </w:tc>
+        <w:tc>
+          <w:tcPr>
+            <w:tcW w:type="dxa" w:w="3326"/>
+            <w:tcMar>
+              <w:top w:type="dxa" w:w="80"/>
+              <w:left w:type="dxa" w:w="110"/>
+              <w:bottom w:type="dxa" w:w="80"/>
+              <w:right w:type="dxa" w:w="110"/>
+            </w:tcMar>
+          </w:tcPr>
+          <w:p>
+            <w:pPr>
+              <w:spacing w:after="40" w:line="280"/>
+            </w:pPr>
+            <w:r>
+              <w:rPr>
+                <w:rFonts w:ascii="PingFang SC" w:cs="PingFang SC" w:eastAsia="PingFang SC" w:hAnsi="PingFang SC"/>
+                <w:b w:val="false"/>
+                <w:bCs w:val="false"/>
+                <w:color w:val="1F2937"/>
+                <w:sz w:val="19"/>
+                <w:szCs w:val="19"/>
+              </w:rPr>
+              <w:t>授权树存在数据库里；子额度不是独立钱包，根和所有祖先共享同一笔预算；签发子令牌不算花钱，下单时才在接受事务里原子预留（共享预算）</w:t>
+            </w:r>
+          </w:p>
+        </w:tc>
+      </w:tr>
+      <w:tr>
+        <w:tc>
+          <w:tcPr>
+            <w:tcW w:type="dxa" w:w="2700"/>
+            <w:tcMar>
+              <w:top w:type="dxa" w:w="80"/>
+              <w:left w:type="dxa" w:w="110"/>
+              <w:bottom w:type="dxa" w:w="80"/>
+              <w:right w:type="dxa" w:w="110"/>
+            </w:tcMar>
+          </w:tcPr>
+          <w:p>
+            <w:pPr>
+              <w:spacing w:after="40" w:line="280"/>
+            </w:pPr>
+            <w:r>
+              <w:rPr>
+                <w:rFonts w:ascii="PingFang SC" w:cs="PingFang SC" w:eastAsia="PingFang SC" w:hAnsi="PingFang SC"/>
+                <w:b w:val="false"/>
+                <w:bCs w:val="false"/>
+                <w:color w:val="1F2937"/>
+                <w:sz w:val="19"/>
+                <w:szCs w:val="19"/>
+              </w:rPr>
+              <w:t>撤销</w:t>
+            </w:r>
+          </w:p>
+        </w:tc>
+        <w:tc>
+          <w:tcPr>
+            <w:tcW w:type="dxa" w:w="3000"/>
+            <w:tcMar>
+              <w:top w:type="dxa" w:w="80"/>
+              <w:left w:type="dxa" w:w="110"/>
+              <w:bottom w:type="dxa" w:w="80"/>
+              <w:right w:type="dxa" w:w="110"/>
+            </w:tcMar>
+          </w:tcPr>
+          <w:p>
+            <w:pPr>
+              <w:spacing w:after="40" w:line="280"/>
+            </w:pPr>
+            <w:r>
+              <w:rPr>
+                <w:rFonts w:ascii="PingFang SC" w:cs="PingFang SC" w:eastAsia="PingFang SC" w:hAnsi="PingFang SC"/>
+                <w:b w:val="false"/>
+                <w:bCs w:val="false"/>
+                <w:color w:val="1F2937"/>
+                <w:sz w:val="19"/>
+                <w:szCs w:val="19"/>
+              </w:rPr>
+              <w:t>JWT 自包含，过期前一直验得过；先查状态再执行，中间有空档</w:t>
+            </w:r>
+          </w:p>
+        </w:tc>
+        <w:tc>
+          <w:tcPr>
+            <w:tcW w:type="dxa" w:w="3326"/>
+            <w:tcMar>
+              <w:top w:type="dxa" w:w="80"/>
+              <w:left w:type="dxa" w:w="110"/>
+              <w:bottom w:type="dxa" w:w="80"/>
+              <w:right w:type="dxa" w:w="110"/>
+            </w:tcMar>
+          </w:tcPr>
+          <w:p>
+            <w:pPr>
+              <w:spacing w:after="40" w:line="280"/>
+            </w:pPr>
+            <w:r>
+              <w:rPr>
+                <w:rFonts w:ascii="PingFang SC" w:cs="PingFang SC" w:eastAsia="PingFang SC" w:hAnsi="PingFang SC"/>
+                <w:b w:val="false"/>
+                <w:bCs w:val="false"/>
+                <w:color w:val="1F2937"/>
+                <w:sz w:val="19"/>
+                <w:szCs w:val="19"/>
+              </w:rPr>
+              <w:t>撤销整棵子树；在接受业务的同一个数据库事务里复核根和全部祖先，撤销先提交则新请求一定被拒；令牌最长 300 秒，没有刷新令牌（动态撤销）</w:t>
+            </w:r>
+          </w:p>
+        </w:tc>
+      </w:tr>
+      <w:tr>
+        <w:tc>
+          <w:tcPr>
+            <w:tcW w:type="dxa" w:w="2700"/>
+            <w:tcMar>
+              <w:top w:type="dxa" w:w="80"/>
+              <w:left w:type="dxa" w:w="110"/>
+              <w:bottom w:type="dxa" w:w="80"/>
+              <w:right w:type="dxa" w:w="110"/>
+            </w:tcMar>
+          </w:tcPr>
+          <w:p>
+            <w:pPr>
+              <w:spacing w:after="40" w:line="280"/>
+            </w:pPr>
+            <w:r>
+              <w:rPr>
+                <w:rFonts w:ascii="PingFang SC" w:cs="PingFang SC" w:eastAsia="PingFang SC" w:hAnsi="PingFang SC"/>
+                <w:b w:val="false"/>
+                <w:bCs w:val="false"/>
+                <w:color w:val="1F2937"/>
+                <w:sz w:val="19"/>
+                <w:szCs w:val="19"/>
+              </w:rPr>
+              <w:t>重复授权</w:t>
+            </w:r>
+          </w:p>
+        </w:tc>
+        <w:tc>
+          <w:tcPr>
+            <w:tcW w:type="dxa" w:w="3000"/>
+            <w:tcMar>
+              <w:top w:type="dxa" w:w="80"/>
+              <w:left w:type="dxa" w:w="110"/>
+              <w:bottom w:type="dxa" w:w="80"/>
+              <w:right w:type="dxa" w:w="110"/>
+            </w:tcMar>
+          </w:tcPr>
+          <w:p>
+            <w:pPr>
+              <w:spacing w:after="40" w:line="280"/>
+            </w:pPr>
+            <w:r>
+              <w:rPr>
+                <w:rFonts w:ascii="PingFang SC" w:cs="PingFang SC" w:eastAsia="PingFang SC" w:hAnsi="PingFang SC"/>
+                <w:b w:val="false"/>
+                <w:bCs w:val="false"/>
+                <w:color w:val="1F2937"/>
+                <w:sz w:val="19"/>
+                <w:szCs w:val="19"/>
+              </w:rPr>
+              <w:t>用户多同意几次，额度可能叠加</w:t>
+            </w:r>
+          </w:p>
+        </w:tc>
+        <w:tc>
+          <w:tcPr>
+            <w:tcW w:type="dxa" w:w="3326"/>
+            <w:tcMar>
+              <w:top w:type="dxa" w:w="80"/>
+              <w:left w:type="dxa" w:w="110"/>
+              <w:bottom w:type="dxa" w:w="80"/>
+              <w:right w:type="dxa" w:w="110"/>
+            </w:tcMar>
+          </w:tcPr>
+          <w:p>
+            <w:pPr>
+              <w:spacing w:after="40" w:line="280"/>
+            </w:pPr>
+            <w:r>
+              <w:rPr>
+                <w:rFonts w:ascii="PingFang SC" w:cs="PingFang SC" w:eastAsia="PingFang SC" w:hAnsi="PingFang SC"/>
+                <w:b w:val="false"/>
+                <w:bCs w:val="false"/>
+                <w:color w:val="1F2937"/>
+                <w:sz w:val="19"/>
+                <w:szCs w:val="19"/>
+              </w:rPr>
+              <w:t>一个任务永久只有一个根授权，重新登录也不会多出一份预算</w:t>
+            </w:r>
+          </w:p>
+        </w:tc>
+      </w:tr>
+      <w:tr>
+        <w:tc>
+          <w:tcPr>
+            <w:tcW w:type="dxa" w:w="2700"/>
+            <w:tcMar>
+              <w:top w:type="dxa" w:w="80"/>
+              <w:left w:type="dxa" w:w="110"/>
+              <w:bottom w:type="dxa" w:w="80"/>
+              <w:right w:type="dxa" w:w="110"/>
+            </w:tcMar>
+          </w:tcPr>
+          <w:p>
+            <w:pPr>
+              <w:spacing w:after="40" w:line="280"/>
+            </w:pPr>
+            <w:r>
+              <w:rPr>
+                <w:rFonts w:ascii="PingFang SC" w:cs="PingFang SC" w:eastAsia="PingFang SC" w:hAnsi="PingFang SC"/>
+                <w:b w:val="false"/>
+                <w:bCs w:val="false"/>
+                <w:color w:val="1F2937"/>
+                <w:sz w:val="19"/>
+                <w:szCs w:val="19"/>
+              </w:rPr>
+              <w:t>和密码创新的衔接</w:t>
+            </w:r>
+          </w:p>
+        </w:tc>
+        <w:tc>
+          <w:tcPr>
+            <w:tcW w:type="dxa" w:w="3000"/>
+            <w:tcMar>
+              <w:top w:type="dxa" w:w="80"/>
+              <w:left w:type="dxa" w:w="110"/>
+              <w:bottom w:type="dxa" w:w="80"/>
+              <w:right w:type="dxa" w:w="110"/>
+            </w:tcMar>
+          </w:tcPr>
+          <w:p>
+            <w:pPr>
+              <w:spacing w:after="40" w:line="280"/>
+            </w:pPr>
+            <w:r>
+              <w:rPr>
+                <w:rFonts w:ascii="PingFang SC" w:cs="PingFang SC" w:eastAsia="PingFang SC" w:hAnsi="PingFang SC"/>
+                <w:b w:val="false"/>
+                <w:bCs w:val="false"/>
+                <w:color w:val="1F2937"/>
+                <w:sz w:val="19"/>
+                <w:szCs w:val="19"/>
+              </w:rPr>
+              <w:t>—</w:t>
+            </w:r>
+          </w:p>
+        </w:tc>
+        <w:tc>
+          <w:tcPr>
+            <w:tcW w:type="dxa" w:w="3326"/>
+            <w:tcMar>
+              <w:top w:type="dxa" w:w="80"/>
+              <w:left w:type="dxa" w:w="110"/>
+              <w:bottom w:type="dxa" w:w="80"/>
+              <w:right w:type="dxa" w:w="110"/>
+            </w:tcMar>
+          </w:tcPr>
+          <w:p>
+            <w:pPr>
+              <w:spacing w:after="40" w:line="280"/>
+            </w:pPr>
+            <w:r>
+              <w:rPr>
+                <w:rFonts w:ascii="PingFang SC" w:cs="PingFang SC" w:eastAsia="PingFang SC" w:hAnsi="PingFang SC"/>
+                <w:b w:val="false"/>
+                <w:bCs w:val="false"/>
+                <w:color w:val="1F2937"/>
+                <w:sz w:val="19"/>
+                <w:szCs w:val="19"/>
+              </w:rPr>
+              <w:t>双域共签里，授权域出份额之前核验的就是这棵 OAuth 委托树（AS 签名链、撤销、预算）：OAuth 的授权状态直接变成"能不能签出这一笔"的条件</w:t>
+            </w:r>
+          </w:p>
+        </w:tc>
+      </w:tr>
+    </w:tbl>
+    <w:p>
+      <w:pPr>
+        <w:pStyle w:val="Heading2"/>
+        <w:spacing w:after="120" w:before="240"/>
+      </w:pPr>
+      <w:r>
+        <w:rPr>
+          <w:rFonts w:ascii="PingFang SC" w:cs="PingFang SC" w:eastAsia="PingFang SC" w:hAnsi="PingFang SC"/>
+        </w:rPr>
+        <w:t>9.3 我们没改什么（老师没问也要主动说）</w:t>
+      </w:r>
+    </w:p>
+    <w:p>
+      <w:pPr>
+        <w:pStyle w:val="ListParagraph"/>
+        <w:numPr>
+          <w:ilvl w:val="0"/>
+          <w:numId w:val="2"/>
+        </w:numPr>
+        <w:spacing w:after="80" w:line="300"/>
+      </w:pPr>
+      <w:r>
+        <w:rPr>
+          <w:rFonts w:ascii="PingFang SC" w:cs="PingFang SC" w:eastAsia="PingFang SC" w:hAnsi="PingFang SC"/>
+          <w:color w:val="1F2937"/>
+        </w:rPr>
+        <w:t>OAuth 的流程、端点和标准参数都按 RFC 走；我们新增的字段都以 ag_ 开头，明确是项目扩展。</w:t>
+      </w:r>
+    </w:p>
+    <w:p>
+      <w:pPr>
+        <w:pStyle w:val="ListParagraph"/>
+        <w:numPr>
+          <w:ilvl w:val="0"/>
+          <w:numId w:val="2"/>
+        </w:numPr>
+        <w:spacing w:after="80" w:line="300"/>
+      </w:pPr>
+      <w:r>
+        <w:rPr>
+          <w:rFonts w:ascii="PingFang SC" w:cs="PingFang SC" w:eastAsia="PingFang SC" w:hAnsi="PingFang SC"/>
+          <w:color w:val="1F2937"/>
+        </w:rPr>
+        <w:t>PKCE 的 S256 仍是 SHA-256，没有偷换成 SM3（标准就是这么定义的）；TLS 和口令存储也没有国密化。不说"全栈国密"。</w:t>
+      </w:r>
+    </w:p>
+    <w:p>
+      <w:pPr>
+        <w:pStyle w:val="ListParagraph"/>
+        <w:numPr>
+          <w:ilvl w:val="0"/>
+          <w:numId w:val="2"/>
+        </w:numPr>
+        <w:spacing w:after="80" w:line="300"/>
+      </w:pPr>
+      <w:r>
+        <w:rPr>
+          <w:rFonts w:ascii="PingFang SC" w:cs="PingFang SC" w:eastAsia="PingFang SC" w:hAnsi="PingFang SC"/>
+          <w:color w:val="1F2937"/>
+        </w:rPr>
+        <w:t>AGPoP 参照 DPoP 的思路，但不是 DPoP，不能和标准 DPoP 互通；SM2 的算法标识是我们自己定义的，没有在 IANA 注册。所以不能直接和通用 OAuth / OIDC 客户端互通。</w:t>
+      </w:r>
+    </w:p>
+    <w:p>
+      <w:pPr>
+        <w:pStyle w:val="ListParagraph"/>
+        <w:numPr>
+          <w:ilvl w:val="0"/>
+          <w:numId w:val="2"/>
+        </w:numPr>
+        <w:spacing w:after="80" w:line="300"/>
+      </w:pPr>
+      <w:r>
+        <w:rPr>
+          <w:rFonts w:ascii="PingFang SC" w:cs="PingFang SC" w:eastAsia="PingFang SC" w:hAnsi="PingFang SC"/>
+          <w:color w:val="1F2937"/>
+        </w:rPr>
+        <w:t>撤销接口是项目自己的管理接口，不是 RFC 7009 的标准撤销端点。</w:t>
+      </w:r>
+    </w:p>
+    <w:p>
+      <w:pPr>
+        <w:pStyle w:val="ListParagraph"/>
+        <w:numPr>
+          <w:ilvl w:val="0"/>
+          <w:numId w:val="2"/>
+        </w:numPr>
+        <w:spacing w:after="80" w:line="300"/>
+      </w:pPr>
+      <w:r>
+        <w:rPr>
+          <w:rFonts w:ascii="PingFang SC" w:cs="PingFang SC" w:eastAsia="PingFang SC" w:hAnsi="PingFang SC"/>
+          <w:color w:val="1F2937"/>
+        </w:rPr>
+        <w:t>OAuth 各端点是我们按 RFC 自己实现的，SM2 / SM3 用铜锁（tongsuopy）；没有基于 liboauth2 或 Authlib。</w:t>
+      </w:r>
+    </w:p>
+    <w:p>
+      <w:pPr>
+        <w:pStyle w:val="ListParagraph"/>
+        <w:numPr>
+          <w:ilvl w:val="0"/>
+          <w:numId w:val="2"/>
+        </w:numPr>
+        <w:spacing w:after="80" w:line="300"/>
+      </w:pPr>
+      <w:r>
+        <w:rPr>
+          <w:rFonts w:ascii="PingFang SC" w:cs="PingFang SC" w:eastAsia="PingFang SC" w:hAnsi="PingFang SC"/>
+          <w:color w:val="1F2937"/>
+        </w:rPr>
+        <w:t>后端真实实现了密码登录、同意、一次性授权码和 PKCE 校验，但演示时由脚本用合成账号自动登录，还没有手动登录页面。</w:t>
+      </w:r>
+    </w:p>
+    <w:p>
+      <w:pPr>
+        <w:pStyle w:val="Heading2"/>
+        <w:spacing w:after="120" w:before="240"/>
+      </w:pPr>
+      <w:r>
+        <w:rPr>
+          <w:rFonts w:ascii="PingFang SC" w:cs="PingFang SC" w:eastAsia="PingFang SC" w:hAnsi="PingFang SC"/>
+        </w:rPr>
+        <w:t>9.4 老师可能追问的问题</w:t>
+      </w:r>
+    </w:p>
+    <w:tbl>
+      <w:tblPr>
+        <w:tblW w:type="dxa" w:w="9026"/>
+        <w:tblBorders>
+          <w:top w:val="single" w:color="auto" w:sz="4"/>
+          <w:left w:val="single" w:color="auto" w:sz="4"/>
+          <w:bottom w:val="single" w:color="auto" w:sz="4"/>
+          <w:right w:val="single" w:color="auto" w:sz="4"/>
+          <w:insideH w:val="single" w:color="auto" w:sz="4"/>
+          <w:insideV w:val="single" w:color="auto" w:sz="4"/>
+        </w:tblBorders>
+      </w:tblPr>
+      <w:tblGrid>
+        <w:gridCol w:w="2700"/>
+        <w:gridCol w:w="6326"/>
+      </w:tblGrid>
+      <w:tr>
+        <w:trPr>
+          <w:tblHeader/>
+        </w:trPr>
+        <w:tc>
+          <w:tcPr>
+            <w:tcW w:type="dxa" w:w="2700"/>
+            <w:shd w:fill="E8EDF7" w:color="auto" w:val="clear"/>
+            <w:tcMar>
+              <w:top w:type="dxa" w:w="80"/>
+              <w:left w:type="dxa" w:w="110"/>
+              <w:bottom w:type="dxa" w:w="80"/>
+              <w:right w:type="dxa" w:w="110"/>
+            </w:tcMar>
+          </w:tcPr>
+          <w:p>
+            <w:pPr>
+              <w:spacing w:after="40" w:line="280"/>
+            </w:pPr>
+            <w:r>
+              <w:rPr>
+                <w:rFonts w:ascii="PingFang SC" w:cs="PingFang SC" w:eastAsia="PingFang SC" w:hAnsi="PingFang SC"/>
+                <w:b/>
+                <w:bCs/>
+                <w:color w:val="1F2937"/>
+                <w:sz w:val="19"/>
+                <w:szCs w:val="19"/>
+              </w:rPr>
+              <w:t>老师可能问</w:t>
+            </w:r>
+          </w:p>
+        </w:tc>
+        <w:tc>
+          <w:tcPr>
+            <w:tcW w:type="dxa" w:w="6326"/>
+            <w:shd w:fill="E8EDF7" w:color="auto" w:val="clear"/>
+            <w:tcMar>
+              <w:top w:type="dxa" w:w="80"/>
+              <w:left w:type="dxa" w:w="110"/>
+              <w:bottom w:type="dxa" w:w="80"/>
+              <w:right w:type="dxa" w:w="110"/>
+            </w:tcMar>
+          </w:tcPr>
+          <w:p>
+            <w:pPr>
+              <w:spacing w:after="40" w:line="280"/>
+            </w:pPr>
+            <w:r>
+              <w:rPr>
+                <w:rFonts w:ascii="PingFang SC" w:cs="PingFang SC" w:eastAsia="PingFang SC" w:hAnsi="PingFang SC"/>
+                <w:b/>
+                <w:bCs/>
+                <w:color w:val="1F2937"/>
+                <w:sz w:val="19"/>
+                <w:szCs w:val="19"/>
+              </w:rPr>
+              <w:t>建议回答</w:t>
+            </w:r>
+          </w:p>
+        </w:tc>
+      </w:tr>
+      <w:tr>
+        <w:tc>
+          <w:tcPr>
+            <w:tcW w:type="dxa" w:w="2700"/>
+            <w:tcMar>
+              <w:top w:type="dxa" w:w="80"/>
+              <w:left w:type="dxa" w:w="110"/>
+              <w:bottom w:type="dxa" w:w="80"/>
+              <w:right w:type="dxa" w:w="110"/>
+            </w:tcMar>
+          </w:tcPr>
+          <w:p>
+            <w:pPr>
+              <w:spacing w:after="40" w:line="280"/>
+            </w:pPr>
+            <w:r>
+              <w:rPr>
+                <w:rFonts w:ascii="PingFang SC" w:cs="PingFang SC" w:eastAsia="PingFang SC" w:hAnsi="PingFang SC"/>
+                <w:b w:val="false"/>
+                <w:bCs w:val="false"/>
+                <w:color w:val="1F2937"/>
+                <w:sz w:val="19"/>
+                <w:szCs w:val="19"/>
+              </w:rPr>
+              <w:t>OAuth 本身就有 scope，你们到底改进了什么？</w:t>
+            </w:r>
+          </w:p>
+        </w:tc>
+        <w:tc>
+          <w:tcPr>
+            <w:tcW w:type="dxa" w:w="6326"/>
+            <w:tcMar>
+              <w:top w:type="dxa" w:w="80"/>
+              <w:left w:type="dxa" w:w="110"/>
+              <w:bottom w:type="dxa" w:w="80"/>
+              <w:right w:type="dxa" w:w="110"/>
+            </w:tcMar>
+          </w:tcPr>
+          <w:p>
+            <w:pPr>
+              <w:spacing w:after="40" w:line="280"/>
+            </w:pPr>
+            <w:r>
+              <w:rPr>
+                <w:rFonts w:ascii="PingFang SC" w:cs="PingFang SC" w:eastAsia="PingFang SC" w:hAnsi="PingFang SC"/>
+                <w:b w:val="false"/>
+                <w:bCs w:val="false"/>
+                <w:color w:val="1F2937"/>
+                <w:sz w:val="19"/>
+                <w:szCs w:val="19"/>
+              </w:rPr>
+              <w:t>"scope 只说能用哪些工具。我们补的是 scope 管不到的四件事：子授权必须比父授权小；几条分支共享一笔预算；撤销对已经签出去的令牌立刻生效；令牌被偷了，没有私钥也用不了。而且签名全部用国密。"</w:t>
+            </w:r>
+          </w:p>
+        </w:tc>
+      </w:tr>
+      <w:tr>
+        <w:tc>
+          <w:tcPr>
+            <w:tcW w:type="dxa" w:w="2700"/>
+            <w:tcMar>
+              <w:top w:type="dxa" w:w="80"/>
+              <w:left w:type="dxa" w:w="110"/>
+              <w:bottom w:type="dxa" w:w="80"/>
+              <w:right w:type="dxa" w:w="110"/>
+            </w:tcMar>
+          </w:tcPr>
+          <w:p>
+            <w:pPr>
+              <w:spacing w:after="40" w:line="280"/>
+            </w:pPr>
+            <w:r>
+              <w:rPr>
+                <w:rFonts w:ascii="PingFang SC" w:cs="PingFang SC" w:eastAsia="PingFang SC" w:hAnsi="PingFang SC"/>
+                <w:b w:val="false"/>
+                <w:bCs w:val="false"/>
+                <w:color w:val="1F2937"/>
+                <w:sz w:val="19"/>
+                <w:szCs w:val="19"/>
+              </w:rPr>
+              <w:t>你们改了 OAuth 协议吗？还兼容标准吗？</w:t>
+            </w:r>
+          </w:p>
+        </w:tc>
+        <w:tc>
+          <w:tcPr>
+            <w:tcW w:type="dxa" w:w="6326"/>
+            <w:tcMar>
+              <w:top w:type="dxa" w:w="80"/>
+              <w:left w:type="dxa" w:w="110"/>
+              <w:bottom w:type="dxa" w:w="80"/>
+              <w:right w:type="dxa" w:w="110"/>
+            </w:tcMar>
+          </w:tcPr>
+          <w:p>
+            <w:pPr>
+              <w:spacing w:after="40" w:line="280"/>
+            </w:pPr>
+            <w:r>
+              <w:rPr>
+                <w:rFonts w:ascii="PingFang SC" w:cs="PingFang SC" w:eastAsia="PingFang SC" w:hAnsi="PingFang SC"/>
+                <w:b w:val="false"/>
+                <w:bCs w:val="false"/>
+                <w:color w:val="1F2937"/>
+                <w:sz w:val="19"/>
+                <w:szCs w:val="19"/>
+              </w:rPr>
+              <w:t>"协议没改，流程、端点和参数按 RFC 6749、8693、7636 走。改的是令牌的签名算法和我们加的扩展字段，所以不能直接和通用 OAuth 客户端互通，这一点论文里如实写了。"</w:t>
+            </w:r>
+          </w:p>
+        </w:tc>
+      </w:tr>
+      <w:tr>
+        <w:tc>
+          <w:tcPr>
+            <w:tcW w:type="dxa" w:w="2700"/>
+            <w:tcMar>
+              <w:top w:type="dxa" w:w="80"/>
+              <w:left w:type="dxa" w:w="110"/>
+              <w:bottom w:type="dxa" w:w="80"/>
+              <w:right w:type="dxa" w:w="110"/>
+            </w:tcMar>
+          </w:tcPr>
+          <w:p>
+            <w:pPr>
+              <w:spacing w:after="40" w:line="280"/>
+            </w:pPr>
+            <w:r>
+              <w:rPr>
+                <w:rFonts w:ascii="PingFang SC" w:cs="PingFang SC" w:eastAsia="PingFang SC" w:hAnsi="PingFang SC"/>
+                <w:b w:val="false"/>
+                <w:bCs w:val="false"/>
+                <w:color w:val="1F2937"/>
+                <w:sz w:val="19"/>
+                <w:szCs w:val="19"/>
+              </w:rPr>
+              <w:t>为什么不直接用标准 DPoP？</w:t>
+            </w:r>
+          </w:p>
+        </w:tc>
+        <w:tc>
+          <w:tcPr>
+            <w:tcW w:type="dxa" w:w="6326"/>
+            <w:tcMar>
+              <w:top w:type="dxa" w:w="80"/>
+              <w:left w:type="dxa" w:w="110"/>
+              <w:bottom w:type="dxa" w:w="80"/>
+              <w:right w:type="dxa" w:w="110"/>
+            </w:tcMar>
+          </w:tcPr>
+          <w:p>
+            <w:pPr>
+              <w:spacing w:after="40" w:line="280"/>
+            </w:pPr>
+            <w:r>
+              <w:rPr>
+                <w:rFonts w:ascii="PingFang SC" w:cs="PingFang SC" w:eastAsia="PingFang SC" w:hAnsi="PingFang SC"/>
+                <w:b w:val="false"/>
+                <w:bCs w:val="false"/>
+                <w:color w:val="1F2937"/>
+                <w:sz w:val="19"/>
+                <w:szCs w:val="19"/>
+              </w:rPr>
+              <w:t>"DPoP 默认只绑定 HTTP 方法、地址和令牌哈希，不签请求体，摘要规定用 SHA-256。我们这里被篡改的往往是请求参数，比如数量和收货地址，所以要把完整请求体签进去；又要用 SM3，就不能再叫 DPoP，所以单独定义了 AGPoP。"</w:t>
+            </w:r>
+          </w:p>
+        </w:tc>
+      </w:tr>
+      <w:tr>
+        <w:tc>
+          <w:tcPr>
+            <w:tcW w:type="dxa" w:w="2700"/>
+            <w:tcMar>
+              <w:top w:type="dxa" w:w="80"/>
+              <w:left w:type="dxa" w:w="110"/>
+              <w:bottom w:type="dxa" w:w="80"/>
+              <w:right w:type="dxa" w:w="110"/>
+            </w:tcMar>
+          </w:tcPr>
+          <w:p>
+            <w:pPr>
+              <w:spacing w:after="40" w:line="280"/>
+            </w:pPr>
+            <w:r>
+              <w:rPr>
+                <w:rFonts w:ascii="PingFang SC" w:cs="PingFang SC" w:eastAsia="PingFang SC" w:hAnsi="PingFang SC"/>
+                <w:b w:val="false"/>
+                <w:bCs w:val="false"/>
+                <w:color w:val="1F2937"/>
+                <w:sz w:val="19"/>
+                <w:szCs w:val="19"/>
+              </w:rPr>
+              <w:t>JWT 签出去以后怎么撤销？</w:t>
+            </w:r>
+          </w:p>
+        </w:tc>
+        <w:tc>
+          <w:tcPr>
+            <w:tcW w:type="dxa" w:w="6326"/>
+            <w:tcMar>
+              <w:top w:type="dxa" w:w="80"/>
+              <w:left w:type="dxa" w:w="110"/>
+              <w:bottom w:type="dxa" w:w="80"/>
+              <w:right w:type="dxa" w:w="110"/>
+            </w:tcMar>
+          </w:tcPr>
+          <w:p>
+            <w:pPr>
+              <w:spacing w:after="40" w:line="280"/>
+            </w:pPr>
+            <w:r>
+              <w:rPr>
+                <w:rFonts w:ascii="PingFang SC" w:cs="PingFang SC" w:eastAsia="PingFang SC" w:hAnsi="PingFang SC"/>
+                <w:b w:val="false"/>
+                <w:bCs w:val="false"/>
+                <w:color w:val="1F2937"/>
+                <w:sz w:val="19"/>
+                <w:szCs w:val="19"/>
+              </w:rPr>
+              <w:t>"两层：令牌最长 300 秒、没有刷新令牌；更关键的是网关在接受业务的同一个数据库事务里查根和所有祖先的撤销状态，签名有效也越不过撤销。签名之后才撤销、同时网关又被攻破的情况，是下一步授权状态承诺要解决的。"</w:t>
+            </w:r>
+          </w:p>
+        </w:tc>
+      </w:tr>
+      <w:tr>
+        <w:tc>
+          <w:tcPr>
+            <w:tcW w:type="dxa" w:w="2700"/>
+            <w:tcMar>
+              <w:top w:type="dxa" w:w="80"/>
+              <w:left w:type="dxa" w:w="110"/>
+              <w:bottom w:type="dxa" w:w="80"/>
+              <w:right w:type="dxa" w:w="110"/>
+            </w:tcMar>
+          </w:tcPr>
+          <w:p>
+            <w:pPr>
+              <w:spacing w:after="40" w:line="280"/>
+            </w:pPr>
+            <w:r>
+              <w:rPr>
+                <w:rFonts w:ascii="PingFang SC" w:cs="PingFang SC" w:eastAsia="PingFang SC" w:hAnsi="PingFang SC"/>
+                <w:b w:val="false"/>
+                <w:bCs w:val="false"/>
+                <w:color w:val="1F2937"/>
+                <w:sz w:val="19"/>
+                <w:szCs w:val="19"/>
+              </w:rPr>
+              <w:t>为什么要授权服务器统一签发，不让上级代理直接给下级发令牌？</w:t>
+            </w:r>
+          </w:p>
+        </w:tc>
+        <w:tc>
+          <w:tcPr>
+            <w:tcW w:type="dxa" w:w="6326"/>
+            <w:tcMar>
+              <w:top w:type="dxa" w:w="80"/>
+              <w:left w:type="dxa" w:w="110"/>
+              <w:bottom w:type="dxa" w:w="80"/>
+              <w:right w:type="dxa" w:w="110"/>
+            </w:tcMar>
+          </w:tcPr>
+          <w:p>
+            <w:pPr>
+              <w:spacing w:after="40" w:line="280"/>
+            </w:pPr>
+            <w:r>
+              <w:rPr>
+                <w:rFonts w:ascii="PingFang SC" w:cs="PingFang SC" w:eastAsia="PingFang SC" w:hAnsi="PingFang SC"/>
+                <w:b w:val="false"/>
+                <w:bCs w:val="false"/>
+                <w:color w:val="1F2937"/>
+                <w:sz w:val="19"/>
+                <w:szCs w:val="19"/>
+              </w:rPr>
+              <w:t>"我们最早的草案就是上级自己签，后来改掉了：上级自己签的话，收窄、撤销和共享预算没有一个地方能统一检查。现在上级只能签委托申请，授权服务器检查通过才签子令牌。代价是授权服务器要在线，它的签名密钥在我们的威胁模型里被假定为可信，论文假设 2 写明了这一点。"</w:t>
+            </w:r>
+          </w:p>
+        </w:tc>
+      </w:tr>
+      <w:tr>
+        <w:tc>
+          <w:tcPr>
+            <w:tcW w:type="dxa" w:w="2700"/>
+            <w:tcMar>
+              <w:top w:type="dxa" w:w="80"/>
+              <w:left w:type="dxa" w:w="110"/>
+              <w:bottom w:type="dxa" w:w="80"/>
+              <w:right w:type="dxa" w:w="110"/>
+            </w:tcMar>
+          </w:tcPr>
+          <w:p>
+            <w:pPr>
+              <w:spacing w:after="40" w:line="280"/>
+            </w:pPr>
+            <w:r>
+              <w:rPr>
+                <w:rFonts w:ascii="PingFang SC" w:cs="PingFang SC" w:eastAsia="PingFang SC" w:hAnsi="PingFang SC"/>
+                <w:b w:val="false"/>
+                <w:bCs w:val="false"/>
+                <w:color w:val="1F2937"/>
+                <w:sz w:val="19"/>
+                <w:szCs w:val="19"/>
+              </w:rPr>
+              <w:t>ID Token 和 Access Token 有什么区别？</w:t>
+            </w:r>
+          </w:p>
+        </w:tc>
+        <w:tc>
+          <w:tcPr>
+            <w:tcW w:type="dxa" w:w="6326"/>
+            <w:tcMar>
+              <w:top w:type="dxa" w:w="80"/>
+              <w:left w:type="dxa" w:w="110"/>
+              <w:bottom w:type="dxa" w:w="80"/>
+              <w:right w:type="dxa" w:w="110"/>
+            </w:tcMar>
+          </w:tcPr>
+          <w:p>
+            <w:pPr>
+              <w:spacing w:after="40" w:line="280"/>
+            </w:pPr>
+            <w:r>
+              <w:rPr>
+                <w:rFonts w:ascii="PingFang SC" w:cs="PingFang SC" w:eastAsia="PingFang SC" w:hAnsi="PingFang SC"/>
+                <w:b w:val="false"/>
+                <w:bCs w:val="false"/>
+                <w:color w:val="1F2937"/>
+                <w:sz w:val="19"/>
+                <w:szCs w:val="19"/>
+              </w:rPr>
+              <w:t>"ID Token 只证明用户刚完成了登录，只交给登录入口验证；Access Token 才是干活的权限凭证。我们不让 ID Token 进入任何工具调用。"</w:t>
+            </w:r>
+          </w:p>
+        </w:tc>
+      </w:tr>
+      <w:tr>
+        <w:tc>
+          <w:tcPr>
+            <w:tcW w:type="dxa" w:w="2700"/>
+            <w:tcMar>
+              <w:top w:type="dxa" w:w="80"/>
+              <w:left w:type="dxa" w:w="110"/>
+              <w:bottom w:type="dxa" w:w="80"/>
+              <w:right w:type="dxa" w:w="110"/>
+            </w:tcMar>
+          </w:tcPr>
+          <w:p>
+            <w:pPr>
+              <w:spacing w:after="40" w:line="280"/>
+            </w:pPr>
+            <w:r>
+              <w:rPr>
+                <w:rFonts w:ascii="PingFang SC" w:cs="PingFang SC" w:eastAsia="PingFang SC" w:hAnsi="PingFang SC"/>
+                <w:b w:val="false"/>
+                <w:bCs w:val="false"/>
+                <w:color w:val="1F2937"/>
+                <w:sz w:val="19"/>
+                <w:szCs w:val="19"/>
+              </w:rPr>
+              <w:t>令牌和私钥一起被偷了怎么办？</w:t>
+            </w:r>
+          </w:p>
+        </w:tc>
+        <w:tc>
+          <w:tcPr>
+            <w:tcW w:type="dxa" w:w="6326"/>
+            <w:tcMar>
+              <w:top w:type="dxa" w:w="80"/>
+              <w:left w:type="dxa" w:w="110"/>
+              <w:bottom w:type="dxa" w:w="80"/>
+              <w:right w:type="dxa" w:w="110"/>
+            </w:tcMar>
+          </w:tcPr>
+          <w:p>
+            <w:pPr>
+              <w:spacing w:after="40" w:line="280"/>
+            </w:pPr>
+            <w:r>
+              <w:rPr>
+                <w:rFonts w:ascii="PingFang SC" w:cs="PingFang SC" w:eastAsia="PingFang SC" w:hAnsi="PingFang SC"/>
+                <w:b w:val="false"/>
+                <w:bCs w:val="false"/>
+                <w:color w:val="1F2937"/>
+                <w:sz w:val="19"/>
+                <w:szCs w:val="19"/>
+              </w:rPr>
+              <w:t>"那攻击者就等于这个代理本人，持有者证明挡不住，这一点我们不回避。但他也只能在这个代理被授权的范围内做事：额度、工具、资源都被收窄过，而且可以随时撤销整棵子树。"</w:t>
+            </w:r>
+          </w:p>
+        </w:tc>
+      </w:tr>
+      <w:tr>
+        <w:tc>
+          <w:tcPr>
+            <w:tcW w:type="dxa" w:w="2700"/>
+            <w:tcMar>
+              <w:top w:type="dxa" w:w="80"/>
+              <w:left w:type="dxa" w:w="110"/>
+              <w:bottom w:type="dxa" w:w="80"/>
+              <w:right w:type="dxa" w:w="110"/>
+            </w:tcMar>
+          </w:tcPr>
+          <w:p>
+            <w:pPr>
+              <w:spacing w:after="40" w:line="280"/>
+            </w:pPr>
+            <w:r>
+              <w:rPr>
+                <w:rFonts w:ascii="PingFang SC" w:cs="PingFang SC" w:eastAsia="PingFang SC" w:hAnsi="PingFang SC"/>
+                <w:b w:val="false"/>
+                <w:bCs w:val="false"/>
+                <w:color w:val="1F2937"/>
+                <w:sz w:val="19"/>
+                <w:szCs w:val="19"/>
+              </w:rPr>
+              <w:t>你们用 liboauth2 了吗？</w:t>
+            </w:r>
+          </w:p>
+        </w:tc>
+        <w:tc>
+          <w:tcPr>
+            <w:tcW w:type="dxa" w:w="6326"/>
+            <w:tcMar>
+              <w:top w:type="dxa" w:w="80"/>
+              <w:left w:type="dxa" w:w="110"/>
+              <w:bottom w:type="dxa" w:w="80"/>
+              <w:right w:type="dxa" w:w="110"/>
+            </w:tcMar>
+          </w:tcPr>
+          <w:p>
+            <w:pPr>
+              <w:spacing w:after="40" w:line="280"/>
+            </w:pPr>
+            <w:r>
+              <w:rPr>
+                <w:rFonts w:ascii="PingFang SC" w:cs="PingFang SC" w:eastAsia="PingFang SC" w:hAnsi="PingFang SC"/>
+                <w:b w:val="false"/>
+                <w:bCs w:val="false"/>
+                <w:color w:val="1F2937"/>
+                <w:sz w:val="19"/>
+                <w:szCs w:val="19"/>
+              </w:rPr>
+              <w:t>"我们研究了它的机制，读了源码：它的 JOSE 层依赖 cjose，没找到可以直接启用的 SM2 路径，所以没有在它上面改，而是按 RFC 自己实现，用铜锁做国密。这个判断来自读源码，没有做编译验证。"</w:t>
+            </w:r>
+          </w:p>
+        </w:tc>
+      </w:tr>
+      <w:tr>
+        <w:tc>
+          <w:tcPr>
+            <w:tcW w:type="dxa" w:w="2700"/>
+            <w:tcMar>
+              <w:top w:type="dxa" w:w="80"/>
+              <w:left w:type="dxa" w:w="110"/>
+              <w:bottom w:type="dxa" w:w="80"/>
+              <w:right w:type="dxa" w:w="110"/>
+            </w:tcMar>
+          </w:tcPr>
+          <w:p>
+            <w:pPr>
+              <w:spacing w:after="40" w:line="280"/>
+            </w:pPr>
+            <w:r>
+              <w:rPr>
+                <w:rFonts w:ascii="PingFang SC" w:cs="PingFang SC" w:eastAsia="PingFang SC" w:hAnsi="PingFang SC"/>
+                <w:b w:val="false"/>
+                <w:bCs w:val="false"/>
+                <w:color w:val="1F2937"/>
+                <w:sz w:val="19"/>
+                <w:szCs w:val="19"/>
+              </w:rPr>
+              <w:t>大模型能拿到令牌吗？</w:t>
+            </w:r>
+          </w:p>
+        </w:tc>
+        <w:tc>
+          <w:tcPr>
+            <w:tcW w:type="dxa" w:w="6326"/>
+            <w:tcMar>
+              <w:top w:type="dxa" w:w="80"/>
+              <w:left w:type="dxa" w:w="110"/>
+              <w:bottom w:type="dxa" w:w="80"/>
+              <w:right w:type="dxa" w:w="110"/>
+            </w:tcMar>
+          </w:tcPr>
+          <w:p>
+            <w:pPr>
+              <w:spacing w:after="40" w:line="280"/>
+            </w:pPr>
+            <w:r>
+              <w:rPr>
+                <w:rFonts w:ascii="PingFang SC" w:cs="PingFang SC" w:eastAsia="PingFang SC" w:hAnsi="PingFang SC"/>
+                <w:b w:val="false"/>
+                <w:bCs w:val="false"/>
+                <w:color w:val="1F2937"/>
+                <w:sz w:val="19"/>
+                <w:szCs w:val="19"/>
+              </w:rPr>
+              <w:t>"拿不到。令牌和私钥只在各代理的持证进程里；将来接入大模型，模型也只能输出想调用哪个工具、什么参数。"</w:t>
+            </w:r>
+          </w:p>
+        </w:tc>
+      </w:tr>
+      <w:tr>
+        <w:tc>
+          <w:tcPr>
+            <w:tcW w:type="dxa" w:w="2700"/>
+            <w:tcMar>
+              <w:top w:type="dxa" w:w="80"/>
+              <w:left w:type="dxa" w:w="110"/>
+              <w:bottom w:type="dxa" w:w="80"/>
+              <w:right w:type="dxa" w:w="110"/>
+            </w:tcMar>
+          </w:tcPr>
+          <w:p>
+            <w:pPr>
+              <w:spacing w:after="40" w:line="280"/>
+            </w:pPr>
+            <w:r>
+              <w:rPr>
+                <w:rFonts w:ascii="PingFang SC" w:cs="PingFang SC" w:eastAsia="PingFang SC" w:hAnsi="PingFang SC"/>
+                <w:b w:val="false"/>
+                <w:bCs w:val="false"/>
+                <w:color w:val="1F2937"/>
+                <w:sz w:val="19"/>
+                <w:szCs w:val="19"/>
+              </w:rPr>
+              <w:t>OAuth 这部分算你们的创新吗？</w:t>
+            </w:r>
+          </w:p>
+        </w:tc>
+        <w:tc>
+          <w:tcPr>
+            <w:tcW w:type="dxa" w:w="6326"/>
+            <w:tcMar>
+              <w:top w:type="dxa" w:w="80"/>
+              <w:left w:type="dxa" w:w="110"/>
+              <w:bottom w:type="dxa" w:w="80"/>
+              <w:right w:type="dxa" w:w="110"/>
+            </w:tcMar>
+          </w:tcPr>
+          <w:p>
+            <w:pPr>
+              <w:spacing w:after="40" w:line="280"/>
+            </w:pPr>
+            <w:r>
+              <w:rPr>
+                <w:rFonts w:ascii="PingFang SC" w:cs="PingFang SC" w:eastAsia="PingFang SC" w:hAnsi="PingFang SC"/>
+                <w:b w:val="false"/>
+                <w:bCs w:val="false"/>
+                <w:color w:val="1F2937"/>
+                <w:sz w:val="19"/>
+                <w:szCs w:val="19"/>
+              </w:rPr>
+              <w:t>"不算主要创新。OAuth、令牌交换、发送者约束都是已有标准，我们不声称首创。我们在这一层做的是补齐和组合：把委托收窄、共享预算、子树撤销放进同一条执行路径，并全部国密化。真正的密码学创新是双域共签，它把这里的授权状态变成了签名条件。"</w:t>
+            </w:r>
+          </w:p>
+        </w:tc>
+      </w:tr>
+    </w:tbl>
+    <w:p>
+      <w:pPr>
+        <w:pBdr>
+          <w:left w:val="single" w:color="1D4ED8" w:sz="18" w:space="8"/>
+        </w:pBdr>
+        <w:shd w:fill="EFF4FF" w:color="auto" w:val="clear"/>
+        <w:spacing w:after="160" w:before="80" w:line="300"/>
+        <w:ind w:left="200"/>
+      </w:pPr>
+      <w:r>
+        <w:rPr>
+          <w:rFonts w:ascii="PingFang SC" w:cs="PingFang SC" w:eastAsia="PingFang SC" w:hAnsi="PingFang SC"/>
+          <w:b/>
+          <w:bCs/>
+          <w:color w:val="1F2937"/>
+        </w:rPr>
+        <w:t>不要这样说</w:t>
+      </w:r>
+      <w:r>
+        <w:rPr>
+          <w:rFonts w:ascii="PingFang SC" w:cs="PingFang SC" w:eastAsia="PingFang SC" w:hAnsi="PingFang SC"/>
+          <w:color w:val="1F2937"/>
+        </w:rPr>
+        <w:t>："我们改进了 OAuth 协议""兼容标准 DPoP / OIDC""全系统都是国密""一撤销，已经签出去的批准马上全部失效""OAuth 部分是我们的创新点"。这些都和实际情况不符。</w:t>
       </w:r>
     </w:p>
     <w:sectPr>

</xml_diff>

<commit_message>
Prepare CoSeal full server deployment and update presentation materials
</commit_message>
<xml_diff>
--- a/复赛冲刺材料-20261018/03-阶段汇报说明-20261018.docx
+++ b/复赛冲刺材料-20261018/03-阶段汇报说明-20261018.docx
@@ -15,7 +15,7 @@
           <w:sz w:val="44"/>
           <w:szCs w:val="44"/>
         </w:rPr>
-        <w:t xml:space="preserve">Agent Guard 阶段汇报说明</w:t>
+        <w:t>CoSeal（共印） 阶段汇报说明</w:t>
       </w:r>
     </w:p>
     <w:p>
@@ -29,7 +29,7 @@
           <w:sz w:val="22"/>
           <w:szCs w:val="22"/>
         </w:rPr>
-        <w:t xml:space="preserve">给汇报人（A）看的讲稿与操作手册 · 2026 年 10 月 18 日</w:t>
+        <w:t>给汇报人（A）看的讲稿与操作手册 · 2026 年 10 月 18 日</w:t>
       </w:r>
     </w:p>
     <w:p>
@@ -48,7 +48,7 @@
           <w:bCs/>
           <w:color w:val="1F2937"/>
         </w:rPr>
-        <w:t xml:space="preserve">这份说明怎么用</w:t>
+        <w:t>这份说明怎么用</w:t>
       </w:r>
       <w:r>
         <w:rPr>
@@ -67,7 +67,7 @@
         <w:rPr>
           <w:rFonts w:ascii="PingFang SC" w:cs="PingFang SC" w:eastAsia="PingFang SC" w:hAnsi="PingFang SC"/>
         </w:rPr>
-        <w:t xml:space="preserve">1. 先用一句话记住这个项目</w:t>
+        <w:t>1. 先用一句话记住这个项目</w:t>
       </w:r>
     </w:p>
     <w:p>
@@ -81,7 +81,7 @@
           <w:bCs/>
           <w:color w:val="1F2937"/>
         </w:rPr>
-        <w:t xml:space="preserve">一群 AI 代理替用户去采购时，我们保证它们只能做用户允许的事，越界的请求会在明确的位置被拦下，而且事后能查得清清楚楚。</w:t>
+        <w:t>代理被提示注入骗了，也花不出授权以外的一分钱；就算网关被攻破，也伪造不出下单签名。产出的是标准 SM2 签名，下游用任何国密库都能验。适用条件：半诚实、n=2、同主机 Python 非常数时间原型，可信 AS 与下游验签；签名后撤销仍有窗口，真实大模型实验尚未完成。</w:t>
       </w:r>
     </w:p>
     <w:p>
@@ -93,7 +93,7 @@
           <w:rFonts w:ascii="PingFang SC" w:cs="PingFang SC" w:eastAsia="PingFang SC" w:hAnsi="PingFang SC"/>
           <w:color w:val="1F2937"/>
         </w:rPr>
-        <w:t xml:space="preserve">可以把它想象成一家公司的报销流程：</w:t>
+        <w:t>可以把它想象成一家公司的报销流程：</w:t>
       </w:r>
     </w:p>
     <w:p>
@@ -112,14 +112,14 @@
           <w:bCs/>
           <w:color w:val="1F2937"/>
         </w:rPr>
-        <w:t xml:space="preserve">用户</w:t>
-      </w:r>
-      <w:r>
-        <w:rPr>
-          <w:rFonts w:ascii="PingFang SC" w:cs="PingFang SC" w:eastAsia="PingFang SC" w:hAnsi="PingFang SC"/>
-          <w:color w:val="1F2937"/>
-        </w:rPr>
-        <w:t xml:space="preserve">是老板，批准了"本周内、1000 元以内、指定供应商"的采购任务。</w:t>
+        <w:t>用户</w:t>
+      </w:r>
+      <w:r>
+        <w:rPr>
+          <w:rFonts w:ascii="PingFang SC" w:cs="PingFang SC" w:eastAsia="PingFang SC" w:hAnsi="PingFang SC"/>
+          <w:color w:val="1F2937"/>
+        </w:rPr>
+        <w:t>是老板，批准了"本周内、1000 元以内、指定供应商"的采购任务。</w:t>
       </w:r>
     </w:p>
     <w:p>
@@ -138,14 +138,14 @@
           <w:bCs/>
           <w:color w:val="1F2937"/>
         </w:rPr>
-        <w:t xml:space="preserve">三个代理</w:t>
-      </w:r>
-      <w:r>
-        <w:rPr>
-          <w:rFonts w:ascii="PingFang SC" w:cs="PingFang SC" w:eastAsia="PingFang SC" w:hAnsi="PingFang SC"/>
-          <w:color w:val="1F2937"/>
-        </w:rPr>
-        <w:t xml:space="preserve">是三个员工，接力完成：统筹的拆任务，选品的比价，执行的去下单。</w:t>
+        <w:t>三个代理</w:t>
+      </w:r>
+      <w:r>
+        <w:rPr>
+          <w:rFonts w:ascii="PingFang SC" w:cs="PingFang SC" w:eastAsia="PingFang SC" w:hAnsi="PingFang SC"/>
+          <w:color w:val="1F2937"/>
+        </w:rPr>
+        <w:t>是三个员工，接力完成：统筹代理拆任务，选品代理比价，下单代理下单。</w:t>
       </w:r>
     </w:p>
     <w:p>
@@ -164,14 +164,14 @@
           <w:bCs/>
           <w:color w:val="1F2937"/>
         </w:rPr>
-        <w:t xml:space="preserve">授权服务器（AS）</w:t>
-      </w:r>
-      <w:r>
-        <w:rPr>
-          <w:rFonts w:ascii="PingFang SC" w:cs="PingFang SC" w:eastAsia="PingFang SC" w:hAnsi="PingFang SC"/>
-          <w:color w:val="1F2937"/>
-        </w:rPr>
-        <w:t xml:space="preserve">是人事部，负责给每个员工发"门禁卡"（令牌），卡上写清楚能干什么、能花多少钱。</w:t>
+        <w:t>授权服务器（AS）</w:t>
+      </w:r>
+      <w:r>
+        <w:rPr>
+          <w:rFonts w:ascii="PingFang SC" w:cs="PingFang SC" w:eastAsia="PingFang SC" w:hAnsi="PingFang SC"/>
+          <w:color w:val="1F2937"/>
+        </w:rPr>
+        <w:t>是人事部，负责给每个员工发"门禁卡"（令牌），卡上写清楚能干什么、能花多少钱。</w:t>
       </w:r>
     </w:p>
     <w:p>
@@ -190,14 +190,14 @@
           <w:bCs/>
           <w:color w:val="1F2937"/>
         </w:rPr>
-        <w:t xml:space="preserve">执行网关</w:t>
-      </w:r>
-      <w:r>
-        <w:rPr>
-          <w:rFonts w:ascii="PingFang SC" w:cs="PingFang SC" w:eastAsia="PingFang SC" w:hAnsi="PingFang SC"/>
-          <w:color w:val="1F2937"/>
-        </w:rPr>
-        <w:t xml:space="preserve">是财务部门口的保安，每一笔下单都要过他这一关：查卡、查本人、查卡有没有被挂失、查钱还够不够。</w:t>
+        <w:t>工具调用网关</w:t>
+      </w:r>
+      <w:r>
+        <w:rPr>
+          <w:rFonts w:ascii="PingFang SC" w:cs="PingFang SC" w:eastAsia="PingFang SC" w:hAnsi="PingFang SC"/>
+          <w:color w:val="1F2937"/>
+        </w:rPr>
+        <w:t>是财务部门口的保安，每一笔下单都要过他这一关：查卡、查本人、查卡有没有被挂失、查钱还够不够。</w:t>
       </w:r>
     </w:p>
     <w:p>
@@ -216,14 +216,14 @@
           <w:bCs/>
           <w:color w:val="1F2937"/>
         </w:rPr>
-        <w:t xml:space="preserve">授权与预算库</w:t>
-      </w:r>
-      <w:r>
-        <w:rPr>
-          <w:rFonts w:ascii="PingFang SC" w:cs="PingFang SC" w:eastAsia="PingFang SC" w:hAnsi="PingFang SC"/>
-          <w:color w:val="1F2937"/>
-        </w:rPr>
-        <w:t xml:space="preserve">是财务账本，记着每张卡还剩多少额度、有没有被挂失。</w:t>
+        <w:t>授权与预算库</w:t>
+      </w:r>
+      <w:r>
+        <w:rPr>
+          <w:rFonts w:ascii="PingFang SC" w:cs="PingFang SC" w:eastAsia="PingFang SC" w:hAnsi="PingFang SC"/>
+          <w:color w:val="1F2937"/>
+        </w:rPr>
+        <w:t>是财务账本，记着每张卡还剩多少额度、有没有被挂失。</w:t>
       </w:r>
     </w:p>
     <w:p>
@@ -235,7 +235,7 @@
           <w:rFonts w:ascii="PingFang SC" w:cs="PingFang SC" w:eastAsia="PingFang SC" w:hAnsi="PingFang SC"/>
           <w:color w:val="1F2937"/>
         </w:rPr>
-        <w:t xml:space="preserve">我们的重点不是让 AI 更聪明，而是：</w:t>
+        <w:t>我们的重点不是让 AI 更聪明，而是：</w:t>
       </w:r>
       <w:r>
         <w:rPr>
@@ -244,7 +244,7 @@
           <w:bCs/>
           <w:color w:val="1F2937"/>
         </w:rPr>
-        <w:t xml:space="preserve">就算 AI 被骗了、令牌被偷了，坏事也做不成。</w:t>
+        <w:t>就算 AI 被骗了、令牌被偷了，坏事也做不成。</w:t>
       </w:r>
     </w:p>
     <w:p>
@@ -256,7 +256,7 @@
         <w:rPr>
           <w:rFonts w:ascii="PingFang SC" w:cs="PingFang SC" w:eastAsia="PingFang SC" w:hAnsi="PingFang SC"/>
         </w:rPr>
-        <w:t xml:space="preserve">2. 汇报顺序与时间分配（约 10 分钟）</w:t>
+        <w:t>2. 汇报顺序与时间分配（约 10 分钟）</w:t>
       </w:r>
     </w:p>
     <w:p>
@@ -268,7 +268,7 @@
           <w:rFonts w:ascii="PingFang SC" w:cs="PingFang SC" w:eastAsia="PingFang SC" w:hAnsi="PingFang SC"/>
           <w:color w:val="1F2937"/>
         </w:rPr>
-        <w:t xml:space="preserve">18 日计划里原本安排三人分工讲（C 讲问题与贡献，A 演示，B 讲门限）。如果只由你一个人讲，就按下表顺序全讲；如果三人一起讲，"谁讲"一栏就是建议的分工。</w:t>
+        <w:t>18 日计划里原本安排三人分工讲（C 讲问题与贡献，A 演示，B 讲门限）。如果只由你一个人讲，就按下表顺序全讲；如果三人一起讲，"谁讲"一栏就是建议的分工。</w:t>
       </w:r>
     </w:p>
     <w:tbl>
@@ -317,7 +317,7 @@
                 <w:sz w:val="19"/>
                 <w:szCs w:val="19"/>
               </w:rPr>
-              <w:t xml:space="preserve">时间</w:t>
+              <w:t>时间</w:t>
             </w:r>
           </w:p>
         </w:tc>
@@ -345,7 +345,7 @@
                 <w:sz w:val="19"/>
                 <w:szCs w:val="19"/>
               </w:rPr>
-              <w:t xml:space="preserve">讲什么</w:t>
+              <w:t>讲什么</w:t>
             </w:r>
           </w:p>
         </w:tc>
@@ -373,7 +373,7 @@
                 <w:sz w:val="19"/>
                 <w:szCs w:val="19"/>
               </w:rPr>
-              <w:t xml:space="preserve">打开哪个页面</w:t>
+              <w:t>打开哪个页面</w:t>
             </w:r>
           </w:p>
         </w:tc>
@@ -401,7 +401,7 @@
                 <w:sz w:val="19"/>
                 <w:szCs w:val="19"/>
               </w:rPr>
-              <w:t xml:space="preserve">谁讲</w:t>
+              <w:t>谁讲</w:t>
             </w:r>
           </w:p>
         </w:tc>
@@ -430,7 +430,7 @@
                 <w:sz w:val="19"/>
                 <w:szCs w:val="19"/>
               </w:rPr>
-              <w:t xml:space="preserve">0:00–1:00</w:t>
+              <w:t>0:00–1:00</w:t>
             </w:r>
           </w:p>
         </w:tc>
@@ -457,7 +457,7 @@
                 <w:sz w:val="19"/>
                 <w:szCs w:val="19"/>
               </w:rPr>
-              <w:t xml:space="preserve">用一个采购故事引出风险：令牌被偷、代理想多要权限、用户中途反悔，以及"把关的人被攻破"</w:t>
+              <w:t>用一个采购故事引出风险：令牌被偷、代理想多要权限、用户中途反悔，以及"把关的人被攻破"</w:t>
             </w:r>
           </w:p>
         </w:tc>
@@ -511,7 +511,7 @@
                 <w:sz w:val="19"/>
                 <w:szCs w:val="19"/>
               </w:rPr>
-              <w:t xml:space="preserve">C</w:t>
+              <w:t>C</w:t>
             </w:r>
           </w:p>
         </w:tc>
@@ -540,7 +540,7 @@
                 <w:sz w:val="19"/>
                 <w:szCs w:val="19"/>
               </w:rPr>
-              <w:t xml:space="preserve">1:00–2:00</w:t>
+              <w:t>1:00–2:00</w:t>
             </w:r>
           </w:p>
         </w:tc>
@@ -567,7 +567,7 @@
                 <w:sz w:val="19"/>
                 <w:szCs w:val="19"/>
               </w:rPr>
-              <w:t xml:space="preserve">系统里有哪些角色，各管什么</w:t>
+              <w:t>系统里有哪些角色，各管什么</w:t>
             </w:r>
           </w:p>
         </w:tc>
@@ -621,7 +621,7 @@
                 <w:sz w:val="19"/>
                 <w:szCs w:val="19"/>
               </w:rPr>
-              <w:t xml:space="preserve">A</w:t>
+              <w:t>A</w:t>
             </w:r>
           </w:p>
         </w:tc>
@@ -650,7 +650,7 @@
                 <w:sz w:val="19"/>
                 <w:szCs w:val="19"/>
               </w:rPr>
-              <w:t xml:space="preserve">2:00–4:30</w:t>
+              <w:t>2:00–4:30</w:t>
             </w:r>
           </w:p>
         </w:tc>
@@ -677,7 +677,7 @@
                 <w:sz w:val="19"/>
                 <w:szCs w:val="19"/>
               </w:rPr>
-              <w:t xml:space="preserve">三道基础防线：盗令牌、扩权、撤销（每个约 50 秒）</w:t>
+              <w:t>主要检查：盗令牌、扩权、撤销（每个约 50 秒）</w:t>
             </w:r>
           </w:p>
         </w:tc>
@@ -704,7 +704,7 @@
                 <w:sz w:val="19"/>
                 <w:szCs w:val="19"/>
               </w:rPr>
-              <w:t>基础防线：持有者绑定、委托收窄、动态撤销</w:t>
+              <w:t>权限检查：防令牌盗用、委托降权、撤销生效</w:t>
             </w:r>
           </w:p>
         </w:tc>
@@ -731,7 +731,7 @@
                 <w:sz w:val="19"/>
                 <w:szCs w:val="19"/>
               </w:rPr>
-              <w:t xml:space="preserve">A</w:t>
+              <w:t>A</w:t>
             </w:r>
           </w:p>
         </w:tc>
@@ -760,7 +760,7 @@
                 <w:sz w:val="19"/>
                 <w:szCs w:val="19"/>
               </w:rPr>
-              <w:t xml:space="preserve">4:30–5:00</w:t>
+              <w:t>4:30–5:00</w:t>
             </w:r>
           </w:p>
         </w:tc>
@@ -787,7 +787,7 @@
                 <w:sz w:val="19"/>
                 <w:szCs w:val="19"/>
               </w:rPr>
-              <w:t>更多保障的四个场景一句话带过</w:t>
+              <w:t>其他检查的四个场景一句话带过</w:t>
             </w:r>
           </w:p>
         </w:tc>
@@ -814,7 +814,7 @@
                 <w:sz w:val="19"/>
                 <w:szCs w:val="19"/>
               </w:rPr>
-              <w:t>基础防线：更多保障</w:t>
+              <w:t>权限检查：其他检查</w:t>
             </w:r>
           </w:p>
         </w:tc>
@@ -841,7 +841,7 @@
                 <w:sz w:val="19"/>
                 <w:szCs w:val="19"/>
               </w:rPr>
-              <w:t xml:space="preserve">A</w:t>
+              <w:t>A</w:t>
             </w:r>
           </w:p>
         </w:tc>
@@ -870,7 +870,7 @@
                 <w:sz w:val="19"/>
                 <w:szCs w:val="19"/>
               </w:rPr>
-              <w:t xml:space="preserve">5:00–7:30</w:t>
+              <w:t>5:00–7:30</w:t>
             </w:r>
           </w:p>
         </w:tc>
@@ -897,18 +897,18 @@
                 <w:sz w:val="19"/>
                 <w:szCs w:val="19"/>
               </w:rPr>
-              <w:t xml:space="preserve">本次重点</w:t>
-            </w:r>
-            <w:r>
-              <w:rPr>
-                <w:rFonts w:ascii="PingFang SC" w:cs="PingFang SC" w:eastAsia="PingFang SC" w:hAnsi="PingFang SC"/>
-                <w:b w:val="false"/>
-                <w:bCs w:val="false"/>
-                <w:color w:val="1F2937"/>
-                <w:sz w:val="19"/>
-                <w:szCs w:val="19"/>
-              </w:rPr>
-              <w:t xml:space="preserve">：双域共签（两半国密章，授权域查清楚才盖）</w:t>
+              <w:t>本次重点</w:t>
+            </w:r>
+            <w:r>
+              <w:rPr>
+                <w:rFonts w:ascii="PingFang SC" w:cs="PingFang SC" w:eastAsia="PingFang SC" w:hAnsi="PingFang SC"/>
+                <w:b w:val="false"/>
+                <w:bCs w:val="false"/>
+                <w:color w:val="1F2937"/>
+                <w:sz w:val="19"/>
+                <w:szCs w:val="19"/>
+              </w:rPr>
+              <w:t>：协同签名（两半国密章，授权侧签名方查清楚才盖）</w:t>
             </w:r>
           </w:p>
         </w:tc>
@@ -935,7 +935,7 @@
                 <w:sz w:val="19"/>
                 <w:szCs w:val="19"/>
               </w:rPr>
-              <w:t>核心机制 · 双域共签</w:t>
+              <w:t>协同签名</w:t>
             </w:r>
           </w:p>
         </w:tc>
@@ -962,7 +962,7 @@
                 <w:sz w:val="19"/>
                 <w:szCs w:val="19"/>
               </w:rPr>
-              <w:t xml:space="preserve">A 或 B</w:t>
+              <w:t>A 或 B</w:t>
             </w:r>
           </w:p>
         </w:tc>
@@ -991,7 +991,7 @@
                 <w:sz w:val="19"/>
                 <w:szCs w:val="19"/>
               </w:rPr>
-              <w:t xml:space="preserve">7:30–8:00</w:t>
+              <w:t>7:30–8:00</w:t>
             </w:r>
           </w:p>
         </w:tc>
@@ -1018,7 +1018,7 @@
                 <w:sz w:val="19"/>
                 <w:szCs w:val="19"/>
               </w:rPr>
-              <w:t xml:space="preserve">为什么换掉旧的 FROST；x402 支付一句话</w:t>
+              <w:t>为什么换掉旧的 FROST；x402 支付一句话</w:t>
             </w:r>
           </w:p>
         </w:tc>
@@ -1045,7 +1045,7 @@
                 <w:sz w:val="19"/>
                 <w:szCs w:val="19"/>
               </w:rPr>
-              <w:t>核心机制：对照页；扩展 · x402 支付</w:t>
+              <w:t>协同签名：对照页；支付扩展</w:t>
             </w:r>
           </w:p>
         </w:tc>
@@ -1072,7 +1072,7 @@
                 <w:sz w:val="19"/>
                 <w:szCs w:val="19"/>
               </w:rPr>
-              <w:t xml:space="preserve">B</w:t>
+              <w:t>B</w:t>
             </w:r>
           </w:p>
         </w:tc>
@@ -1101,7 +1101,7 @@
                 <w:sz w:val="19"/>
                 <w:szCs w:val="19"/>
               </w:rPr>
-              <w:t xml:space="preserve">8:00–8:30</w:t>
+              <w:t>8:00–8:30</w:t>
             </w:r>
           </w:p>
         </w:tc>
@@ -1128,7 +1128,7 @@
                 <w:sz w:val="19"/>
                 <w:szCs w:val="19"/>
               </w:rPr>
-              <w:t xml:space="preserve">证明这些不是画出来的，是真跑出来的</w:t>
+              <w:t>证明这些不是画出来的，是真跑出来的</w:t>
             </w:r>
           </w:p>
         </w:tc>
@@ -1155,7 +1155,7 @@
                 <w:sz w:val="19"/>
                 <w:szCs w:val="19"/>
               </w:rPr>
-              <w:t>运行证据</w:t>
+              <w:t>测试记录</w:t>
             </w:r>
           </w:p>
         </w:tc>
@@ -1182,7 +1182,7 @@
                 <w:sz w:val="19"/>
                 <w:szCs w:val="19"/>
               </w:rPr>
-              <w:t xml:space="preserve">A</w:t>
+              <w:t>A</w:t>
             </w:r>
           </w:p>
         </w:tc>
@@ -1211,7 +1211,7 @@
                 <w:sz w:val="19"/>
                 <w:szCs w:val="19"/>
               </w:rPr>
-              <w:t xml:space="preserve">8:30–10:00</w:t>
+              <w:t>8:30–10:00</w:t>
             </w:r>
           </w:p>
         </w:tc>
@@ -1238,7 +1238,7 @@
                 <w:sz w:val="19"/>
                 <w:szCs w:val="19"/>
               </w:rPr>
-              <w:t xml:space="preserve">我们做了什么改进、还有哪些局限、接下来的计划</w:t>
+              <w:t>我们做了什么改进、还有哪些局限、接下来的计划</w:t>
             </w:r>
           </w:p>
         </w:tc>
@@ -1265,7 +1265,7 @@
                 <w:sz w:val="19"/>
                 <w:szCs w:val="19"/>
               </w:rPr>
-              <w:t xml:space="preserve">不用开页面（可放一页 PPT）</w:t>
+              <w:t>不用开页面（可放一页 PPT）</w:t>
             </w:r>
           </w:p>
         </w:tc>
@@ -1292,7 +1292,7 @@
                 <w:sz w:val="19"/>
                 <w:szCs w:val="19"/>
               </w:rPr>
-              <w:t xml:space="preserve">C 或你</w:t>
+              <w:t>C 或你</w:t>
             </w:r>
           </w:p>
         </w:tc>
@@ -1319,14 +1319,14 @@
           <w:bCs/>
           <w:color w:val="1F2937"/>
         </w:rPr>
-        <w:t xml:space="preserve">演示的三条铁律</w:t>
-      </w:r>
-      <w:r>
-        <w:rPr>
-          <w:rFonts w:ascii="PingFang SC" w:cs="PingFang SC" w:eastAsia="PingFang SC" w:hAnsi="PingFang SC"/>
-          <w:color w:val="1F2937"/>
-        </w:rPr>
-        <w:t xml:space="preserve">：①页面右上角的来源标签要讲出来——"示意推演"是讲解动画，"现场运行"是刚刚真跑的，"记录回放"是以前真跑的记录；②红叉只说"在这里被拒绝"，不要夸大成"绝对安全"；③没做完的就说没做完。</w:t>
+        <w:t>演示的三条铁律</w:t>
+      </w:r>
+      <w:r>
+        <w:rPr>
+          <w:rFonts w:ascii="PingFang SC" w:cs="PingFang SC" w:eastAsia="PingFang SC" w:hAnsi="PingFang SC"/>
+          <w:color w:val="1F2937"/>
+        </w:rPr>
+        <w:t>：①页面右上角的来源标签要讲出来——"动画示意"是讲解动画，"现场运行"是刚刚真跑的，"记录回放"是以前真跑的记录；②红叉只说"在这里被拒绝"，不把测试结果扩大为普适安全保证；③没做完的就说没做完。</w:t>
       </w:r>
     </w:p>
     <w:p>
@@ -1338,7 +1338,7 @@
         <w:rPr>
           <w:rFonts w:ascii="PingFang SC" w:cs="PingFang SC" w:eastAsia="PingFang SC" w:hAnsi="PingFang SC"/>
         </w:rPr>
-        <w:t xml:space="preserve">3. 演示前的准备（汇报前 30 分钟完成）</w:t>
+        <w:t>3. 演示前的准备（汇报前 30 分钟完成）</w:t>
       </w:r>
     </w:p>
     <w:p>
@@ -1364,14 +1364,14 @@
           <w:bCs/>
           <w:color w:val="1F2937"/>
         </w:rPr>
-        <w:t xml:space="preserve">Docker Desktop</w:t>
-      </w:r>
-      <w:r>
-        <w:rPr>
-          <w:rFonts w:ascii="PingFang SC" w:cs="PingFang SC" w:eastAsia="PingFang SC" w:hAnsi="PingFang SC"/>
-          <w:color w:val="1F2937"/>
-        </w:rPr>
-        <w:t xml:space="preserve">，等它显示正在运行。</w:t>
+        <w:t>Docker Desktop</w:t>
+      </w:r>
+      <w:r>
+        <w:rPr>
+          <w:rFonts w:ascii="PingFang SC" w:cs="PingFang SC" w:eastAsia="PingFang SC" w:hAnsi="PingFang SC"/>
+          <w:color w:val="1F2937"/>
+        </w:rPr>
+        <w:t>，等它显示正在运行。</w:t>
       </w:r>
     </w:p>
     <w:p>
@@ -1388,7 +1388,7 @@
           <w:rFonts w:ascii="PingFang SC" w:cs="PingFang SC" w:eastAsia="PingFang SC" w:hAnsi="PingFang SC"/>
           <w:color w:val="1F2937"/>
         </w:rPr>
-        <w:t xml:space="preserve">双击桌面"Agent Guard 服务器"文件夹里的 </w:t>
+        <w:t xml:space="preserve">双击桌面"CoSeal 演示服务器"文件夹里的 </w:t>
       </w:r>
       <w:r>
         <w:rPr>
@@ -1397,14 +1397,14 @@
           <w:bCs/>
           <w:color w:val="1F2937"/>
         </w:rPr>
-        <w:t xml:space="preserve">启动服务器.command</w:t>
-      </w:r>
-      <w:r>
-        <w:rPr>
-          <w:rFonts w:ascii="PingFang SC" w:cs="PingFang SC" w:eastAsia="PingFang SC" w:hAnsi="PingFang SC"/>
-          <w:color w:val="1F2937"/>
-        </w:rPr>
-        <w:t xml:space="preserve">。</w:t>
+        <w:t>启动服务器.command</w:t>
+      </w:r>
+      <w:r>
+        <w:rPr>
+          <w:rFonts w:ascii="PingFang SC" w:cs="PingFang SC" w:eastAsia="PingFang SC" w:hAnsi="PingFang SC"/>
+          <w:color w:val="1F2937"/>
+        </w:rPr>
+        <w:t>。</w:t>
       </w:r>
     </w:p>
     <w:p>
@@ -1430,14 +1430,14 @@
           <w:bCs/>
           <w:color w:val="1F2937"/>
         </w:rPr>
-        <w:t xml:space="preserve">http://127.0.0.1:18765/</w:t>
-      </w:r>
-      <w:r>
-        <w:rPr>
-          <w:rFonts w:ascii="PingFang SC" w:cs="PingFang SC" w:eastAsia="PingFang SC" w:hAnsi="PingFang SC"/>
-          <w:color w:val="1F2937"/>
-        </w:rPr>
-        <w:t xml:space="preserve">，这是本机控制页，能点"现场运行"。</w:t>
+        <w:t>http://127.0.0.1:18765/</w:t>
+      </w:r>
+      <w:r>
+        <w:rPr>
+          <w:rFonts w:ascii="PingFang SC" w:cs="PingFang SC" w:eastAsia="PingFang SC" w:hAnsi="PingFang SC"/>
+          <w:color w:val="1F2937"/>
+        </w:rPr>
+        <w:t>，这是本机控制页，能点"现场运行"。</w:t>
       </w:r>
     </w:p>
     <w:p>
@@ -1463,14 +1463,14 @@
           <w:bCs/>
           <w:color w:val="1F2937"/>
         </w:rPr>
-        <w:t xml:space="preserve">http://127.0.0.1:18765/server</w:t>
-      </w:r>
-      <w:r>
-        <w:rPr>
-          <w:rFonts w:ascii="PingFang SC" w:cs="PingFang SC" w:eastAsia="PingFang SC" w:hAnsi="PingFang SC"/>
-          <w:color w:val="1F2937"/>
-        </w:rPr>
-        <w:t xml:space="preserve">，复制里面的公网地址发给老师。公网页面</w:t>
+        <w:t>http://127.0.0.1:18765/server</w:t>
+      </w:r>
+      <w:r>
+        <w:rPr>
+          <w:rFonts w:ascii="PingFang SC" w:cs="PingFang SC" w:eastAsia="PingFang SC" w:hAnsi="PingFang SC"/>
+          <w:color w:val="1F2937"/>
+        </w:rPr>
+        <w:t>，复制里面的公网地址发给老师。公网页面</w:t>
       </w:r>
       <w:r>
         <w:rPr>
@@ -1479,14 +1479,14 @@
           <w:bCs/>
           <w:color w:val="1F2937"/>
         </w:rPr>
-        <w:t xml:space="preserve">只能看、不能点运行</w:t>
-      </w:r>
-      <w:r>
-        <w:rPr>
-          <w:rFonts w:ascii="PingFang SC" w:cs="PingFang SC" w:eastAsia="PingFang SC" w:hAnsi="PingFang SC"/>
-          <w:color w:val="1F2937"/>
-        </w:rPr>
-        <w:t xml:space="preserve">，并且先用手机流量试打开一次。</w:t>
+        <w:t>只能看、不能点运行</w:t>
+      </w:r>
+      <w:r>
+        <w:rPr>
+          <w:rFonts w:ascii="PingFang SC" w:cs="PingFang SC" w:eastAsia="PingFang SC" w:hAnsi="PingFang SC"/>
+          <w:color w:val="1F2937"/>
+        </w:rPr>
+        <w:t>，并且先用手机流量试打开一次。</w:t>
       </w:r>
     </w:p>
     <w:p>
@@ -1505,14 +1505,14 @@
           <w:bCs/>
           <w:color w:val="1F2937"/>
         </w:rPr>
-        <w:t>提前把"双域共签 SM2"、"对照：旧版 FROST"和"x402 支付"三页各现场运行一次</w:t>
-      </w:r>
-      <w:r>
-        <w:rPr>
-          <w:rFonts w:ascii="PingFang SC" w:cs="PingFang SC" w:eastAsia="PingFang SC" w:hAnsi="PingFang SC"/>
-          <w:color w:val="1F2937"/>
-        </w:rPr>
-        <w:t xml:space="preserve">。第一次运行要准备环境，可能需要几分钟，汇报时页面就会直接显示"本次现场运行"的结果。双域共签是这次的重点，一定要确认它显示"全部符合预期"。</w:t>
+        <w:t>提前把"SM2 协同签名"、"对照：FROST 门限"和"x402 支付"三页各现场运行一次</w:t>
+      </w:r>
+      <w:r>
+        <w:rPr>
+          <w:rFonts w:ascii="PingFang SC" w:cs="PingFang SC" w:eastAsia="PingFang SC" w:hAnsi="PingFang SC"/>
+          <w:color w:val="1F2937"/>
+        </w:rPr>
+        <w:t>。第一次运行要准备环境，可能需要几分钟，汇报时页面就会直接显示"本次现场运行"的结果。协同签名是这次的重点，一定要确认它显示"全部符合预期"。</w:t>
       </w:r>
     </w:p>
     <w:p>
@@ -1529,7 +1529,7 @@
           <w:rFonts w:ascii="PingFang SC" w:cs="PingFang SC" w:eastAsia="PingFang SC" w:hAnsi="PingFang SC"/>
           <w:color w:val="1F2937"/>
         </w:rPr>
-        <w:t>提前把"持有者绑定""委托收窄""动态撤销"三页各点一次"现场运行"（每个约 1–3 分钟），确保"运行证据"页有当天的记录。</w:t>
+        <w:t>提前把"防令牌盗用""委托降权""撤销生效"三页各点一次"现场运行"（每个约 1–3 分钟），确保"测试记录"页有当天的记录。</w:t>
       </w:r>
     </w:p>
     <w:p>
@@ -1546,7 +1546,7 @@
           <w:rFonts w:ascii="PingFang SC" w:cs="PingFang SC" w:eastAsia="PingFang SC" w:hAnsi="PingFang SC"/>
           <w:color w:val="1F2937"/>
         </w:rPr>
-        <w:t xml:space="preserve">准备好备用录屏，以防现场网络或 Docker 出问题。用录屏时要说明"这是之前真实运行的录屏"。</w:t>
+        <w:t>准备好备用录屏，以防现场网络或 Docker 出问题。用录屏时要说明"这是之前真实运行的录屏"。</w:t>
       </w:r>
     </w:p>
     <w:p>
@@ -1563,7 +1563,7 @@
           <w:rFonts w:ascii="PingFang SC" w:cs="PingFang SC" w:eastAsia="PingFang SC" w:hAnsi="PingFang SC"/>
           <w:color w:val="1F2937"/>
         </w:rPr>
-        <w:t xml:space="preserve">投屏分辨率 1366×768 以上，浏览器缩放 100%。</w:t>
+        <w:t>投屏分辨率 1366×768 以上，浏览器缩放 100%。</w:t>
       </w:r>
     </w:p>
     <w:p>
@@ -1577,14 +1577,14 @@
           <w:bCs/>
           <w:color w:val="1F2937"/>
         </w:rPr>
-        <w:t xml:space="preserve">快捷键</w:t>
-      </w:r>
-      <w:r>
-        <w:rPr>
-          <w:rFonts w:ascii="PingFang SC" w:cs="PingFang SC" w:eastAsia="PingFang SC" w:hAnsi="PingFang SC"/>
-          <w:color w:val="1F2937"/>
-        </w:rPr>
-        <w:t>：数字键 1–5 切换五个章节；[ 和 ] 在章内翻页（例如基础防线里从"持有者绑定"翻到"委托收窄"）；→ / ← 走下一步 / 上一步；Esc 从模块说明卡返回。</w:t>
+        <w:t>快捷键</w:t>
+      </w:r>
+      <w:r>
+        <w:rPr>
+          <w:rFonts w:ascii="PingFang SC" w:cs="PingFang SC" w:eastAsia="PingFang SC" w:hAnsi="PingFang SC"/>
+          <w:color w:val="1F2937"/>
+        </w:rPr>
+        <w:t>：数字键 1–5 切换五个章节；[ 和 ] 在章内翻页（例如权限检查里从"防令牌盗用"翻到"委托降权"）；→ / ← 走下一步 / 上一步；Esc 从模块说明卡返回。</w:t>
       </w:r>
     </w:p>
     <w:p>
@@ -1596,7 +1596,7 @@
         <w:rPr>
           <w:rFonts w:ascii="PingFang SC" w:cs="PingFang SC" w:eastAsia="PingFang SC" w:hAnsi="PingFang SC"/>
         </w:rPr>
-        <w:t xml:space="preserve">4. 页面怎么看：先认识页面的四个区域</w:t>
+        <w:t>4. 页面怎么看：先认识页面的四个区域</w:t>
       </w:r>
     </w:p>
     <w:tbl>
@@ -1644,7 +1644,7 @@
                 <w:sz w:val="19"/>
                 <w:szCs w:val="19"/>
               </w:rPr>
-              <w:t xml:space="preserve">区域</w:t>
+              <w:t>区域</w:t>
             </w:r>
           </w:p>
         </w:tc>
@@ -1672,7 +1672,7 @@
                 <w:sz w:val="19"/>
                 <w:szCs w:val="19"/>
               </w:rPr>
-              <w:t xml:space="preserve">在哪里</w:t>
+              <w:t>在哪里</w:t>
             </w:r>
           </w:p>
         </w:tc>
@@ -1700,7 +1700,7 @@
                 <w:sz w:val="19"/>
                 <w:szCs w:val="19"/>
               </w:rPr>
-              <w:t xml:space="preserve">是什么</w:t>
+              <w:t>是什么</w:t>
             </w:r>
           </w:p>
         </w:tc>
@@ -1729,7 +1729,7 @@
                 <w:sz w:val="19"/>
                 <w:szCs w:val="19"/>
               </w:rPr>
-              <w:t xml:space="preserve">顶部导航</w:t>
+              <w:t>顶部导航</w:t>
             </w:r>
           </w:p>
         </w:tc>
@@ -1783,7 +1783,7 @@
                 <w:sz w:val="19"/>
                 <w:szCs w:val="19"/>
               </w:rPr>
-              <w:t>五个章节，按汇报顺序排列：总览 › 基础防线 › 核心机制 · 双域共签 › 扩展 · x402 支付 › 运行证据。章节里有多页时，左栏顶部有切换按钮</w:t>
+              <w:t>五个章节，按汇报顺序排列：总览 › 权限检查 › 协同签名 › 支付扩展 › 测试记录。章节里有多页时，左栏顶部有切换按钮</w:t>
             </w:r>
           </w:p>
         </w:tc>
@@ -1812,7 +1812,7 @@
                 <w:sz w:val="19"/>
                 <w:szCs w:val="19"/>
               </w:rPr>
-              <w:t xml:space="preserve">来源标签</w:t>
+              <w:t>来源标签</w:t>
             </w:r>
           </w:p>
         </w:tc>
@@ -1866,7 +1866,7 @@
                 <w:sz w:val="19"/>
                 <w:szCs w:val="19"/>
               </w:rPr>
-              <w:t>告诉观众这屏内容从哪里来：现场运行 / 记录回放 / 示意推演三项始终并排，当前这屏的来源会点亮（总览是架构图，三项都不亮）。这是我们"诚实"的体现，一定要讲</w:t>
+              <w:t>告诉观众这屏内容从哪里来：现场运行 / 记录回放 / 动画示意三项始终并排，当前这屏的来源会点亮（总览是架构图，三项都不亮）。这是我们"诚实"的体现，一定要讲</w:t>
             </w:r>
           </w:p>
         </w:tc>
@@ -1895,7 +1895,7 @@
                 <w:sz w:val="19"/>
                 <w:szCs w:val="19"/>
               </w:rPr>
-              <w:t xml:space="preserve">左栏说明</w:t>
+              <w:t>左栏说明</w:t>
             </w:r>
           </w:p>
         </w:tc>
@@ -1922,7 +1922,7 @@
                 <w:sz w:val="19"/>
                 <w:szCs w:val="19"/>
               </w:rPr>
-              <w:t xml:space="preserve">页面左边</w:t>
+              <w:t>页面左边</w:t>
             </w:r>
           </w:p>
         </w:tc>
@@ -1949,7 +1949,7 @@
                 <w:sz w:val="19"/>
                 <w:szCs w:val="19"/>
               </w:rPr>
-              <w:t>每页同一顺序：本页的问题、用到的协议、与原有做法相比、局限与边界（灰底框）、运行证据</w:t>
+              <w:t>每页同一顺序：本页的问题、用到的协议、与原有做法相比、局限与边界（灰底框）、测试记录</w:t>
             </w:r>
           </w:p>
         </w:tc>
@@ -1978,7 +1978,7 @@
                 <w:sz w:val="19"/>
                 <w:szCs w:val="19"/>
               </w:rPr>
-              <w:t xml:space="preserve">右侧过程图</w:t>
+              <w:t>右侧过程图</w:t>
             </w:r>
           </w:p>
         </w:tc>
@@ -2005,7 +2005,7 @@
                 <w:sz w:val="19"/>
                 <w:szCs w:val="19"/>
               </w:rPr>
-              <w:t xml:space="preserve">页面右边的大图</w:t>
+              <w:t>页面右边的大图</w:t>
             </w:r>
           </w:p>
         </w:tc>
@@ -2054,14 +2054,14 @@
           <w:bCs/>
           <w:color w:val="1F2937"/>
         </w:rPr>
-        <w:t xml:space="preserve">小技巧</w:t>
-      </w:r>
-      <w:r>
-        <w:rPr>
-          <w:rFonts w:ascii="PingFang SC" w:cs="PingFang SC" w:eastAsia="PingFang SC" w:hAnsi="PingFang SC"/>
-          <w:color w:val="1F2937"/>
-        </w:rPr>
-        <w:t xml:space="preserve">：过程图里的每个角色都能点。点开后左栏会出现一张"模块说明卡"，写着它解决什么问题、谁调用它、接收什么、检查什么、输出什么、证据与局限。老师问"这个模块是干什么的"，就点它。</w:t>
+        <w:t>小技巧</w:t>
+      </w:r>
+      <w:r>
+        <w:rPr>
+          <w:rFonts w:ascii="PingFang SC" w:cs="PingFang SC" w:eastAsia="PingFang SC" w:hAnsi="PingFang SC"/>
+          <w:color w:val="1F2937"/>
+        </w:rPr>
+        <w:t>：过程图里的每个角色都能点。点开后左栏会出现一张"模块说明卡"，写着它解决什么问题、谁调用它、接收什么、检查什么、输出什么、证据与局限。老师问"这个模块是干什么的"，就点它。</w:t>
       </w:r>
     </w:p>
     <w:p>
@@ -2073,7 +2073,7 @@
         <w:rPr>
           <w:rFonts w:ascii="PingFang SC" w:cs="PingFang SC" w:eastAsia="PingFang SC" w:hAnsi="PingFang SC"/>
         </w:rPr>
-        <w:t xml:space="preserve">5. 每个页面讲什么、怎么讲</w:t>
+        <w:t>5. 每个页面讲什么、怎么讲</w:t>
       </w:r>
     </w:p>
     <w:p>
@@ -2099,7 +2099,7 @@
           <w:bCs/>
           <w:color w:val="1F2937"/>
         </w:rPr>
-        <w:t xml:space="preserve">它在讲什么</w:t>
+        <w:t>它在讲什么</w:t>
       </w:r>
       <w:r>
         <w:rPr>
@@ -2120,14 +2120,14 @@
           <w:bCs/>
           <w:color w:val="1F2937"/>
         </w:rPr>
-        <w:t xml:space="preserve">你可以这样说</w:t>
-      </w:r>
-      <w:r>
-        <w:rPr>
-          <w:rFonts w:ascii="PingFang SC" w:cs="PingFang SC" w:eastAsia="PingFang SC" w:hAnsi="PingFang SC"/>
-          <w:color w:val="1F2937"/>
-        </w:rPr>
-        <w:t xml:space="preserve">："三个 AI 代理接力完成一次采购，但它们手里没有任何能直接花钱的东西。令牌全部由授权服务器统一签发，代理之间不能私自发卡。每一笔下单都要经过执行网关检查，查完之后在账本里原子地预留额度，然后才去下单。"</w:t>
+        <w:t>你可以这样说</w:t>
+      </w:r>
+      <w:r>
+        <w:rPr>
+          <w:rFonts w:ascii="PingFang SC" w:cs="PingFang SC" w:eastAsia="PingFang SC" w:hAnsi="PingFang SC"/>
+          <w:color w:val="1F2937"/>
+        </w:rPr>
+        <w:t>："三个 AI 代理接力完成一次采购，但它们手里没有任何能直接花钱的东西。令牌全部由授权服务器统一签发，代理之间不能私自发卡。每一笔下单都要经过工具调用网关检查，查完之后在账本里原子地预留额度，然后才去下单。"</w:t>
       </w:r>
     </w:p>
     <w:p>
@@ -2141,14 +2141,14 @@
           <w:bCs/>
           <w:color w:val="1F2937"/>
         </w:rPr>
-        <w:t xml:space="preserve">操作</w:t>
-      </w:r>
-      <w:r>
-        <w:rPr>
-          <w:rFonts w:ascii="PingFang SC" w:cs="PingFang SC" w:eastAsia="PingFang SC" w:hAnsi="PingFang SC"/>
-          <w:color w:val="1F2937"/>
-        </w:rPr>
-        <w:t>：依次点"执行代理""授权服务器 AS""执行网关"三个角色，各念一下说明卡上"解决什么问题"那一行；再点左栏"令牌被复制"这一行，进入"持有者绑定"页。</w:t>
+        <w:t>操作</w:t>
+      </w:r>
+      <w:r>
+        <w:rPr>
+          <w:rFonts w:ascii="PingFang SC" w:cs="PingFang SC" w:eastAsia="PingFang SC" w:hAnsi="PingFang SC"/>
+          <w:color w:val="1F2937"/>
+        </w:rPr>
+        <w:t>：依次点"下单代理""授权服务器 AS""工具调用网关"三个角色，各念一下说明卡上"解决什么问题"那一行；再点左栏"令牌被复制"这一行，进入"防令牌盗用"页。</w:t>
       </w:r>
     </w:p>
     <w:p>
@@ -2167,7 +2167,7 @@
           <w:bCs/>
           <w:color w:val="1F2937"/>
         </w:rPr>
-        <w:t xml:space="preserve">注意</w:t>
+        <w:t>注意</w:t>
       </w:r>
       <w:r>
         <w:rPr>
@@ -2186,7 +2186,7 @@
         <w:rPr>
           <w:rFonts w:ascii="PingFang SC" w:cs="PingFang SC" w:eastAsia="PingFang SC" w:hAnsi="PingFang SC"/>
         </w:rPr>
-        <w:t>5.2 基础防线 · 持有者绑定——"盗取令牌，却没有私钥"</w:t>
+        <w:t>5.2 权限检查 · 防令牌盗用——"盗取令牌，却没有私钥"</w:t>
       </w:r>
     </w:p>
     <w:p>
@@ -2200,14 +2200,14 @@
           <w:bCs/>
           <w:color w:val="1F2937"/>
         </w:rPr>
-        <w:t xml:space="preserve">它在讲什么</w:t>
-      </w:r>
-      <w:r>
-        <w:rPr>
-          <w:rFonts w:ascii="PingFang SC" w:cs="PingFang SC" w:eastAsia="PingFang SC" w:hAnsi="PingFang SC"/>
-          <w:color w:val="1F2937"/>
-        </w:rPr>
-        <w:t xml:space="preserve">：坏人复制了执行代理的令牌（门禁卡），但没有执行代理的私钥（相当于本人指纹）。系统要求每次请求都附一份用私钥签的"证明"，所以光有卡没用。</w:t>
+        <w:t>它在讲什么</w:t>
+      </w:r>
+      <w:r>
+        <w:rPr>
+          <w:rFonts w:ascii="PingFang SC" w:cs="PingFang SC" w:eastAsia="PingFang SC" w:hAnsi="PingFang SC"/>
+          <w:color w:val="1F2937"/>
+        </w:rPr>
+        <w:t>：坏人复制了下单代理的令牌（门禁卡），但没有下单代理的私钥（相当于本人指纹）。系统要求每次请求都附一份用私钥签的"证明"，所以光有卡没用。</w:t>
       </w:r>
     </w:p>
     <w:p>
@@ -2221,14 +2221,14 @@
           <w:bCs/>
           <w:color w:val="1F2937"/>
         </w:rPr>
-        <w:t xml:space="preserve">你可以这样说</w:t>
-      </w:r>
-      <w:r>
-        <w:rPr>
-          <w:rFonts w:ascii="PingFang SC" w:cs="PingFang SC" w:eastAsia="PingFang SC" w:hAnsi="PingFang SC"/>
-          <w:color w:val="1F2937"/>
-        </w:rPr>
-        <w:t xml:space="preserve">："令牌本身是真的，授权服务器的签名也验得过。如果是普通系统，到这一步就放行了。但我们要求每次调用都附一份用持有者私钥签的证明，坏人签不出来，所以网关在'持有者绑定'这一步把它拒绝了。最后看账本：预算没动，也没有新订单。"</w:t>
+        <w:t>你可以这样说</w:t>
+      </w:r>
+      <w:r>
+        <w:rPr>
+          <w:rFonts w:ascii="PingFang SC" w:cs="PingFang SC" w:eastAsia="PingFang SC" w:hAnsi="PingFang SC"/>
+          <w:color w:val="1F2937"/>
+        </w:rPr>
+        <w:t>："令牌本身是真的，授权服务器的签名也验得过。如果是普通系统，到这一步就放行了。但我们要求每次调用都附一份用持有者私钥签的证明，坏人签不出来，所以网关在'防令牌盗用'这一步把它拒绝了。最后看账本：预算没动，也没有新订单。"</w:t>
       </w:r>
     </w:p>
     <w:p>
@@ -2242,14 +2242,14 @@
           <w:bCs/>
           <w:color w:val="1F2937"/>
         </w:rPr>
-        <w:t xml:space="preserve">操作</w:t>
-      </w:r>
-      <w:r>
-        <w:rPr>
-          <w:rFonts w:ascii="PingFang SC" w:cs="PingFang SC" w:eastAsia="PingFang SC" w:hAnsi="PingFang SC"/>
-          <w:color w:val="1F2937"/>
-        </w:rPr>
-        <w:t xml:space="preserve">：点"下一步"一步步播放；红叉出现时停一下，指着红叉说"拒绝发生在网关"；最后一步指着"业务没有任何变化"。</w:t>
+        <w:t>操作</w:t>
+      </w:r>
+      <w:r>
+        <w:rPr>
+          <w:rFonts w:ascii="PingFang SC" w:cs="PingFang SC" w:eastAsia="PingFang SC" w:hAnsi="PingFang SC"/>
+          <w:color w:val="1F2937"/>
+        </w:rPr>
+        <w:t>：点"下一步"一步步播放；红叉出现时停一下，指着红叉说"拒绝发生在网关"；最后一步指着"业务没有任何变化"。</w:t>
       </w:r>
     </w:p>
     <w:p>
@@ -2268,14 +2268,14 @@
           <w:bCs/>
           <w:color w:val="1F2937"/>
         </w:rPr>
-        <w:t xml:space="preserve">注意</w:t>
-      </w:r>
-      <w:r>
-        <w:rPr>
-          <w:rFonts w:ascii="PingFang SC" w:cs="PingFang SC" w:eastAsia="PingFang SC" w:hAnsi="PingFang SC"/>
-          <w:color w:val="1F2937"/>
-        </w:rPr>
-        <w:t xml:space="preserve">：这防的是"令牌被偷"，不是"私钥也被偷"。持有者证明是已有的标准方向（参照 DPoP），我们没有发明它；我们做的是把它和后面两道防线串在同一条执行路径里，并且全部用国密算法。</w:t>
+        <w:t>注意</w:t>
+      </w:r>
+      <w:r>
+        <w:rPr>
+          <w:rFonts w:ascii="PingFang SC" w:cs="PingFang SC" w:eastAsia="PingFang SC" w:hAnsi="PingFang SC"/>
+          <w:color w:val="1F2937"/>
+        </w:rPr>
+        <w:t>：这防的是"令牌被偷"，不是"私钥也被偷"。持有者证明是已有的标准方向（参照 DPoP），我们没有发明它；我们做的是把它和后面两道防线串在同一条执行路径里，并且全部用国密算法。</w:t>
       </w:r>
     </w:p>
     <w:p>
@@ -2287,7 +2287,7 @@
         <w:rPr>
           <w:rFonts w:ascii="PingFang SC" w:cs="PingFang SC" w:eastAsia="PingFang SC" w:hAnsi="PingFang SC"/>
         </w:rPr>
-        <w:t>5.3 基础防线 · 委托收窄——"委托不得扩权"</w:t>
+        <w:t>5.3 权限检查 · 委托降权——"委托不得扩权"</w:t>
       </w:r>
     </w:p>
     <w:p>
@@ -2301,14 +2301,14 @@
           <w:bCs/>
           <w:color w:val="1F2937"/>
         </w:rPr>
-        <w:t xml:space="preserve">它在讲什么</w:t>
-      </w:r>
-      <w:r>
-        <w:rPr>
-          <w:rFonts w:ascii="PingFang SC" w:cs="PingFang SC" w:eastAsia="PingFang SC" w:hAnsi="PingFang SC"/>
-          <w:color w:val="1F2937"/>
-        </w:rPr>
-        <w:t xml:space="preserve">：统筹代理给选品代理申请子授权时多要了一点（金额多 0.01 元，或者多一个工具）。授权服务器会逐项比较，只要比上级多一点就拒绝签发。</w:t>
+        <w:t>它在讲什么</w:t>
+      </w:r>
+      <w:r>
+        <w:rPr>
+          <w:rFonts w:ascii="PingFang SC" w:cs="PingFang SC" w:eastAsia="PingFang SC" w:hAnsi="PingFang SC"/>
+          <w:color w:val="1F2937"/>
+        </w:rPr>
+        <w:t>：统筹代理给选品代理申请子授权时多要了一点（金额多 0.01 元，或者多一个工具）。授权服务器会逐项比较，只要比上级多一点就拒绝签发。</w:t>
       </w:r>
     </w:p>
     <w:p>
@@ -2322,14 +2322,14 @@
           <w:bCs/>
           <w:color w:val="1F2937"/>
         </w:rPr>
-        <w:t xml:space="preserve">你可以这样说</w:t>
-      </w:r>
-      <w:r>
-        <w:rPr>
-          <w:rFonts w:ascii="PingFang SC" w:cs="PingFang SC" w:eastAsia="PingFang SC" w:hAnsi="PingFang SC"/>
-          <w:color w:val="1F2937"/>
-        </w:rPr>
-        <w:t xml:space="preserve">："员工转借门禁卡，只能借出比自己权限更小的卡。这里统筹代理想给下级要一张权限更大的卡，授权服务器在签发之前就拒绝了。注意，拒绝发生在授权服务器，不是网关，所以根本没有产生能用的子令牌，后面的下单也就不会发生。"</w:t>
+        <w:t>你可以这样说</w:t>
+      </w:r>
+      <w:r>
+        <w:rPr>
+          <w:rFonts w:ascii="PingFang SC" w:cs="PingFang SC" w:eastAsia="PingFang SC" w:hAnsi="PingFang SC"/>
+          <w:color w:val="1F2937"/>
+        </w:rPr>
+        <w:t>："员工转借门禁卡，只能借出比自己权限更小的卡。这里统筹代理想给下级要一张权限更大的卡，授权服务器在签发之前就拒绝了。注意，拒绝发生在授权服务器，不是网关，所以根本没有产生能用的子令牌，后面的下单也就不会发生。"</w:t>
       </w:r>
     </w:p>
     <w:p>
@@ -2343,14 +2343,14 @@
           <w:bCs/>
           <w:color w:val="1F2937"/>
         </w:rPr>
-        <w:t xml:space="preserve">操作</w:t>
-      </w:r>
-      <w:r>
-        <w:rPr>
-          <w:rFonts w:ascii="PingFang SC" w:cs="PingFang SC" w:eastAsia="PingFang SC" w:hAnsi="PingFang SC"/>
-          <w:color w:val="1F2937"/>
-        </w:rPr>
-        <w:t xml:space="preserve">：先播放合法的收窄（800→700 元）作对照，再播放扩权负例；红叉挂在"授权服务器"上。</w:t>
+        <w:t>操作</w:t>
+      </w:r>
+      <w:r>
+        <w:rPr>
+          <w:rFonts w:ascii="PingFang SC" w:cs="PingFang SC" w:eastAsia="PingFang SC" w:hAnsi="PingFang SC"/>
+          <w:color w:val="1F2937"/>
+        </w:rPr>
+        <w:t>：先播放合法的收窄（800→700 元）作对照，再播放扩权负例；红叉挂在"授权服务器"上。</w:t>
       </w:r>
     </w:p>
     <w:p>
@@ -2369,14 +2369,14 @@
           <w:bCs/>
           <w:color w:val="1F2937"/>
         </w:rPr>
-        <w:t xml:space="preserve">注意</w:t>
-      </w:r>
-      <w:r>
-        <w:rPr>
-          <w:rFonts w:ascii="PingFang SC" w:cs="PingFang SC" w:eastAsia="PingFang SC" w:hAnsi="PingFang SC"/>
-          <w:color w:val="1F2937"/>
-        </w:rPr>
-        <w:t xml:space="preserve">：不要说成"网关拒绝了下单"，拒绝点是 AS。子额度也不等于已经花掉的钱。</w:t>
+        <w:t>注意</w:t>
+      </w:r>
+      <w:r>
+        <w:rPr>
+          <w:rFonts w:ascii="PingFang SC" w:cs="PingFang SC" w:eastAsia="PingFang SC" w:hAnsi="PingFang SC"/>
+          <w:color w:val="1F2937"/>
+        </w:rPr>
+        <w:t>：不要说成"网关拒绝了下单"，拒绝点是 AS。子额度也不等于已经花掉的钱。</w:t>
       </w:r>
     </w:p>
     <w:p>
@@ -2388,7 +2388,7 @@
         <w:rPr>
           <w:rFonts w:ascii="PingFang SC" w:cs="PingFang SC" w:eastAsia="PingFang SC" w:hAnsi="PingFang SC"/>
         </w:rPr>
-        <w:t>5.4 基础防线 · 动态撤销——"撤销之后，拒绝新请求"</w:t>
+        <w:t>5.4 权限检查 · 撤销生效——"撤销之后，拒绝新请求"</w:t>
       </w:r>
     </w:p>
     <w:p>
@@ -2402,14 +2402,14 @@
           <w:bCs/>
           <w:color w:val="1F2937"/>
         </w:rPr>
-        <w:t xml:space="preserve">它在讲什么</w:t>
-      </w:r>
-      <w:r>
-        <w:rPr>
-          <w:rFonts w:ascii="PingFang SC" w:cs="PingFang SC" w:eastAsia="PingFang SC" w:hAnsi="PingFang SC"/>
-          <w:color w:val="1F2937"/>
-        </w:rPr>
-        <w:t xml:space="preserve">：用户中途反悔，撤销了授权。执行代理手里的旧令牌签名依然有效（签名本身不会过期），但网关在受理时会去账本查"这张卡现在还有没有效"，查到已被撤销就拒绝。</w:t>
+        <w:t>它在讲什么</w:t>
+      </w:r>
+      <w:r>
+        <w:rPr>
+          <w:rFonts w:ascii="PingFang SC" w:cs="PingFang SC" w:eastAsia="PingFang SC" w:hAnsi="PingFang SC"/>
+          <w:color w:val="1F2937"/>
+        </w:rPr>
+        <w:t>：用户中途反悔，撤销了授权。下单代理手里的旧令牌签名依然有效（签名本身不会过期），但网关在受理时会去账本查"这张卡现在还有没有效"，查到已被撤销就拒绝。</w:t>
       </w:r>
     </w:p>
     <w:p>
@@ -2423,14 +2423,14 @@
           <w:bCs/>
           <w:color w:val="1F2937"/>
         </w:rPr>
-        <w:t xml:space="preserve">你可以这样说</w:t>
-      </w:r>
-      <w:r>
-        <w:rPr>
-          <w:rFonts w:ascii="PingFang SC" w:cs="PingFang SC" w:eastAsia="PingFang SC" w:hAnsi="PingFang SC"/>
-          <w:color w:val="1F2937"/>
-        </w:rPr>
-        <w:t xml:space="preserve">："签名有效不等于现在仍有权限。用户点了撤销，撤销先写进账本；之后代理再拿旧令牌来下单，网关在受理事务里查到祖先授权已被撤销，就拒绝了，账本和订单都没有变化。"</w:t>
+        <w:t>你可以这样说</w:t>
+      </w:r>
+      <w:r>
+        <w:rPr>
+          <w:rFonts w:ascii="PingFang SC" w:cs="PingFang SC" w:eastAsia="PingFang SC" w:hAnsi="PingFang SC"/>
+          <w:color w:val="1F2937"/>
+        </w:rPr>
+        <w:t>："签名有效不等于现在仍有权限。用户点了撤销，撤销先写进账本；之后代理再拿旧令牌来下单，网关在受理事务里查到祖先授权已被撤销，就拒绝了，账本和订单都没有变化。"</w:t>
       </w:r>
     </w:p>
     <w:p>
@@ -2444,14 +2444,14 @@
           <w:bCs/>
           <w:color w:val="1F2937"/>
         </w:rPr>
-        <w:t xml:space="preserve">操作</w:t>
-      </w:r>
-      <w:r>
-        <w:rPr>
-          <w:rFonts w:ascii="PingFang SC" w:cs="PingFang SC" w:eastAsia="PingFang SC" w:hAnsi="PingFang SC"/>
-          <w:color w:val="1F2937"/>
-        </w:rPr>
-        <w:t xml:space="preserve">：下方时间线强调先后顺序："撤销已提交"在前，"新请求被拒"在后。</w:t>
+        <w:t>操作</w:t>
+      </w:r>
+      <w:r>
+        <w:rPr>
+          <w:rFonts w:ascii="PingFang SC" w:cs="PingFang SC" w:eastAsia="PingFang SC" w:hAnsi="PingFang SC"/>
+          <w:color w:val="1F2937"/>
+        </w:rPr>
+        <w:t>：下方时间线强调先后顺序："撤销已提交"在前，"新请求被拒"在后。</w:t>
       </w:r>
     </w:p>
     <w:p>
@@ -2470,14 +2470,14 @@
           <w:bCs/>
           <w:color w:val="1F2937"/>
         </w:rPr>
-        <w:t xml:space="preserve">注意</w:t>
-      </w:r>
-      <w:r>
-        <w:rPr>
-          <w:rFonts w:ascii="PingFang SC" w:cs="PingFang SC" w:eastAsia="PingFang SC" w:hAnsi="PingFang SC"/>
-          <w:color w:val="1F2937"/>
-        </w:rPr>
-        <w:t xml:space="preserve">：撤销只拦"新的请求"，不会自动取消已经完成的订单。当前演示的是"先撤销再请求"这一种顺序，不要说覆盖了所有并发情况。</w:t>
+        <w:t>注意</w:t>
+      </w:r>
+      <w:r>
+        <w:rPr>
+          <w:rFonts w:ascii="PingFang SC" w:cs="PingFang SC" w:eastAsia="PingFang SC" w:hAnsi="PingFang SC"/>
+          <w:color w:val="1F2937"/>
+        </w:rPr>
+        <w:t>：撤销只拦"新的请求"，不会自动取消已经完成的订单。当前演示的是"先撤销再请求"这一种顺序，不要说覆盖了所有并发情况。</w:t>
       </w:r>
     </w:p>
     <w:p>
@@ -2489,7 +2489,7 @@
         <w:rPr>
           <w:rFonts w:ascii="PingFang SC" w:cs="PingFang SC" w:eastAsia="PingFang SC" w:hAnsi="PingFang SC"/>
         </w:rPr>
-        <w:t>5.5 基础防线 · 更多保障（参数篡改、共享预算、重放幂等、故障恢复）——快速带过</w:t>
+        <w:t>5.5 权限检查 · 其他检查（防参数篡改、共享预算、防重放、崩溃恢复）——快速带过</w:t>
       </w:r>
     </w:p>
     <w:p>
@@ -2503,14 +2503,14 @@
           <w:bCs/>
           <w:color w:val="1F2937"/>
         </w:rPr>
-        <w:t xml:space="preserve">它在讲什么</w:t>
-      </w:r>
-      <w:r>
-        <w:rPr>
-          <w:rFonts w:ascii="PingFang SC" w:cs="PingFang SC" w:eastAsia="PingFang SC" w:hAnsi="PingFang SC"/>
-          <w:color w:val="1F2937"/>
-        </w:rPr>
-        <w:t>：四个补充场景，每个用一句话讲完：参数篡改——签名后参数被改，网关发现签名对不上；共享预算——两条分支同时花同一笔预算，总额不会超；重放幂等——同一个请求重发会被识别，不会下两单；故障恢复——下单成功后进程崩溃，恢复流程会补记账，不会重复下单。</w:t>
+        <w:t>它在讲什么</w:t>
+      </w:r>
+      <w:r>
+        <w:rPr>
+          <w:rFonts w:ascii="PingFang SC" w:cs="PingFang SC" w:eastAsia="PingFang SC" w:hAnsi="PingFang SC"/>
+          <w:color w:val="1F2937"/>
+        </w:rPr>
+        <w:t>：四个补充场景，每个用一句话讲完：防参数篡改——签名后参数被改，网关发现签名对不上；共享预算——两条分支同时花同一笔预算，总额不会超；防重放——同一个请求重发会被识别，不会下两单；崩溃恢复——下单成功后进程崩溃，恢复流程会补记账，不会重复下单。</w:t>
       </w:r>
     </w:p>
     <w:p>
@@ -2524,14 +2524,14 @@
           <w:bCs/>
           <w:color w:val="1F2937"/>
         </w:rPr>
-        <w:t xml:space="preserve">你可以这样说</w:t>
-      </w:r>
-      <w:r>
-        <w:rPr>
-          <w:rFonts w:ascii="PingFang SC" w:cs="PingFang SC" w:eastAsia="PingFang SC" w:hAnsi="PingFang SC"/>
-          <w:color w:val="1F2937"/>
-        </w:rPr>
-        <w:t xml:space="preserve">："这四个是支撑能力：防篡改、防超支、防重复、崩溃可恢复。它们保证前面三道防线在真实环境下不会出现漏洞。"</w:t>
+        <w:t>你可以这样说</w:t>
+      </w:r>
+      <w:r>
+        <w:rPr>
+          <w:rFonts w:ascii="PingFang SC" w:cs="PingFang SC" w:eastAsia="PingFang SC" w:hAnsi="PingFang SC"/>
+          <w:color w:val="1F2937"/>
+        </w:rPr>
+        <w:t>："这四个是支撑能力：防篡改、防超支、防重复、崩溃可恢复。它们保证前面主要检查在真实环境下不会出现漏洞。"</w:t>
       </w:r>
     </w:p>
     <w:p>
@@ -2545,14 +2545,14 @@
           <w:bCs/>
           <w:color w:val="1F2937"/>
         </w:rPr>
-        <w:t xml:space="preserve">操作</w:t>
-      </w:r>
-      <w:r>
-        <w:rPr>
-          <w:rFonts w:ascii="PingFang SC" w:cs="PingFang SC" w:eastAsia="PingFang SC" w:hAnsi="PingFang SC"/>
-          <w:color w:val="1F2937"/>
-        </w:rPr>
-        <w:t>：在"基础防线"章左栏顶部的"更多保障"一行切换这四页（也可以按 ] 键往后翻）；每个只播放到红叉或关键一步即可。</w:t>
+        <w:t>操作</w:t>
+      </w:r>
+      <w:r>
+        <w:rPr>
+          <w:rFonts w:ascii="PingFang SC" w:cs="PingFang SC" w:eastAsia="PingFang SC" w:hAnsi="PingFang SC"/>
+          <w:color w:val="1F2937"/>
+        </w:rPr>
+        <w:t>：在"权限检查"章左栏顶部的"其他检查"一行切换这四页（也可以按 ] 键往后翻）；每个只播放到红叉或关键一步即可。</w:t>
       </w:r>
     </w:p>
     <w:p>
@@ -2571,14 +2571,14 @@
           <w:bCs/>
           <w:color w:val="1F2937"/>
         </w:rPr>
-        <w:t xml:space="preserve">注意</w:t>
-      </w:r>
-      <w:r>
-        <w:rPr>
-          <w:rFonts w:ascii="PingFang SC" w:cs="PingFang SC" w:eastAsia="PingFang SC" w:hAnsi="PingFang SC"/>
-          <w:color w:val="1F2937"/>
-        </w:rPr>
-        <w:t>：这几个场景的过程图主要是示意推演，真实证据是"运行证据"页里的测试记录。讲的时候说"示意"。</w:t>
+        <w:t>注意</w:t>
+      </w:r>
+      <w:r>
+        <w:rPr>
+          <w:rFonts w:ascii="PingFang SC" w:cs="PingFang SC" w:eastAsia="PingFang SC" w:hAnsi="PingFang SC"/>
+          <w:color w:val="1F2937"/>
+        </w:rPr>
+        <w:t>：这几个场景的过程图主要是动画示意，真实证据是"测试记录"页里的测试记录。讲的时候说"示意"。</w:t>
       </w:r>
     </w:p>
     <w:p>
@@ -2590,7 +2590,7 @@
         <w:rPr>
           <w:rFonts w:ascii="PingFang SC" w:cs="PingFang SC" w:eastAsia="PingFang SC" w:hAnsi="PingFang SC"/>
         </w:rPr>
-        <w:t>5.6 核心机制 · 双域共签 SM2——"授权域点头，才能签出这一笔"（本次重点）</w:t>
+        <w:t>5.6 SM2 协同签名——"授权侧点头，才能签出这一笔"（本次重点）</w:t>
       </w:r>
     </w:p>
     <w:p>
@@ -2604,14 +2604,14 @@
           <w:bCs/>
           <w:color w:val="1F2937"/>
         </w:rPr>
-        <w:t xml:space="preserve">它在讲什么</w:t>
-      </w:r>
-      <w:r>
-        <w:rPr>
-          <w:rFonts w:ascii="PingFang SC" w:cs="PingFang SC" w:eastAsia="PingFang SC" w:hAnsi="PingFang SC"/>
-          <w:color w:val="1F2937"/>
-        </w:rPr>
-        <w:t xml:space="preserve">：这是这次新增的核心机制。下单需要一个国密签名，但签名的私钥被切成两半：一半在授权域（和授权服务器在一起），一半在执行域（和网关在一起），完整私钥在任何地方都不存在，生成钥匙时也不需要一个"知道全部秘密的中间人"。授权域在交出它那一半之前，会自己再查一遍：委托链是不是真的、有没有被撤销、预算还够不够。两半合起来就是一个普通的 SM2 签名，网关和下单服务都用标准国密库验证。</w:t>
+        <w:t>它在讲什么</w:t>
+      </w:r>
+      <w:r>
+        <w:rPr>
+          <w:rFonts w:ascii="PingFang SC" w:cs="PingFang SC" w:eastAsia="PingFang SC" w:hAnsi="PingFang SC"/>
+          <w:color w:val="1F2937"/>
+        </w:rPr>
+        <w:t>：这是这次新增的协同签名。下单需要一个国密签名，但签名的私钥被切成两半：一半在授权侧签名方（和授权服务器在一起），一半在网关侧签名方（和网关在一起），完整私钥在任何地方都不存在，生成钥匙时也不需要一个"知道全部秘密的中间人"。授权侧签名方在交出它那一半之前，会自己再查一遍：委托链是不是真的、有没有被撤销、预算还够不够。两半合起来就是一个普通的 SM2 签名，网关和下单服务都用标准国密库验证。</w:t>
       </w:r>
     </w:p>
     <w:p>
@@ -2625,14 +2625,14 @@
           <w:bCs/>
           <w:color w:val="1F2937"/>
         </w:rPr>
-        <w:t xml:space="preserve">你可以这样说</w:t>
-      </w:r>
-      <w:r>
-        <w:rPr>
-          <w:rFonts w:ascii="PingFang SC" w:cs="PingFang SC" w:eastAsia="PingFang SC" w:hAnsi="PingFang SC"/>
-          <w:color w:val="1F2937"/>
-        </w:rPr>
-        <w:t xml:space="preserve">："以前是网关一个人说了算，网关被攻破就全完了。现在每一笔下单都要两个部门各出半个章，授权部门盖章前自己查账。左边是刚刚现场跑出来的 6 个用例：有效共签只下一单；缺少共签被拒；只有执行域自己签，签出来的东西验不过；共签后改金额被拒；先撤销再来申请，授权域直接拒绝出份额；签完之后才撤销，网关受理时照样拒绝。"</w:t>
+        <w:t>你可以这样说</w:t>
+      </w:r>
+      <w:r>
+        <w:rPr>
+          <w:rFonts w:ascii="PingFang SC" w:cs="PingFang SC" w:eastAsia="PingFang SC" w:hAnsi="PingFang SC"/>
+          <w:color w:val="1F2937"/>
+        </w:rPr>
+        <w:t>："以前是网关一个人说了算，网关被攻破就全完了。现在每一笔下单都要两个部门各出半个章，授权部门盖章前自己查账。左边是刚刚现场跑出来的 6 个用例：有效共签只下一单；缺少共签被拒；只有网关侧签名方自己签，签出来的东西验不过；共签后改金额被拒；先撤销再来申请，授权侧签名方直接拒绝出份额；签完之后才撤销，网关受理时照样拒绝。"</w:t>
       </w:r>
     </w:p>
     <w:p>
@@ -2646,14 +2646,14 @@
           <w:bCs/>
           <w:color w:val="1F2937"/>
         </w:rPr>
-        <w:t xml:space="preserve">操作</w:t>
-      </w:r>
-      <w:r>
-        <w:rPr>
-          <w:rFonts w:ascii="PingFang SC" w:cs="PingFang SC" w:eastAsia="PingFang SC" w:hAnsi="PingFang SC"/>
-          <w:color w:val="1F2937"/>
-        </w:rPr>
-        <w:t xml:space="preserve">：左栏点"现场运行"（务必汇报前已跑过一次），逐行指着结果讲；然后在右侧播放示意图，</w:t>
+        <w:t>操作</w:t>
+      </w:r>
+      <w:r>
+        <w:rPr>
+          <w:rFonts w:ascii="PingFang SC" w:cs="PingFang SC" w:eastAsia="PingFang SC" w:hAnsi="PingFang SC"/>
+          <w:color w:val="1F2937"/>
+        </w:rPr>
+        <w:t>：左栏点"现场运行"（务必汇报前已跑过一次），逐行指着结果讲；然后在右侧播放示意图，</w:t>
       </w:r>
       <w:r>
         <w:rPr>
@@ -2662,14 +2662,14 @@
           <w:bCs/>
           <w:color w:val="1F2937"/>
         </w:rPr>
-        <w:t xml:space="preserve">红叉出现在授权域</w:t>
-      </w:r>
-      <w:r>
-        <w:rPr>
-          <w:rFonts w:ascii="PingFang SC" w:cs="PingFang SC" w:eastAsia="PingFang SC" w:hAnsi="PingFang SC"/>
-          <w:color w:val="1F2937"/>
-        </w:rPr>
-        <w:t xml:space="preserve">这一步要停下来强调——拒绝发生在出份额之前，根本没有签名产生。可点"执行域""授权域"两张模块卡。</w:t>
+        <w:t>红叉出现在授权侧签名方</w:t>
+      </w:r>
+      <w:r>
+        <w:rPr>
+          <w:rFonts w:ascii="PingFang SC" w:cs="PingFang SC" w:eastAsia="PingFang SC" w:hAnsi="PingFang SC"/>
+          <w:color w:val="1F2937"/>
+        </w:rPr>
+        <w:t>这一步要停下来强调——拒绝发生在出份额之前，根本没有签名产生。可点"网关侧签名方""授权侧签名方"两张模块卡。</w:t>
       </w:r>
     </w:p>
     <w:p>
@@ -2688,14 +2688,14 @@
           <w:bCs/>
           <w:color w:val="1F2937"/>
         </w:rPr>
-        <w:t xml:space="preserve">注意</w:t>
-      </w:r>
-      <w:r>
-        <w:rPr>
-          <w:rFonts w:ascii="PingFang SC" w:cs="PingFang SC" w:eastAsia="PingFang SC" w:hAnsi="PingFang SC"/>
-          <w:color w:val="1F2937"/>
-        </w:rPr>
-        <w:t xml:space="preserve">：必须主动说明：①这是两方协同签名（n=2），安全模型是"半诚实"（假设被攻破的一方仍按协议走，只是想偷看秘密）；②演示里两个域在同一台电脑上，是不同进程，不是真正分开的机构；③份额计算是 Python 原型，不是常数时间实现，不能防侧信道；④下单服务会独立验签名、防重放，但不会再去查一遍撤销，所以"签名之后才撤销"仍靠网关挡。</w:t>
+        <w:t>注意</w:t>
+      </w:r>
+      <w:r>
+        <w:rPr>
+          <w:rFonts w:ascii="PingFang SC" w:cs="PingFang SC" w:eastAsia="PingFang SC" w:hAnsi="PingFang SC"/>
+          <w:color w:val="1F2937"/>
+        </w:rPr>
+        <w:t>：必须主动说明：①这是两方协同签名（n=2），安全模型是"半诚实"（假设被攻破的一方仍按协议走，只是想偷看秘密）；②演示里两方在同一台电脑上，是不同进程，不是真正分开的机构；③份额计算是 Python 原型，不是常数时间实现，不能防侧信道；④下单服务会独立验签名、防重放，但不会再去查一遍撤销，所以"签名之后才撤销"仍靠网关挡。</w:t>
       </w:r>
     </w:p>
     <w:p>
@@ -2707,7 +2707,7 @@
         <w:rPr>
           <w:rFonts w:ascii="PingFang SC" w:cs="PingFang SC" w:eastAsia="PingFang SC" w:hAnsi="PingFang SC"/>
         </w:rPr>
-        <w:t>5.7 核心机制 · 对照：旧版 FROST——"为什么换掉旧版 FROST"</w:t>
+        <w:t>5.7 协同签名 · 对照：FROST 门限——"为什么换掉旧版 FROST"</w:t>
       </w:r>
     </w:p>
     <w:p>
@@ -2721,14 +2721,14 @@
           <w:bCs/>
           <w:color w:val="1F2937"/>
         </w:rPr>
-        <w:t xml:space="preserve">它在讲什么</w:t>
-      </w:r>
-      <w:r>
-        <w:rPr>
-          <w:rFonts w:ascii="PingFang SC" w:cs="PingFang SC" w:eastAsia="PingFang SC" w:hAnsi="PingFang SC"/>
-          <w:color w:val="1F2937"/>
-        </w:rPr>
-        <w:t xml:space="preserve">：这是之前做的 2-of-3 门限批准（三把钥匙任意两把），已接入采购流程，6 个用例也都通过。现在把它保留为对照组。</w:t>
+        <w:t>它在讲什么</w:t>
+      </w:r>
+      <w:r>
+        <w:rPr>
+          <w:rFonts w:ascii="PingFang SC" w:cs="PingFang SC" w:eastAsia="PingFang SC" w:hAnsi="PingFang SC"/>
+          <w:color w:val="1F2937"/>
+        </w:rPr>
+        <w:t>：这是之前做的 2-of-3 门限批准（三把钥匙任意两把），已接入采购流程，6 个用例也都通过。现在把它保留为对照组。</w:t>
       </w:r>
     </w:p>
     <w:p>
@@ -2742,14 +2742,14 @@
           <w:bCs/>
           <w:color w:val="1F2937"/>
         </w:rPr>
-        <w:t xml:space="preserve">你可以这样说</w:t>
-      </w:r>
-      <w:r>
-        <w:rPr>
-          <w:rFonts w:ascii="PingFang SC" w:cs="PingFang SC" w:eastAsia="PingFang SC" w:hAnsi="PingFang SC"/>
-          <w:color w:val="1F2937"/>
-        </w:rPr>
-        <w:t xml:space="preserve">："我们复盘发现旧方案有三个问题：三个签名方并不自己检查授权状态，只是照着事先写好的规则签；用的是国外的 Ed25519 不是国密；而且需要一个知道全部秘密的分发者。新方案的双域共签把这三点都改了。"</w:t>
+        <w:t>你可以这样说</w:t>
+      </w:r>
+      <w:r>
+        <w:rPr>
+          <w:rFonts w:ascii="PingFang SC" w:cs="PingFang SC" w:eastAsia="PingFang SC" w:hAnsi="PingFang SC"/>
+          <w:color w:val="1F2937"/>
+        </w:rPr>
+        <w:t>："我们复盘发现旧方案有三个问题：三个签名方并不自己检查授权状态，只是照着事先写好的规则签；用的是国外的 Ed25519 不是国密；而且需要一个知道全部秘密的分发者。新方案的协同签名把这三点都改了。"</w:t>
       </w:r>
     </w:p>
     <w:p>
@@ -2763,14 +2763,14 @@
           <w:bCs/>
           <w:color w:val="1F2937"/>
         </w:rPr>
-        <w:t xml:space="preserve">操作</w:t>
-      </w:r>
-      <w:r>
-        <w:rPr>
-          <w:rFonts w:ascii="PingFang SC" w:cs="PingFang SC" w:eastAsia="PingFang SC" w:hAnsi="PingFang SC"/>
-          <w:color w:val="1F2937"/>
-        </w:rPr>
-        <w:t>：在"核心机制"章左栏顶部点"对照：旧版 FROST"进入。可以不现场运行，只把左栏"与原有做法相比"里的三条（不查授权、非国密、可信初始化）念一下，30 秒带过。</w:t>
+        <w:t>操作</w:t>
+      </w:r>
+      <w:r>
+        <w:rPr>
+          <w:rFonts w:ascii="PingFang SC" w:cs="PingFang SC" w:eastAsia="PingFang SC" w:hAnsi="PingFang SC"/>
+          <w:color w:val="1F2937"/>
+        </w:rPr>
+        <w:t>：在"协同签名"章左栏顶部点"对照：FROST 门限"进入。可以不现场运行，只把左栏"与原有做法相比"里的三条（不查授权、非国密、可信初始化）念一下，30 秒带过。</w:t>
       </w:r>
     </w:p>
     <w:p>
@@ -2789,14 +2789,14 @@
           <w:bCs/>
           <w:color w:val="1F2937"/>
         </w:rPr>
-        <w:t xml:space="preserve">注意</w:t>
-      </w:r>
-      <w:r>
-        <w:rPr>
-          <w:rFonts w:ascii="PingFang SC" w:cs="PingFang SC" w:eastAsia="PingFang SC" w:hAnsi="PingFang SC"/>
-          <w:color w:val="1F2937"/>
-        </w:rPr>
-        <w:t xml:space="preserve">：不要说 FROST 方案"错了"，它是正确实现的，只是和授权主线结合得不够紧。</w:t>
+        <w:t>注意</w:t>
+      </w:r>
+      <w:r>
+        <w:rPr>
+          <w:rFonts w:ascii="PingFang SC" w:cs="PingFang SC" w:eastAsia="PingFang SC" w:hAnsi="PingFang SC"/>
+          <w:color w:val="1F2937"/>
+        </w:rPr>
+        <w:t>：不要说 FROST 方案"错了"，它是正确实现的，只是和授权主线结合得不够紧。</w:t>
       </w:r>
     </w:p>
     <w:p>
@@ -2808,7 +2808,7 @@
         <w:rPr>
           <w:rFonts w:ascii="PingFang SC" w:cs="PingFang SC" w:eastAsia="PingFang SC" w:hAnsi="PingFang SC"/>
         </w:rPr>
-        <w:t>5.8 扩展 · x402 支付——"先报价，再按报价付款"</w:t>
+        <w:t>5.8 支付扩展——"先报价，再按报价付款"</w:t>
       </w:r>
     </w:p>
     <w:p>
@@ -2822,14 +2822,14 @@
           <w:bCs/>
           <w:color w:val="1F2937"/>
         </w:rPr>
-        <w:t xml:space="preserve">它在讲什么</w:t>
-      </w:r>
-      <w:r>
-        <w:rPr>
-          <w:rFonts w:ascii="PingFang SC" w:cs="PingFang SC" w:eastAsia="PingFang SC" w:hAnsi="PingFang SC"/>
-          <w:color w:val="1F2937"/>
-        </w:rPr>
-        <w:t xml:space="preserve">：x402 是一种让程序自动付费的协议：程序去访问一个收费资源，对方先回一个"402 需要付款"并附报价；程序核对报价后签一份付款授权，对方验证通过后在链上结算，再把资源给出来。</w:t>
+        <w:t>它在讲什么</w:t>
+      </w:r>
+      <w:r>
+        <w:rPr>
+          <w:rFonts w:ascii="PingFang SC" w:cs="PingFang SC" w:eastAsia="PingFang SC" w:hAnsi="PingFang SC"/>
+          <w:color w:val="1F2937"/>
+        </w:rPr>
+        <w:t>：x402 是一种让程序自动付费的协议：程序去访问一个收费资源，对方先回一个"402 需要付款"并附报价；程序核对报价后签一份付款授权，对方验证通过后在链上结算，再把资源给出来。</w:t>
       </w:r>
     </w:p>
     <w:p>
@@ -2843,14 +2843,14 @@
           <w:bCs/>
           <w:color w:val="1F2937"/>
         </w:rPr>
-        <w:t xml:space="preserve">你可以这样说</w:t>
-      </w:r>
-      <w:r>
-        <w:rPr>
-          <w:rFonts w:ascii="PingFang SC" w:cs="PingFang SC" w:eastAsia="PingFang SC" w:hAnsi="PingFang SC"/>
-          <w:color w:val="1F2937"/>
-        </w:rPr>
-        <w:t xml:space="preserve">："付款只说明钱付对了，能不能下单仍然由前面的授权决定。我们在本地测试链上跑通了完整流程：正常付款只结算一次，重放不会付两次，超出预算、篡改付款都被拒绝，结果未知时也不会重复付款。"</w:t>
+        <w:t>你可以这样说</w:t>
+      </w:r>
+      <w:r>
+        <w:rPr>
+          <w:rFonts w:ascii="PingFang SC" w:cs="PingFang SC" w:eastAsia="PingFang SC" w:hAnsi="PingFang SC"/>
+          <w:color w:val="1F2937"/>
+        </w:rPr>
+        <w:t>："付款只说明钱付对了，能不能下单仍然由前面的授权决定。我们在本地测试链上跑通了完整流程：正常付款只结算一次，重放不会付两次，超出预算、篡改付款都被拒绝，结果未知时也不会重复付款。"</w:t>
       </w:r>
     </w:p>
     <w:p>
@@ -2864,14 +2864,14 @@
           <w:bCs/>
           <w:color w:val="1F2937"/>
         </w:rPr>
-        <w:t xml:space="preserve">操作</w:t>
-      </w:r>
-      <w:r>
-        <w:rPr>
-          <w:rFonts w:ascii="PingFang SC" w:cs="PingFang SC" w:eastAsia="PingFang SC" w:hAnsi="PingFang SC"/>
-          <w:color w:val="1F2937"/>
-        </w:rPr>
-        <w:t xml:space="preserve">：左栏运行固定演示（第一次很慢，务必提前跑），逐行讲用例结果。</w:t>
+        <w:t>操作</w:t>
+      </w:r>
+      <w:r>
+        <w:rPr>
+          <w:rFonts w:ascii="PingFang SC" w:cs="PingFang SC" w:eastAsia="PingFang SC" w:hAnsi="PingFang SC"/>
+          <w:color w:val="1F2937"/>
+        </w:rPr>
+        <w:t>：左栏运行固定演示（第一次很慢，务必提前跑），逐行讲用例结果。</w:t>
       </w:r>
     </w:p>
     <w:p>
@@ -2890,14 +2890,14 @@
           <w:bCs/>
           <w:color w:val="1F2937"/>
         </w:rPr>
-        <w:t xml:space="preserve">注意</w:t>
-      </w:r>
-      <w:r>
-        <w:rPr>
-          <w:rFonts w:ascii="PingFang SC" w:cs="PingFang SC" w:eastAsia="PingFang SC" w:hAnsi="PingFang SC"/>
-          <w:color w:val="1F2937"/>
-        </w:rPr>
-        <w:t>：用的是本地测试链和自建的测试代币，没有真钱、没有真实网络；链上付款签名仍是以太坊的 EIP-3009，不是国密。页面上的按钮跑的是"付款意图必须经双域共签批准"的版本，10 月 18 日已在页面上实际跑通一次，6 个用例全部符合预期（运行记录确认批准方案为 sm2-2p）。</w:t>
+        <w:t>注意</w:t>
+      </w:r>
+      <w:r>
+        <w:rPr>
+          <w:rFonts w:ascii="PingFang SC" w:cs="PingFang SC" w:eastAsia="PingFang SC" w:hAnsi="PingFang SC"/>
+          <w:color w:val="1F2937"/>
+        </w:rPr>
+        <w:t>：用的是本地测试链和自建的测试代币，没有真钱、没有真实网络；链上付款签名仍是以太坊的 EIP-3009，不是国密。页面上的按钮跑的是"付款意图必须经协同签名批准"的版本，10 月 18 日已在页面上实际跑通一次，6 个用例全部符合预期（运行记录确认批准方案为 sm2-2p）。</w:t>
       </w:r>
       <w:r>
         <w:rPr>
@@ -2925,7 +2925,7 @@
         <w:rPr>
           <w:rFonts w:ascii="PingFang SC" w:cs="PingFang SC" w:eastAsia="PingFang SC" w:hAnsi="PingFang SC"/>
         </w:rPr>
-        <w:t>5.9 运行证据——"用真实运行核对"</w:t>
+        <w:t>5.9 测试记录——"用真实运行核对"</w:t>
       </w:r>
     </w:p>
     <w:p>
@@ -2939,14 +2939,14 @@
           <w:bCs/>
           <w:color w:val="1F2937"/>
         </w:rPr>
-        <w:t xml:space="preserve">它在讲什么</w:t>
-      </w:r>
-      <w:r>
-        <w:rPr>
-          <w:rFonts w:ascii="PingFang SC" w:cs="PingFang SC" w:eastAsia="PingFang SC" w:hAnsi="PingFang SC"/>
-          <w:color w:val="1F2937"/>
-        </w:rPr>
-        <w:t xml:space="preserve">：前面的过程图是讲解动画，这一页读取本机真实运行留下的记录，或者现场再跑一次。每条记录都有运行编号（run_id）和时间。</w:t>
+        <w:t>它在讲什么</w:t>
+      </w:r>
+      <w:r>
+        <w:rPr>
+          <w:rFonts w:ascii="PingFang SC" w:cs="PingFang SC" w:eastAsia="PingFang SC" w:hAnsi="PingFang SC"/>
+          <w:color w:val="1F2937"/>
+        </w:rPr>
+        <w:t>：前面的过程图是讲解动画，这一页读取本机真实运行留下的记录，或者现场再跑一次。每条记录都有运行编号（run_id）和时间。</w:t>
       </w:r>
     </w:p>
     <w:p>
@@ -2960,14 +2960,14 @@
           <w:bCs/>
           <w:color w:val="1F2937"/>
         </w:rPr>
-        <w:t xml:space="preserve">你可以这样说</w:t>
-      </w:r>
-      <w:r>
-        <w:rPr>
-          <w:rFonts w:ascii="PingFang SC" w:cs="PingFang SC" w:eastAsia="PingFang SC" w:hAnsi="PingFang SC"/>
-          <w:color w:val="1F2937"/>
-        </w:rPr>
-        <w:t>："为了证明前面讲的不是画出来的，这里是真实运行的记录。比如持有者绑定这次运行产生了 5 条真实事件，委托收窄有 11 条，动态撤销有 6 条，都和测试断言一一对应。运行失败也会如实显示，不会被当成成功。"</w:t>
+        <w:t>你可以这样说</w:t>
+      </w:r>
+      <w:r>
+        <w:rPr>
+          <w:rFonts w:ascii="PingFang SC" w:cs="PingFang SC" w:eastAsia="PingFang SC" w:hAnsi="PingFang SC"/>
+          <w:color w:val="1F2937"/>
+        </w:rPr>
+        <w:t>："为了证明前面讲的不是画出来的，这里是真实运行的记录。比如防令牌盗用这次运行产生了 5 条真实事件，委托降权有 11 条，撤销生效有 6 条，都和测试断言一一对应。运行失败也会如实显示，不会被当成成功。"</w:t>
       </w:r>
     </w:p>
     <w:p>
@@ -2981,7 +2981,7 @@
           <w:bCs/>
           <w:color w:val="1F2937"/>
         </w:rPr>
-        <w:t xml:space="preserve">操作</w:t>
+        <w:t>操作</w:t>
       </w:r>
       <w:r>
         <w:rPr>
@@ -3007,14 +3007,14 @@
           <w:bCs/>
           <w:color w:val="1F2937"/>
         </w:rPr>
-        <w:t xml:space="preserve">注意</w:t>
-      </w:r>
-      <w:r>
-        <w:rPr>
-          <w:rFonts w:ascii="PingFang SC" w:cs="PingFang SC" w:eastAsia="PingFang SC" w:hAnsi="PingFang SC"/>
-          <w:color w:val="1F2937"/>
-        </w:rPr>
-        <w:t xml:space="preserve">：这里的数字以当天页面实际显示为准，不要背上面的数字硬说。</w:t>
+        <w:t>注意</w:t>
+      </w:r>
+      <w:r>
+        <w:rPr>
+          <w:rFonts w:ascii="PingFang SC" w:cs="PingFang SC" w:eastAsia="PingFang SC" w:hAnsi="PingFang SC"/>
+          <w:color w:val="1F2937"/>
+        </w:rPr>
+        <w:t>：这里的数字以当天页面实际显示为准，不要背上面的数字硬说。</w:t>
       </w:r>
     </w:p>
     <w:p>
@@ -3026,7 +3026,7 @@
         <w:rPr>
           <w:rFonts w:ascii="PingFang SC" w:cs="PingFang SC" w:eastAsia="PingFang SC" w:hAnsi="PingFang SC"/>
         </w:rPr>
-        <w:t xml:space="preserve">6. 目前进度与将来计划</w:t>
+        <w:t>6. 目前进度与将来计划</w:t>
       </w:r>
     </w:p>
     <w:p>
@@ -3038,7 +3038,7 @@
         <w:rPr>
           <w:rFonts w:ascii="PingFang SC" w:cs="PingFang SC" w:eastAsia="PingFang SC" w:hAnsi="PingFang SC"/>
         </w:rPr>
-        <w:t xml:space="preserve">6.1 已经做完的（可以放心说）</w:t>
+        <w:t>6.1 已经做完的（可以放心说）</w:t>
       </w:r>
     </w:p>
     <w:tbl>
@@ -3086,7 +3086,7 @@
                 <w:sz w:val="19"/>
                 <w:szCs w:val="19"/>
               </w:rPr>
-              <w:t xml:space="preserve">内容</w:t>
+              <w:t>内容</w:t>
             </w:r>
           </w:p>
         </w:tc>
@@ -3114,7 +3114,7 @@
                 <w:sz w:val="19"/>
                 <w:szCs w:val="19"/>
               </w:rPr>
-              <w:t xml:space="preserve">做到什么程度</w:t>
+              <w:t>做到什么程度</w:t>
             </w:r>
           </w:p>
         </w:tc>
@@ -3142,7 +3142,7 @@
                 <w:sz w:val="19"/>
                 <w:szCs w:val="19"/>
               </w:rPr>
-              <w:t xml:space="preserve">证据</w:t>
+              <w:t>证据</w:t>
             </w:r>
           </w:p>
         </w:tc>
@@ -3171,7 +3171,7 @@
                 <w:sz w:val="19"/>
                 <w:szCs w:val="19"/>
               </w:rPr>
-              <w:t>三道基础防线（持有者绑定、委托收窄、动态撤销）</w:t>
+              <w:t>主要检查（防令牌盗用、委托降权、撤销生效）</w:t>
             </w:r>
           </w:p>
         </w:tc>
@@ -3198,7 +3198,7 @@
                 <w:sz w:val="19"/>
                 <w:szCs w:val="19"/>
               </w:rPr>
-              <w:t xml:space="preserve">真实运行，前端按真实事件播放</w:t>
+              <w:t>真实运行，前端按真实事件播放</w:t>
             </w:r>
           </w:p>
         </w:tc>
@@ -3225,7 +3225,7 @@
                 <w:sz w:val="19"/>
                 <w:szCs w:val="19"/>
               </w:rPr>
-              <w:t xml:space="preserve">三次隔离运行，分别产生 5、11、6 条真实事件</w:t>
+              <w:t>三次隔离运行，分别产生 5、11、6 条真实事件</w:t>
             </w:r>
           </w:p>
         </w:tc>
@@ -3254,7 +3254,7 @@
                 <w:sz w:val="19"/>
                 <w:szCs w:val="19"/>
               </w:rPr>
-              <w:t>更多保障四个场景</w:t>
+              <w:t>其他检查四个场景</w:t>
             </w:r>
           </w:p>
         </w:tc>
@@ -3281,7 +3281,7 @@
                 <w:sz w:val="19"/>
                 <w:szCs w:val="19"/>
               </w:rPr>
-              <w:t xml:space="preserve">真实测试通过，页面以示意为主</w:t>
+              <w:t>真实测试通过，页面以示意为主</w:t>
             </w:r>
           </w:p>
         </w:tc>
@@ -3308,7 +3308,7 @@
                 <w:sz w:val="19"/>
                 <w:szCs w:val="19"/>
               </w:rPr>
-              <w:t xml:space="preserve">历史验证记录</w:t>
+              <w:t>历史验证记录</w:t>
             </w:r>
           </w:p>
         </w:tc>
@@ -3337,7 +3337,7 @@
                 <w:sz w:val="19"/>
                 <w:szCs w:val="19"/>
               </w:rPr>
-              <w:t xml:space="preserve">双域协同 SM2 签名（新）</w:t>
+              <w:t>SM2 两方协同签名（新）</w:t>
             </w:r>
           </w:p>
         </w:tc>
@@ -3364,7 +3364,7 @@
                 <w:sz w:val="19"/>
                 <w:szCs w:val="19"/>
               </w:rPr>
-              <w:t xml:space="preserve">已接入采购网关、下单服务和本机演示</w:t>
+              <w:t>已接入采购网关、下单服务和本机演示</w:t>
             </w:r>
           </w:p>
         </w:tc>
@@ -3391,7 +3391,7 @@
                 <w:sz w:val="19"/>
                 <w:szCs w:val="19"/>
               </w:rPr>
-              <w:t xml:space="preserve">16 个真实采购集成用例；完整 552 项数据库集成测试和独立复验通过；公开测试向量被 OpenSSL 独立验签通过</w:t>
+              <w:t>16 个真实采购集成用例；完整 552 项数据库集成测试和独立复验通过；公开测试向量被 OpenSSL 独立验签通过</w:t>
             </w:r>
           </w:p>
         </w:tc>
@@ -3420,7 +3420,7 @@
                 <w:sz w:val="19"/>
                 <w:szCs w:val="19"/>
               </w:rPr>
-              <w:t xml:space="preserve">付款意图共签（新）</w:t>
+              <w:t>付款批准（协同签名）（新）</w:t>
             </w:r>
           </w:p>
         </w:tc>
@@ -3447,7 +3447,7 @@
                 <w:sz w:val="19"/>
                 <w:szCs w:val="19"/>
               </w:rPr>
-              <w:t xml:space="preserve">本地测试链；页面按钮已切换为共签</w:t>
+              <w:t>本地测试链；页面按钮已切换为共签</w:t>
             </w:r>
           </w:p>
         </w:tc>
@@ -3503,7 +3503,7 @@
                 <w:sz w:val="19"/>
                 <w:szCs w:val="19"/>
               </w:rPr>
-              <w:t xml:space="preserve">FROST 门限批准（旧，作对照）</w:t>
+              <w:t>FROST 门限批准（旧，作对照）</w:t>
             </w:r>
           </w:p>
         </w:tc>
@@ -3530,7 +3530,7 @@
                 <w:sz w:val="19"/>
                 <w:szCs w:val="19"/>
               </w:rPr>
-              <w:t xml:space="preserve">已接入采购流程</w:t>
+              <w:t>已接入采购流程</w:t>
             </w:r>
           </w:p>
         </w:tc>
@@ -3557,7 +3557,7 @@
                 <w:sz w:val="19"/>
                 <w:szCs w:val="19"/>
               </w:rPr>
-              <w:t xml:space="preserve">24 个集成用例；固定演示 6/6</w:t>
+              <w:t>24 个集成用例；固定演示 6/6</w:t>
             </w:r>
           </w:p>
         </w:tc>
@@ -3586,7 +3586,7 @@
                 <w:sz w:val="19"/>
                 <w:szCs w:val="19"/>
               </w:rPr>
-              <w:t xml:space="preserve">演示网站</w:t>
+              <w:t>演示网站</w:t>
             </w:r>
           </w:p>
         </w:tc>
@@ -3613,7 +3613,7 @@
                 <w:sz w:val="19"/>
                 <w:szCs w:val="19"/>
               </w:rPr>
-              <w:t xml:space="preserve">本机可控制，公网只读</w:t>
+              <w:t>本机可控制，公网只读</w:t>
             </w:r>
           </w:p>
         </w:tc>
@@ -3640,7 +3640,7 @@
                 <w:sz w:val="19"/>
                 <w:szCs w:val="19"/>
               </w:rPr>
-              <w:t xml:space="preserve">桌面一键启动</w:t>
+              <w:t>桌面一键启动</w:t>
             </w:r>
           </w:p>
         </w:tc>
@@ -3660,7 +3660,7 @@
         <w:rPr>
           <w:rFonts w:ascii="PingFang SC" w:cs="PingFang SC" w:eastAsia="PingFang SC" w:hAnsi="PingFang SC"/>
         </w:rPr>
-        <w:t xml:space="preserve">6.2 实测性能（给老师看数字时用）</w:t>
+        <w:t>6.2 实测性能（给老师看数字时用）</w:t>
       </w:r>
     </w:p>
     <w:p>
@@ -3681,14 +3681,14 @@
           <w:bCs/>
           <w:color w:val="1F2937"/>
         </w:rPr>
-        <w:t xml:space="preserve">16 毫秒</w:t>
-      </w:r>
-      <w:r>
-        <w:rPr>
-          <w:rFonts w:ascii="PingFang SC" w:cs="PingFang SC" w:eastAsia="PingFang SC" w:hAnsi="PingFang SC"/>
-          <w:color w:val="1F2937"/>
-        </w:rPr>
-        <w:t xml:space="preserve">；授权域连数据库查委托链和撤销约 </w:t>
+        <w:t>16 毫秒</w:t>
+      </w:r>
+      <w:r>
+        <w:rPr>
+          <w:rFonts w:ascii="PingFang SC" w:cs="PingFang SC" w:eastAsia="PingFang SC" w:hAnsi="PingFang SC"/>
+          <w:color w:val="1F2937"/>
+        </w:rPr>
+        <w:t xml:space="preserve">；授权侧签名方连数据库查委托链和撤销约 </w:t>
       </w:r>
       <w:r>
         <w:rPr>
@@ -3697,7 +3697,7 @@
           <w:bCs/>
           <w:color w:val="1F2937"/>
         </w:rPr>
-        <w:t xml:space="preserve">26 毫秒</w:t>
+        <w:t>26 毫秒</w:t>
       </w:r>
       <w:r>
         <w:rPr>
@@ -3713,7 +3713,7 @@
           <w:bCs/>
           <w:color w:val="1F2937"/>
         </w:rPr>
-        <w:t xml:space="preserve">0.25 毫秒</w:t>
+        <w:t>0.25 毫秒</w:t>
       </w:r>
       <w:r>
         <w:rPr>
@@ -3729,7 +3729,7 @@
           <w:bCs/>
           <w:color w:val="1F2937"/>
         </w:rPr>
-        <w:t xml:space="preserve">23 毫秒</w:t>
+        <w:t>23 毫秒</w:t>
       </w:r>
       <w:r>
         <w:rPr>
@@ -3745,14 +3745,14 @@
           <w:bCs/>
           <w:color w:val="1F2937"/>
         </w:rPr>
-        <w:t xml:space="preserve">72 毫秒</w:t>
-      </w:r>
-      <w:r>
-        <w:rPr>
-          <w:rFonts w:ascii="PingFang SC" w:cs="PingFang SC" w:eastAsia="PingFang SC" w:hAnsi="PingFang SC"/>
-          <w:color w:val="1F2937"/>
-        </w:rPr>
-        <w:t xml:space="preserve">。</w:t>
+        <w:t>72 毫秒</w:t>
+      </w:r>
+      <w:r>
+        <w:rPr>
+          <w:rFonts w:ascii="PingFang SC" w:cs="PingFang SC" w:eastAsia="PingFang SC" w:hAnsi="PingFang SC"/>
+          <w:color w:val="1F2937"/>
+        </w:rPr>
+        <w:t>。</w:t>
       </w:r>
     </w:p>
     <w:p>
@@ -3766,14 +3766,14 @@
           <w:bCs/>
           <w:color w:val="1F2937"/>
         </w:rPr>
-        <w:t xml:space="preserve">怎么解释"比单方签名慢很多"</w:t>
-      </w:r>
-      <w:r>
-        <w:rPr>
-          <w:rFonts w:ascii="PingFang SC" w:cs="PingFang SC" w:eastAsia="PingFang SC" w:hAnsi="PingFang SC"/>
-          <w:color w:val="1F2937"/>
-        </w:rPr>
-        <w:t xml:space="preserve">：共签部分是 Python 写的原型，又跑在仿真环境里，所以慢；而且它是在一次几十毫秒的受理流程中多出来的十几毫秒，换成原生实现还能大幅降低。不要用这些数字说"性能优于谁"。</w:t>
+        <w:t>怎么解释"比单方签名慢很多"</w:t>
+      </w:r>
+      <w:r>
+        <w:rPr>
+          <w:rFonts w:ascii="PingFang SC" w:cs="PingFang SC" w:eastAsia="PingFang SC" w:hAnsi="PingFang SC"/>
+          <w:color w:val="1F2937"/>
+        </w:rPr>
+        <w:t>：共签部分是 Python 写的原型，又跑在仿真环境里，所以慢；而且它是在一次几十毫秒的受理流程中多出来的十几毫秒，换成原生实现还能大幅降低。不要用这些数字说"性能优于谁"。</w:t>
       </w:r>
     </w:p>
     <w:p>
@@ -3785,7 +3785,7 @@
         <w:rPr>
           <w:rFonts w:ascii="PingFang SC" w:cs="PingFang SC" w:eastAsia="PingFang SC" w:hAnsi="PingFang SC"/>
         </w:rPr>
-        <w:t xml:space="preserve">6.3 还没做完、要主动说的</w:t>
+        <w:t>6.3 还没做完、要主动说的</w:t>
       </w:r>
     </w:p>
     <w:p>
@@ -3802,7 +3802,7 @@
           <w:rFonts w:ascii="PingFang SC" w:cs="PingFang SC" w:eastAsia="PingFang SC" w:hAnsi="PingFang SC"/>
           <w:color w:val="1F2937"/>
         </w:rPr>
-        <w:t xml:space="preserve">只做到两方（n=2），推广到三方还没做；安全模型是半诚实。</w:t>
+        <w:t>只做到两方（n=2），推广到三方还没做；安全模型是半诚实。</w:t>
       </w:r>
     </w:p>
     <w:p>
@@ -3819,7 +3819,7 @@
           <w:rFonts w:ascii="PingFang SC" w:cs="PingFang SC" w:eastAsia="PingFang SC" w:hAnsi="PingFang SC"/>
           <w:color w:val="1F2937"/>
         </w:rPr>
-        <w:t xml:space="preserve">两个域在同一台电脑上，靠不同进程和只读数据库账号隔离，不是真正分开的机构。</w:t>
+        <w:t>两方在同一台电脑上，靠不同进程和只读数据库账号隔离，不是真正分开的机构。</w:t>
       </w:r>
     </w:p>
     <w:p>
@@ -3853,7 +3853,7 @@
           <w:rFonts w:ascii="PingFang SC" w:cs="PingFang SC" w:eastAsia="PingFang SC" w:hAnsi="PingFang SC"/>
           <w:color w:val="1F2937"/>
         </w:rPr>
-        <w:t xml:space="preserve">x402 的链上付款签名仍是以太坊格式，不是国密；只用本地测试链。</w:t>
+        <w:t>x402 的链上付款签名仍是以太坊格式，不是国密；只用本地测试链。</w:t>
       </w:r>
     </w:p>
     <w:p>
@@ -3865,7 +3865,7 @@
         <w:rPr>
           <w:rFonts w:ascii="PingFang SC" w:cs="PingFang SC" w:eastAsia="PingFang SC" w:hAnsi="PingFang SC"/>
         </w:rPr>
-        <w:t xml:space="preserve">6.4 我们解决了什么问题</w:t>
+        <w:t>6.4 我们解决了什么问题</w:t>
       </w:r>
     </w:p>
     <w:p>
@@ -3877,7 +3877,7 @@
           <w:rFonts w:ascii="PingFang SC" w:cs="PingFang SC" w:eastAsia="PingFang SC" w:hAnsi="PingFang SC"/>
           <w:color w:val="1F2937"/>
         </w:rPr>
-        <w:t xml:space="preserve">上一版我们自己发现：门限签名方并不检查授权状态、付款用另一把独立的钥匙、新增密码机制不是国密。这一版用"</w:t>
+        <w:t>上一版我们自己发现：门限签名方并不检查授权状态、付款用另一把独立的钥匙、新增密码机制不是国密。这一版用"</w:t>
       </w:r>
       <w:r>
         <w:rPr>
@@ -3886,14 +3886,14 @@
           <w:bCs/>
           <w:color w:val="1F2937"/>
         </w:rPr>
-        <w:t xml:space="preserve">授权即密钥</w:t>
-      </w:r>
-      <w:r>
-        <w:rPr>
-          <w:rFonts w:ascii="PingFang SC" w:cs="PingFang SC" w:eastAsia="PingFang SC" w:hAnsi="PingFang SC"/>
-          <w:color w:val="1F2937"/>
-        </w:rPr>
-        <w:t xml:space="preserve">"把这三个问题一起改了：签名方（授权域）必须自己查清楚委托链、撤销和预算才肯出份额；全部采用国密 SM2，产出的签名任何标准国密库都能验；钥匙两方交互生成，不需要可信分发者；单独一个域被攻破，签不出有效的下单凭据。</w:t>
+        <w:t>先查授权再签名</w:t>
+      </w:r>
+      <w:r>
+        <w:rPr>
+          <w:rFonts w:ascii="PingFang SC" w:cs="PingFang SC" w:eastAsia="PingFang SC" w:hAnsi="PingFang SC"/>
+          <w:color w:val="1F2937"/>
+        </w:rPr>
+        <w:t>"把这三个问题一起改了：签名方（授权侧签名方）必须自己查清楚委托链、撤销和预算才肯出份额；全部采用国密 SM2，产出的签名任何标准国密库都能验；钥匙两方交互生成，不需要可信分发者；单独一方被攻破，签不出有效的下单凭据。</w:t>
       </w:r>
     </w:p>
     <w:p>
@@ -3905,7 +3905,7 @@
         <w:rPr>
           <w:rFonts w:ascii="PingFang SC" w:cs="PingFang SC" w:eastAsia="PingFang SC" w:hAnsi="PingFang SC"/>
         </w:rPr>
-        <w:t xml:space="preserve">6.5 下一步最重要的改进：授权状态承诺</w:t>
+        <w:t>6.5 下一步最重要的改进：撤销名单快照</w:t>
       </w:r>
     </w:p>
     <w:p>
@@ -3919,14 +3919,14 @@
           <w:bCs/>
           <w:color w:val="1F2937"/>
         </w:rPr>
-        <w:t xml:space="preserve">要堵的漏洞</w:t>
-      </w:r>
-      <w:r>
-        <w:rPr>
-          <w:rFonts w:ascii="PingFang SC" w:cs="PingFang SC" w:eastAsia="PingFang SC" w:hAnsi="PingFang SC"/>
-          <w:color w:val="1F2937"/>
-        </w:rPr>
-        <w:t xml:space="preserve">：现在如果用户在签名之后才撤销，只有网关会去查。网关要是被攻破，那张已经签出来的批准在有效期内还能用。</w:t>
+        <w:t>要堵的漏洞</w:t>
+      </w:r>
+      <w:r>
+        <w:rPr>
+          <w:rFonts w:ascii="PingFang SC" w:cs="PingFang SC" w:eastAsia="PingFang SC" w:hAnsi="PingFang SC"/>
+          <w:color w:val="1F2937"/>
+        </w:rPr>
+        <w:t>：现在如果用户在签名之后才撤销，只有网关会去查。网关要是被攻破，那张已经签出来的批准在有效期内还能用。</w:t>
       </w:r>
     </w:p>
     <w:p>
@@ -3940,14 +3940,14 @@
           <w:bCs/>
           <w:color w:val="1F2937"/>
         </w:rPr>
-        <w:t xml:space="preserve">打个比方</w:t>
-      </w:r>
-      <w:r>
-        <w:rPr>
-          <w:rFonts w:ascii="PingFang SC" w:cs="PingFang SC" w:eastAsia="PingFang SC" w:hAnsi="PingFang SC"/>
-          <w:color w:val="1F2937"/>
-        </w:rPr>
-        <w:t xml:space="preserve">：授权服务器每隔几秒公布一次"挂失名单"的指纹（默克尔根），并盖上国密章、编上号（纪元号）。授权域签名时，把"我是按第几号名单查的"写进签名内容里，并附上"这几张卡不在名单上"的证明。下单服务和收款方拿到签名，自己就能核对：名单号太旧就拒绝。整个过程不用去问授权服务器的数据库。</w:t>
+        <w:t>打个比方</w:t>
+      </w:r>
+      <w:r>
+        <w:rPr>
+          <w:rFonts w:ascii="PingFang SC" w:cs="PingFang SC" w:eastAsia="PingFang SC" w:hAnsi="PingFang SC"/>
+          <w:color w:val="1F2937"/>
+        </w:rPr>
+        <w:t>：授权服务器每隔几秒公布一次"挂失名单"的指纹（默克尔根），并盖上国密章、编上号（纪元号）。授权侧签名方签名时，把"我是按第几号名单查的"写进签名内容里，并附上"这几张卡不在名单上"的证明。下单服务和收款方拿到签名，自己就能核对：名单号太旧就拒绝。整个过程不用去问授权服务器的数据库。</w:t>
       </w:r>
     </w:p>
     <w:p>
@@ -3961,14 +3961,14 @@
           <w:bCs/>
           <w:color w:val="1F2937"/>
         </w:rPr>
-        <w:t xml:space="preserve">好处</w:t>
-      </w:r>
-      <w:r>
-        <w:rPr>
-          <w:rFonts w:ascii="PingFang SC" w:cs="PingFang SC" w:eastAsia="PingFang SC" w:hAnsi="PingFang SC"/>
-          <w:color w:val="1F2937"/>
-        </w:rPr>
-        <w:t xml:space="preserve">：签名后撤销能钻的空子，从"整个批准有效期"缩短到"几个公布周期"，而且任何人都能离线核对。</w:t>
+        <w:t>好处</w:t>
+      </w:r>
+      <w:r>
+        <w:rPr>
+          <w:rFonts w:ascii="PingFang SC" w:cs="PingFang SC" w:eastAsia="PingFang SC" w:hAnsi="PingFang SC"/>
+          <w:color w:val="1F2937"/>
+        </w:rPr>
+        <w:t>：签名后撤销能钻的空子，从"整个批准有效期"缩短到"几个公布周期"，而且任何人都能离线核对。</w:t>
       </w:r>
       <w:r>
         <w:rPr>
@@ -3977,14 +3977,14 @@
           <w:bCs/>
           <w:color w:val="1F2937"/>
         </w:rPr>
-        <w:t xml:space="preserve">这是设计，还没实现</w:t>
-      </w:r>
-      <w:r>
-        <w:rPr>
-          <w:rFonts w:ascii="PingFang SC" w:cs="PingFang SC" w:eastAsia="PingFang SC" w:hAnsi="PingFang SC"/>
-          <w:color w:val="1F2937"/>
-        </w:rPr>
-        <w:t xml:space="preserve">，计划 10 月 23 日以后优先做。</w:t>
+        <w:t>这是设计，还没实现</w:t>
+      </w:r>
+      <w:r>
+        <w:rPr>
+          <w:rFonts w:ascii="PingFang SC" w:cs="PingFang SC" w:eastAsia="PingFang SC" w:hAnsi="PingFang SC"/>
+          <w:color w:val="1F2937"/>
+        </w:rPr>
+        <w:t>，计划 10 月 23 日以后优先做。</w:t>
       </w:r>
     </w:p>
     <w:p>
@@ -3996,7 +3996,7 @@
         <w:rPr>
           <w:rFonts w:ascii="PingFang SC" w:cs="PingFang SC" w:eastAsia="PingFang SC" w:hAnsi="PingFang SC"/>
         </w:rPr>
-        <w:t xml:space="preserve">6.6 接下来的计划</w:t>
+        <w:t>6.6 接下来的计划</w:t>
       </w:r>
     </w:p>
     <w:tbl>
@@ -4043,7 +4043,7 @@
                 <w:sz w:val="19"/>
                 <w:szCs w:val="19"/>
               </w:rPr>
-              <w:t xml:space="preserve">时间</w:t>
+              <w:t>时间</w:t>
             </w:r>
           </w:p>
         </w:tc>
@@ -4071,7 +4071,7 @@
                 <w:sz w:val="19"/>
                 <w:szCs w:val="19"/>
               </w:rPr>
-              <w:t xml:space="preserve">要完成的事</w:t>
+              <w:t>要完成的事</w:t>
             </w:r>
           </w:p>
         </w:tc>
@@ -4100,7 +4100,7 @@
                 <w:sz w:val="19"/>
                 <w:szCs w:val="19"/>
               </w:rPr>
-              <w:t xml:space="preserve">10 月 18–22 日</w:t>
+              <w:t>10 月 18–22 日</w:t>
             </w:r>
           </w:p>
         </w:tc>
@@ -4127,7 +4127,7 @@
                 <w:sz w:val="19"/>
                 <w:szCs w:val="19"/>
               </w:rPr>
-              <w:t xml:space="preserve">按新主线重写复赛论文（图表和实测数据已备好）；把代码正式提交保存</w:t>
+              <w:t>按新主线重写复赛论文（图表和实测数据已备好）；把代码正式提交保存</w:t>
             </w:r>
           </w:p>
         </w:tc>
@@ -4156,7 +4156,7 @@
                 <w:sz w:val="19"/>
                 <w:szCs w:val="19"/>
               </w:rPr>
-              <w:t xml:space="preserve">10 月 23 日–11 月 8 日</w:t>
+              <w:t>10 月 23 日–11 月 8 日</w:t>
             </w:r>
           </w:p>
         </w:tc>
@@ -4183,18 +4183,18 @@
                 <w:sz w:val="19"/>
                 <w:szCs w:val="19"/>
               </w:rPr>
-              <w:t xml:space="preserve">授权状态承诺（最重要）</w:t>
-            </w:r>
-            <w:r>
-              <w:rPr>
-                <w:rFonts w:ascii="PingFang SC" w:cs="PingFang SC" w:eastAsia="PingFang SC" w:hAnsi="PingFang SC"/>
-                <w:b w:val="false"/>
-                <w:bCs w:val="false"/>
-                <w:color w:val="1F2937"/>
-                <w:sz w:val="19"/>
-                <w:szCs w:val="19"/>
-              </w:rPr>
-              <w:t>：堵上"签名之后才撤销"的漏洞；推广到三个域（授权域必选）。A 同时开始接入真实大模型代理（DeepSeek），先让执行代理跑通一笔正常采购</w:t>
+              <w:t>撤销名单快照（最重要）</w:t>
+            </w:r>
+            <w:r>
+              <w:rPr>
+                <w:rFonts w:ascii="PingFang SC" w:cs="PingFang SC" w:eastAsia="PingFang SC" w:hAnsi="PingFang SC"/>
+                <w:b w:val="false"/>
+                <w:bCs w:val="false"/>
+                <w:color w:val="1F2937"/>
+                <w:sz w:val="19"/>
+                <w:szCs w:val="19"/>
+              </w:rPr>
+              <w:t>：堵上"签名之后才撤销"的漏洞；推广到三方（授权侧签名方必选）。A 同时开始接入真实大模型代理（DeepSeek），先让下单代理跑通一笔正常采购</w:t>
             </w:r>
           </w:p>
         </w:tc>
@@ -4223,7 +4223,7 @@
                 <w:sz w:val="19"/>
                 <w:szCs w:val="19"/>
               </w:rPr>
-              <w:t xml:space="preserve">11 月 9 日–11 月 20 日</w:t>
+              <w:t>11 月 9 日–11 月 20 日</w:t>
             </w:r>
           </w:p>
         </w:tc>
@@ -4279,7 +4279,7 @@
                 <w:sz w:val="19"/>
                 <w:szCs w:val="19"/>
               </w:rPr>
-              <w:t xml:space="preserve">11 月 26–28 日</w:t>
+              <w:t>11 月 26–28 日</w:t>
             </w:r>
           </w:p>
         </w:tc>
@@ -4306,7 +4306,7 @@
                 <w:sz w:val="19"/>
                 <w:szCs w:val="19"/>
               </w:rPr>
-              <w:t xml:space="preserve">决赛（湖南长沙，现场演示与答辩）</w:t>
+              <w:t>决赛（湖南长沙，现场演示与答辩）</w:t>
             </w:r>
           </w:p>
         </w:tc>
@@ -4333,14 +4333,14 @@
           <w:bCs/>
           <w:color w:val="1F2937"/>
         </w:rPr>
-        <w:t xml:space="preserve">怎么向老师表述</w:t>
-      </w:r>
-      <w:r>
-        <w:rPr>
-          <w:rFonts w:ascii="PingFang SC" w:cs="PingFang SC" w:eastAsia="PingFang SC" w:hAnsi="PingFang SC"/>
-          <w:color w:val="1F2937"/>
-        </w:rPr>
-        <w:t>："上次汇报后我们针对门限和支付结合生硬的问题做了重构，两方版本已经实现并验证。接下来想往授权状态承诺、三方和形式化验证推进；同时会接入真实大模型代理做提示注入实验，用实测数据说明'模型可以被骗，但越权的事做不成'。想听听老师的意见。"</w:t>
+        <w:t>怎么向老师表述</w:t>
+      </w:r>
+      <w:r>
+        <w:rPr>
+          <w:rFonts w:ascii="PingFang SC" w:cs="PingFang SC" w:eastAsia="PingFang SC" w:hAnsi="PingFang SC"/>
+          <w:color w:val="1F2937"/>
+        </w:rPr>
+        <w:t>："上次汇报后我们针对门限和支付结合生硬的问题做了重构，两方版本已经实现并验证。接下来想往撤销名单快照、三方和形式化验证推进；同时会接入真实大模型代理做提示注入实验，用实测数据说明'模型可以被骗，但越权的事做不成'。想听听老师的意见。"</w:t>
       </w:r>
     </w:p>
     <w:p>
@@ -4352,7 +4352,412 @@
         <w:rPr>
           <w:rFonts w:ascii="PingFang SC" w:cs="PingFang SC" w:eastAsia="PingFang SC" w:hAnsi="PingFang SC"/>
         </w:rPr>
-        <w:t xml:space="preserve">7. 名词小词典（白话版）</w:t>
+        <w:t>6.7 和现有方案比</w:t>
+      </w:r>
+    </w:p>
+    <w:tbl>
+      <w:tblPr>
+        <w:tblW w:type="dxa" w:w="9026"/>
+        <w:tblBorders>
+          <w:top w:val="single" w:color="auto" w:sz="4"/>
+          <w:left w:val="single" w:color="auto" w:sz="4"/>
+          <w:bottom w:val="single" w:color="auto" w:sz="4"/>
+          <w:right w:val="single" w:color="auto" w:sz="4"/>
+          <w:insideH w:val="single" w:color="auto" w:sz="4"/>
+          <w:insideV w:val="single" w:color="auto" w:sz="4"/>
+        </w:tblBorders>
+      </w:tblPr>
+      <w:tblGrid>
+        <w:gridCol w:w="1500"/>
+        <w:gridCol w:w="2200"/>
+        <w:gridCol w:w="5326"/>
+      </w:tblGrid>
+      <w:tr>
+        <w:trPr>
+          <w:tblHeader/>
+        </w:trPr>
+        <w:tc>
+          <w:tcPr>
+            <w:tcW w:type="dxa" w:w="1500"/>
+            <w:shd w:fill="E8EDF7" w:color="auto" w:val="clear"/>
+            <w:tcMar>
+              <w:top w:type="dxa" w:w="80"/>
+              <w:left w:type="dxa" w:w="110"/>
+              <w:bottom w:type="dxa" w:w="80"/>
+              <w:right w:type="dxa" w:w="110"/>
+            </w:tcMar>
+          </w:tcPr>
+          <w:p>
+            <w:pPr>
+              <w:spacing w:after="40" w:line="280"/>
+            </w:pPr>
+            <w:r>
+              <w:rPr>
+                <w:rFonts w:ascii="PingFang SC" w:cs="PingFang SC" w:eastAsia="PingFang SC" w:hAnsi="PingFang SC"/>
+                <w:b/>
+                <w:bCs/>
+                <w:color w:val="1F2937"/>
+                <w:sz w:val="19"/>
+                <w:szCs w:val="19"/>
+              </w:rPr>
+              <w:t>现有方案类型</w:t>
+            </w:r>
+          </w:p>
+        </w:tc>
+        <w:tc>
+          <w:tcPr>
+            <w:tcW w:type="dxa" w:w="2200"/>
+            <w:shd w:fill="E8EDF7" w:color="auto" w:val="clear"/>
+            <w:tcMar>
+              <w:top w:type="dxa" w:w="80"/>
+              <w:left w:type="dxa" w:w="110"/>
+              <w:bottom w:type="dxa" w:w="80"/>
+              <w:right w:type="dxa" w:w="110"/>
+            </w:tcMar>
+          </w:tcPr>
+          <w:p>
+            <w:pPr>
+              <w:spacing w:after="40" w:line="280"/>
+            </w:pPr>
+            <w:r>
+              <w:rPr>
+                <w:rFonts w:ascii="PingFang SC" w:cs="PingFang SC" w:eastAsia="PingFang SC" w:hAnsi="PingFang SC"/>
+                <w:b/>
+                <w:bCs/>
+                <w:color w:val="1F2937"/>
+                <w:sz w:val="19"/>
+                <w:szCs w:val="19"/>
+              </w:rPr>
+              <w:t>通常做法与来源</w:t>
+            </w:r>
+          </w:p>
+        </w:tc>
+        <w:tc>
+          <w:tcPr>
+            <w:tcW w:type="dxa" w:w="5326"/>
+            <w:shd w:fill="E8EDF7" w:color="auto" w:val="clear"/>
+            <w:tcMar>
+              <w:top w:type="dxa" w:w="80"/>
+              <w:left w:type="dxa" w:w="110"/>
+              <w:bottom w:type="dxa" w:w="80"/>
+              <w:right w:type="dxa" w:w="110"/>
+            </w:tcMar>
+          </w:tcPr>
+          <w:p>
+            <w:pPr>
+              <w:spacing w:after="40" w:line="280"/>
+            </w:pPr>
+            <w:r>
+              <w:rPr>
+                <w:rFonts w:ascii="PingFang SC" w:cs="PingFang SC" w:eastAsia="PingFang SC" w:hAnsi="PingFang SC"/>
+                <w:b/>
+                <w:bCs/>
+                <w:color w:val="1F2937"/>
+                <w:sz w:val="19"/>
+                <w:szCs w:val="19"/>
+              </w:rPr>
+              <w:t>本项目的不同</w:t>
+            </w:r>
+          </w:p>
+        </w:tc>
+      </w:tr>
+      <w:tr>
+        <w:tc>
+          <w:tcPr>
+            <w:tcW w:type="dxa" w:w="1500"/>
+            <w:tcMar>
+              <w:top w:type="dxa" w:w="80"/>
+              <w:left w:type="dxa" w:w="110"/>
+              <w:bottom w:type="dxa" w:w="80"/>
+              <w:right w:type="dxa" w:w="110"/>
+            </w:tcMar>
+          </w:tcPr>
+          <w:p>
+            <w:pPr>
+              <w:spacing w:after="40" w:line="280"/>
+            </w:pPr>
+            <w:r>
+              <w:rPr>
+                <w:rFonts w:ascii="PingFang SC" w:cs="PingFang SC" w:eastAsia="PingFang SC" w:hAnsi="PingFang SC"/>
+                <w:b w:val="false"/>
+                <w:bCs w:val="false"/>
+                <w:color w:val="1F2937"/>
+                <w:sz w:val="19"/>
+                <w:szCs w:val="19"/>
+              </w:rPr>
+              <w:t>模型护栏</w:t>
+            </w:r>
+          </w:p>
+        </w:tc>
+        <w:tc>
+          <w:tcPr>
+            <w:tcW w:type="dxa" w:w="2200"/>
+            <w:tcMar>
+              <w:top w:type="dxa" w:w="80"/>
+              <w:left w:type="dxa" w:w="110"/>
+              <w:bottom w:type="dxa" w:w="80"/>
+              <w:right w:type="dxa" w:w="110"/>
+            </w:tcMar>
+          </w:tcPr>
+          <w:p>
+            <w:pPr>
+              <w:spacing w:after="40" w:line="280"/>
+            </w:pPr>
+            <w:r>
+              <w:rPr>
+                <w:rFonts w:ascii="PingFang SC" w:cs="PingFang SC" w:eastAsia="PingFang SC" w:hAnsi="PingFang SC"/>
+                <w:b w:val="false"/>
+                <w:bCs w:val="false"/>
+                <w:color w:val="1F2937"/>
+                <w:sz w:val="19"/>
+                <w:szCs w:val="19"/>
+              </w:rPr>
+              <w:t>Llama Guard 2 对输入输出作安全分类，阈值与模型均有局限 [1]</w:t>
+            </w:r>
+          </w:p>
+        </w:tc>
+        <w:tc>
+          <w:tcPr>
+            <w:tcW w:type="dxa" w:w="5326"/>
+            <w:tcMar>
+              <w:top w:type="dxa" w:w="80"/>
+              <w:left w:type="dxa" w:w="110"/>
+              <w:bottom w:type="dxa" w:w="80"/>
+              <w:right w:type="dxa" w:w="110"/>
+            </w:tcMar>
+          </w:tcPr>
+          <w:p>
+            <w:pPr>
+              <w:spacing w:after="40" w:line="280"/>
+            </w:pPr>
+            <w:r>
+              <w:rPr>
+                <w:rFonts w:ascii="PingFang SC" w:cs="PingFang SC" w:eastAsia="PingFang SC" w:hAnsi="PingFang SC"/>
+                <w:b w:val="false"/>
+                <w:bCs w:val="false"/>
+                <w:color w:val="1F2937"/>
+                <w:sz w:val="19"/>
+                <w:szCs w:val="19"/>
+              </w:rPr>
+              <w:t>检查授权边界，不要求先识别攻击；代理仍为确定性脚本</w:t>
+            </w:r>
+          </w:p>
+        </w:tc>
+      </w:tr>
+      <w:tr>
+        <w:tc>
+          <w:tcPr>
+            <w:tcW w:type="dxa" w:w="1500"/>
+            <w:tcMar>
+              <w:top w:type="dxa" w:w="80"/>
+              <w:left w:type="dxa" w:w="110"/>
+              <w:bottom w:type="dxa" w:w="80"/>
+              <w:right w:type="dxa" w:w="110"/>
+            </w:tcMar>
+          </w:tcPr>
+          <w:p>
+            <w:pPr>
+              <w:spacing w:after="40" w:line="280"/>
+            </w:pPr>
+            <w:r>
+              <w:rPr>
+                <w:rFonts w:ascii="PingFang SC" w:cs="PingFang SC" w:eastAsia="PingFang SC" w:hAnsi="PingFang SC"/>
+                <w:b w:val="false"/>
+                <w:bCs w:val="false"/>
+                <w:color w:val="1F2937"/>
+                <w:sz w:val="19"/>
+                <w:szCs w:val="19"/>
+              </w:rPr>
+              <w:t>OAuth</w:t>
+            </w:r>
+          </w:p>
+        </w:tc>
+        <w:tc>
+          <w:tcPr>
+            <w:tcW w:type="dxa" w:w="2200"/>
+            <w:tcMar>
+              <w:top w:type="dxa" w:w="80"/>
+              <w:left w:type="dxa" w:w="110"/>
+              <w:bottom w:type="dxa" w:w="80"/>
+              <w:right w:type="dxa" w:w="110"/>
+            </w:tcMar>
+          </w:tcPr>
+          <w:p>
+            <w:pPr>
+              <w:spacing w:after="40" w:line="280"/>
+            </w:pPr>
+            <w:r>
+              <w:rPr>
+                <w:rFonts w:ascii="PingFang SC" w:cs="PingFang SC" w:eastAsia="PingFang SC" w:hAnsi="PingFang SC"/>
+                <w:b w:val="false"/>
+                <w:bCs w:val="false"/>
+                <w:color w:val="1F2937"/>
+                <w:sz w:val="19"/>
+                <w:szCs w:val="19"/>
+              </w:rPr>
+              <w:t>Bearer 持有即可使用 [2]；DPoP 已支持令牌绑定密钥 [3]</w:t>
+            </w:r>
+          </w:p>
+        </w:tc>
+        <w:tc>
+          <w:tcPr>
+            <w:tcW w:type="dxa" w:w="5326"/>
+            <w:tcMar>
+              <w:top w:type="dxa" w:w="80"/>
+              <w:left w:type="dxa" w:w="110"/>
+              <w:bottom w:type="dxa" w:w="80"/>
+              <w:right w:type="dxa" w:w="110"/>
+            </w:tcMar>
+          </w:tcPr>
+          <w:p>
+            <w:pPr>
+              <w:spacing w:after="40" w:line="280"/>
+            </w:pPr>
+            <w:r>
+              <w:rPr>
+                <w:rFonts w:ascii="PingFang SC" w:cs="PingFang SC" w:eastAsia="PingFang SC" w:hAnsi="PingFang SC"/>
+                <w:b w:val="false"/>
+                <w:bCs w:val="false"/>
+                <w:color w:val="1F2937"/>
+                <w:sz w:val="19"/>
+                <w:szCs w:val="19"/>
+              </w:rPr>
+              <w:t>组合请求体绑定、委托降权与祖先共享预算，并非发明持有者证明</w:t>
+            </w:r>
+          </w:p>
+        </w:tc>
+      </w:tr>
+      <w:tr>
+        <w:tc>
+          <w:tcPr>
+            <w:tcW w:type="dxa" w:w="1500"/>
+            <w:tcMar>
+              <w:top w:type="dxa" w:w="80"/>
+              <w:left w:type="dxa" w:w="110"/>
+              <w:bottom w:type="dxa" w:w="80"/>
+              <w:right w:type="dxa" w:w="110"/>
+            </w:tcMar>
+          </w:tcPr>
+          <w:p>
+            <w:pPr>
+              <w:spacing w:after="40" w:line="280"/>
+            </w:pPr>
+            <w:r>
+              <w:rPr>
+                <w:rFonts w:ascii="PingFang SC" w:cs="PingFang SC" w:eastAsia="PingFang SC" w:hAnsi="PingFang SC"/>
+                <w:b w:val="false"/>
+                <w:bCs w:val="false"/>
+                <w:color w:val="1F2937"/>
+                <w:sz w:val="19"/>
+                <w:szCs w:val="19"/>
+              </w:rPr>
+              <w:t>代理支付协议</w:t>
+            </w:r>
+          </w:p>
+        </w:tc>
+        <w:tc>
+          <w:tcPr>
+            <w:tcW w:type="dxa" w:w="2200"/>
+            <w:tcMar>
+              <w:top w:type="dxa" w:w="80"/>
+              <w:left w:type="dxa" w:w="110"/>
+              <w:bottom w:type="dxa" w:w="80"/>
+              <w:right w:type="dxa" w:w="110"/>
+            </w:tcMar>
+          </w:tcPr>
+          <w:p>
+            <w:pPr>
+              <w:spacing w:after="40" w:line="280"/>
+            </w:pPr>
+            <w:r>
+              <w:rPr>
+                <w:rFonts w:ascii="PingFang SC" w:cs="PingFang SC" w:eastAsia="PingFang SC" w:hAnsi="PingFang SC"/>
+                <w:b w:val="false"/>
+                <w:bCs w:val="false"/>
+                <w:color w:val="1F2937"/>
+                <w:sz w:val="19"/>
+                <w:szCs w:val="19"/>
+              </w:rPr>
+              <w:t>AP2 用用户意图及付款授权约束交易，已有金额等约束 [4]</w:t>
+            </w:r>
+          </w:p>
+        </w:tc>
+        <w:tc>
+          <w:tcPr>
+            <w:tcW w:type="dxa" w:w="5326"/>
+            <w:tcMar>
+              <w:top w:type="dxa" w:w="80"/>
+              <w:left w:type="dxa" w:w="110"/>
+              <w:bottom w:type="dxa" w:w="80"/>
+              <w:right w:type="dxa" w:w="110"/>
+            </w:tcMar>
+          </w:tcPr>
+          <w:p>
+            <w:pPr>
+              <w:spacing w:after="40" w:line="280"/>
+            </w:pPr>
+            <w:r>
+              <w:rPr>
+                <w:rFonts w:ascii="PingFang SC" w:cs="PingFang SC" w:eastAsia="PingFang SC" w:hAnsi="PingFang SC"/>
+                <w:b w:val="false"/>
+                <w:bCs w:val="false"/>
+                <w:color w:val="1F2937"/>
+                <w:sz w:val="19"/>
+                <w:szCs w:val="19"/>
+              </w:rPr>
+              <w:t>本原型将委托链、共享预算和 SM2 协同批准接入本地 x402 流程</w:t>
+            </w:r>
+          </w:p>
+        </w:tc>
+      </w:tr>
+    </w:tbl>
+    <w:p>
+      <w:pPr>
+        <w:spacing w:after="120" w:line="320"/>
+      </w:pPr>
+      <w:r>
+        <w:rPr>
+          <w:rFonts w:ascii="PingFang SC" w:cs="PingFang SC" w:eastAsia="PingFang SC" w:hAnsi="PingFang SC"/>
+          <w:b/>
+          <w:bCs/>
+          <w:color w:val="1F2937"/>
+        </w:rPr>
+        <w:t>来源</w:t>
+      </w:r>
+      <w:r>
+        <w:rPr>
+          <w:rFonts w:ascii="PingFang SC" w:cs="PingFang SC" w:eastAsia="PingFang SC" w:hAnsi="PingFang SC"/>
+          <w:color w:val="1F2937"/>
+        </w:rPr>
+        <w:t>（2026-10-19）：[1] github.com/meta-llama/PurpleL</w:t>
+      </w:r>
+      <w:r>
+        <w:rPr>
+          <w:rFonts w:ascii="PingFang SC" w:cs="PingFang SC" w:eastAsia="PingFang SC" w:hAnsi="PingFang SC"/>
+          <w:b/>
+          <w:bCs/>
+          <w:color w:val="1F2937"/>
+        </w:rPr>
+        <w:t>lama/blob</w:t>
+      </w:r>
+      <w:r>
+        <w:rPr>
+          <w:rFonts w:ascii="PingFang SC" w:cs="PingFang SC" w:eastAsia="PingFang SC" w:hAnsi="PingFang SC"/>
+          <w:color w:val="1F2937"/>
+        </w:rPr>
+        <w:t>/main/Llama-Guard2/MODEL_CARD.md；[2] RFC 6750；[3] RFC 9449；[4] ap2-protocol.org/ap2/specification/。本项目仍是半诚实、n=2、同主机原型，签名后撤销存在窗口。</w:t>
+      </w:r>
+    </w:p>
+    <w:p>
+      <w:pPr>
+        <w:pStyle w:val="Heading1"/>
+        <w:spacing w:after="160" w:before="360"/>
+      </w:pPr>
+      <w:r>
+        <w:rPr>
+          <w:rFonts w:ascii="PingFang SC" w:cs="PingFang SC" w:eastAsia="PingFang SC" w:hAnsi="PingFang SC"/>
+        </w:rPr>
+        <w:t>7. 名词小词典（白话版）</w:t>
       </w:r>
     </w:p>
     <w:tbl>
@@ -4399,7 +4804,7 @@
                 <w:sz w:val="19"/>
                 <w:szCs w:val="19"/>
               </w:rPr>
-              <w:t xml:space="preserve">名词</w:t>
+              <w:t>名词</w:t>
             </w:r>
           </w:p>
         </w:tc>
@@ -4427,7 +4832,7 @@
                 <w:sz w:val="19"/>
                 <w:szCs w:val="19"/>
               </w:rPr>
-              <w:t xml:space="preserve">白话解释</w:t>
+              <w:t>白话解释</w:t>
             </w:r>
           </w:p>
         </w:tc>
@@ -4456,7 +4861,7 @@
                 <w:sz w:val="19"/>
                 <w:szCs w:val="19"/>
               </w:rPr>
-              <w:t xml:space="preserve">令牌（Access Token）</w:t>
+              <w:t>令牌（Access Token）</w:t>
             </w:r>
           </w:p>
         </w:tc>
@@ -4483,7 +4888,7 @@
                 <w:sz w:val="19"/>
                 <w:szCs w:val="19"/>
               </w:rPr>
-              <w:t xml:space="preserve">门禁卡。上面写着持卡人、能干什么、能花多少钱、什么时候过期，由授权服务器签名防伪。</w:t>
+              <w:t>门禁卡。上面写着持卡人、能干什么、能花多少钱、什么时候过期，由授权服务器签名防伪。</w:t>
             </w:r>
           </w:p>
         </w:tc>
@@ -4512,7 +4917,7 @@
                 <w:sz w:val="19"/>
                 <w:szCs w:val="19"/>
               </w:rPr>
-              <w:t xml:space="preserve">私钥 / 公钥</w:t>
+              <w:t>私钥 / 公钥</w:t>
             </w:r>
           </w:p>
         </w:tc>
@@ -4539,7 +4944,7 @@
                 <w:sz w:val="19"/>
                 <w:szCs w:val="19"/>
               </w:rPr>
-              <w:t xml:space="preserve">私钥像本人的印章，只有自己有；公钥像印章的样本，谁都能拿来比对"这个章是不是他盖的"。</w:t>
+              <w:t>私钥像本人的印章，只有自己有；公钥像印章的样本，谁都能拿来比对"这个章是不是他盖的"。</w:t>
             </w:r>
           </w:p>
         </w:tc>
@@ -4568,7 +4973,7 @@
                 <w:sz w:val="19"/>
                 <w:szCs w:val="19"/>
               </w:rPr>
-              <w:t xml:space="preserve">签名 / 验签</w:t>
+              <w:t>签名 / 验签</w:t>
             </w:r>
           </w:p>
         </w:tc>
@@ -4595,7 +5000,7 @@
                 <w:sz w:val="19"/>
                 <w:szCs w:val="19"/>
               </w:rPr>
-              <w:t xml:space="preserve">签名 = 用私钥盖章；验签 = 用公钥核对章是不是真的、内容有没有被改。</w:t>
+              <w:t>签名 = 用私钥盖章；验签 = 用公钥核对章是不是真的、内容有没有被改。</w:t>
             </w:r>
           </w:p>
         </w:tc>
@@ -4624,7 +5029,7 @@
                 <w:sz w:val="19"/>
                 <w:szCs w:val="19"/>
               </w:rPr>
-              <w:t xml:space="preserve">SM2 / SM3</w:t>
+              <w:t>SM2 / SM3</w:t>
             </w:r>
           </w:p>
         </w:tc>
@@ -4651,7 +5056,7 @@
                 <w:sz w:val="19"/>
                 <w:szCs w:val="19"/>
               </w:rPr>
-              <w:t xml:space="preserve">国家密码标准。SM2 用来签名，SM3 用来算"指纹"（摘要）。我们全系统的令牌和证明都用它们。</w:t>
+              <w:t>国家密码标准。SM2 用来签名，SM3 用来算"指纹"（摘要）。我们全系统的令牌和证明都用它们。</w:t>
             </w:r>
           </w:p>
         </w:tc>
@@ -4680,7 +5085,7 @@
                 <w:sz w:val="19"/>
                 <w:szCs w:val="19"/>
               </w:rPr>
-              <w:t xml:space="preserve">OAuth</w:t>
+              <w:t>OAuth</w:t>
             </w:r>
           </w:p>
         </w:tc>
@@ -4707,7 +5112,7 @@
                 <w:sz w:val="19"/>
                 <w:szCs w:val="19"/>
               </w:rPr>
-              <w:t xml:space="preserve">一套通用的"发门禁卡"规则，很多网站的"用微信登录"就基于它。</w:t>
+              <w:t>一套通用的"发门禁卡"规则，很多网站的"用微信登录"就基于它。</w:t>
             </w:r>
           </w:p>
         </w:tc>
@@ -4736,7 +5141,7 @@
                 <w:sz w:val="19"/>
                 <w:szCs w:val="19"/>
               </w:rPr>
-              <w:t xml:space="preserve">Token Exchange（令牌交换）</w:t>
+              <w:t>Token Exchange（令牌交换）</w:t>
             </w:r>
           </w:p>
         </w:tc>
@@ -4763,7 +5168,7 @@
                 <w:sz w:val="19"/>
                 <w:szCs w:val="19"/>
               </w:rPr>
-              <w:t xml:space="preserve">上级拿自己的卡去人事部换一张权限更小的卡给下级。</w:t>
+              <w:t>上级拿自己的卡去人事部换一张权限更小的卡给下级。</w:t>
             </w:r>
           </w:p>
         </w:tc>
@@ -4792,7 +5197,7 @@
                 <w:sz w:val="19"/>
                 <w:szCs w:val="19"/>
               </w:rPr>
-              <w:t xml:space="preserve">AGPoP / AG-Proof</w:t>
+              <w:t>请求证明</w:t>
             </w:r>
           </w:p>
         </w:tc>
@@ -4819,7 +5224,7 @@
                 <w:sz w:val="19"/>
                 <w:szCs w:val="19"/>
               </w:rPr>
-              <w:t xml:space="preserve">我们的"刷卡加按指纹"：每次请求除了出示令牌，还要用私钥对这次请求签一份证明。</w:t>
+              <w:t>我们的"刷卡加按指纹"：每次请求除了出示令牌，还要用私钥对这次请求签一份证明。</w:t>
             </w:r>
           </w:p>
         </w:tc>
@@ -4848,7 +5253,7 @@
                 <w:sz w:val="19"/>
                 <w:szCs w:val="19"/>
               </w:rPr>
-              <w:t xml:space="preserve">委托收窄</w:t>
+              <w:t>委托降权</w:t>
             </w:r>
           </w:p>
         </w:tc>
@@ -4875,7 +5280,7 @@
                 <w:sz w:val="19"/>
                 <w:szCs w:val="19"/>
               </w:rPr>
-              <w:t xml:space="preserve">转借出去的卡，权限只能更小，不能更大。</w:t>
+              <w:t>转借出去的卡，权限只能更小，不能更大。</w:t>
             </w:r>
           </w:p>
         </w:tc>
@@ -4904,7 +5309,7 @@
                 <w:sz w:val="19"/>
                 <w:szCs w:val="19"/>
               </w:rPr>
-              <w:t xml:space="preserve">撤销</w:t>
+              <w:t>撤销</w:t>
             </w:r>
           </w:p>
         </w:tc>
@@ -4931,7 +5336,7 @@
                 <w:sz w:val="19"/>
                 <w:szCs w:val="19"/>
               </w:rPr>
-              <w:t xml:space="preserve">挂失。挂失后旧卡再刷就会被拒绝。</w:t>
+              <w:t>挂失。挂失后旧卡再刷就会被拒绝。</w:t>
             </w:r>
           </w:p>
         </w:tc>
@@ -4960,7 +5365,7 @@
                 <w:sz w:val="19"/>
                 <w:szCs w:val="19"/>
               </w:rPr>
-              <w:t xml:space="preserve">接受事务</w:t>
+              <w:t>受理事务</w:t>
             </w:r>
           </w:p>
         </w:tc>
@@ -4987,7 +5392,7 @@
                 <w:sz w:val="19"/>
                 <w:szCs w:val="19"/>
               </w:rPr>
-              <w:t xml:space="preserve">网关受理时在数据库里"一口气做完"的检查和记账，要么全部成功，要么全部不算。</w:t>
+              <w:t>网关受理时在数据库里"一口气做完"的检查和记账，要么全部成功，要么全部不算。</w:t>
             </w:r>
           </w:p>
         </w:tc>
@@ -5016,7 +5421,7 @@
                 <w:sz w:val="19"/>
                 <w:szCs w:val="19"/>
               </w:rPr>
-              <w:t xml:space="preserve">门限签名（2-of-3）</w:t>
+              <w:t>门限签名（2-of-3）</w:t>
             </w:r>
           </w:p>
         </w:tc>
@@ -5043,7 +5448,7 @@
                 <w:sz w:val="19"/>
                 <w:szCs w:val="19"/>
               </w:rPr>
-              <w:t xml:space="preserve">三把钥匙里任意两把一起才能开的锁。</w:t>
+              <w:t>三把钥匙里任意两把一起才能开的锁。</w:t>
             </w:r>
           </w:p>
         </w:tc>
@@ -5072,7 +5477,7 @@
                 <w:sz w:val="19"/>
                 <w:szCs w:val="19"/>
               </w:rPr>
-              <w:t xml:space="preserve">FROST / Ed25519</w:t>
+              <w:t>FROST / Ed25519</w:t>
             </w:r>
           </w:p>
         </w:tc>
@@ -5128,7 +5533,7 @@
                 <w:sz w:val="19"/>
                 <w:szCs w:val="19"/>
               </w:rPr>
-              <w:t xml:space="preserve">协同签名（两方）</w:t>
+              <w:t>协同签名（两方）</w:t>
             </w:r>
           </w:p>
         </w:tc>
@@ -5155,7 +5560,7 @@
                 <w:sz w:val="19"/>
                 <w:szCs w:val="19"/>
               </w:rPr>
-              <w:t xml:space="preserve">一个签名由两方合作才能产生，每方只有一半能力，单独一方签不出来。</w:t>
+              <w:t>一个签名由两方合作才能产生，每方只有一半能力，单独一方签不出来。</w:t>
             </w:r>
           </w:p>
         </w:tc>
@@ -5184,7 +5589,7 @@
                 <w:sz w:val="19"/>
                 <w:szCs w:val="19"/>
               </w:rPr>
-              <w:t xml:space="preserve">授权域 / 执行域</w:t>
+              <w:t>授权侧签名方 / 网关侧签名方</w:t>
             </w:r>
           </w:p>
         </w:tc>
@@ -5211,7 +5616,7 @@
                 <w:sz w:val="19"/>
                 <w:szCs w:val="19"/>
               </w:rPr>
-              <w:t xml:space="preserve">拿着两半私钥的两个部门。授权域和授权服务器在一起，负责查授权；执行域和网关在一起，负责核对请求。</w:t>
+              <w:t>拿着两半私钥的两个部门。授权侧签名方和授权服务器在一起，负责查授权；网关侧签名方和网关在一起，负责核对请求。</w:t>
             </w:r>
           </w:p>
         </w:tc>
@@ -5240,7 +5645,7 @@
                 <w:sz w:val="19"/>
                 <w:szCs w:val="19"/>
               </w:rPr>
-              <w:t xml:space="preserve">半诚实模型</w:t>
+              <w:t>半诚实模型</w:t>
             </w:r>
           </w:p>
         </w:tc>
@@ -5267,7 +5672,7 @@
                 <w:sz w:val="19"/>
                 <w:szCs w:val="19"/>
               </w:rPr>
-              <w:t xml:space="preserve">一种安全假设：被攻破的一方仍按协议规矩走，只是想偷看别人的秘密。更强的"恶意模型"要防对方乱发消息，需要额外的零知识证明。</w:t>
+              <w:t>一种安全假设：被攻破的一方仍按协议规矩走，只是想偷看别人的秘密。更强的"恶意模型"要防对方乱发消息，需要额外的零知识证明。</w:t>
             </w:r>
           </w:p>
         </w:tc>
@@ -5296,7 +5701,7 @@
                 <w:sz w:val="19"/>
                 <w:szCs w:val="19"/>
               </w:rPr>
-              <w:t xml:space="preserve">x402</w:t>
+              <w:t>x402</w:t>
             </w:r>
           </w:p>
         </w:tc>
@@ -5323,7 +5728,7 @@
                 <w:sz w:val="19"/>
                 <w:szCs w:val="19"/>
               </w:rPr>
-              <w:t xml:space="preserve">程序自动付费的协议：先回"402 需要付款"并报价，再付款，再给资源。</w:t>
+              <w:t>程序自动付费的协议：先回"402 需要付款"并报价，再付款，再给资源。</w:t>
             </w:r>
           </w:p>
         </w:tc>
@@ -5352,7 +5757,7 @@
                 <w:sz w:val="19"/>
                 <w:szCs w:val="19"/>
               </w:rPr>
-              <w:t xml:space="preserve">EIP-3009</w:t>
+              <w:t>EIP-3009</w:t>
             </w:r>
           </w:p>
         </w:tc>
@@ -5379,7 +5784,7 @@
                 <w:sz w:val="19"/>
                 <w:szCs w:val="19"/>
               </w:rPr>
-              <w:t xml:space="preserve">以太坊上的一种"授权别人从我这里转账"的签名格式，x402 用它付款。</w:t>
+              <w:t>以太坊上的一种"授权别人从我这里转账"的签名格式，x402 用它付款。</w:t>
             </w:r>
           </w:p>
         </w:tc>
@@ -5408,7 +5813,7 @@
                 <w:sz w:val="19"/>
                 <w:szCs w:val="19"/>
               </w:rPr>
-              <w:t xml:space="preserve">run_id</w:t>
+              <w:t>run_id</w:t>
             </w:r>
           </w:p>
         </w:tc>
@@ -5435,7 +5840,7 @@
                 <w:sz w:val="19"/>
                 <w:szCs w:val="19"/>
               </w:rPr>
-              <w:t xml:space="preserve">每次真实运行的编号，用来证明"这个结果是哪一次跑出来的"。</w:t>
+              <w:t>每次真实运行的编号，用来证明"这个结果是哪一次跑出来的"。</w:t>
             </w:r>
           </w:p>
         </w:tc>
@@ -5450,7 +5855,7 @@
         <w:rPr>
           <w:rFonts w:ascii="PingFang SC" w:cs="PingFang SC" w:eastAsia="PingFang SC" w:hAnsi="PingFang SC"/>
         </w:rPr>
-        <w:t xml:space="preserve">8. 老师可能会问的问题</w:t>
+        <w:t>8. 老师可能会问的问题</w:t>
       </w:r>
     </w:p>
     <w:tbl>
@@ -5497,7 +5902,7 @@
                 <w:sz w:val="19"/>
                 <w:szCs w:val="19"/>
               </w:rPr>
-              <w:t xml:space="preserve">老师可能问</w:t>
+              <w:t>老师可能问</w:t>
             </w:r>
           </w:p>
         </w:tc>
@@ -5525,7 +5930,7 @@
                 <w:sz w:val="19"/>
                 <w:szCs w:val="19"/>
               </w:rPr>
-              <w:t xml:space="preserve">建议回答</w:t>
+              <w:t>建议回答</w:t>
             </w:r>
           </w:p>
         </w:tc>
@@ -5554,7 +5959,7 @@
                 <w:sz w:val="19"/>
                 <w:szCs w:val="19"/>
               </w:rPr>
-              <w:t xml:space="preserve">你们的密码学创新点是什么？</w:t>
+              <w:t>你们的密码学创新点是什么？</w:t>
             </w:r>
           </w:p>
         </w:tc>
@@ -5581,7 +5986,7 @@
                 <w:sz w:val="19"/>
                 <w:szCs w:val="19"/>
               </w:rPr>
-              <w:t xml:space="preserve">"授权即密钥：下单凭据的 SM2 私钥被拆在授权域和执行域两边，授权域只有在自己核验委托链、撤销状态和预算都成立时才交出它那一半。所以一个有效签名本身就证明了'签名时这笔操作确实被授权'。签名是标准 SM2，任何国密库都能验。"</w:t>
+              <w:t>不靠识别攻击：越权请求在网关和签名环节被确定性拒绝。授权侧核验委托链、撤销和预算后才参与签名，网关单方不能伪造批准；不改模型，下游标准 SM2 验签。条件仍为半诚实、n=2、同主机 Python 非常数时间原型。</w:t>
             </w:r>
           </w:p>
         </w:tc>
@@ -5610,7 +6015,7 @@
                 <w:sz w:val="19"/>
                 <w:szCs w:val="19"/>
               </w:rPr>
-              <w:t xml:space="preserve">这和普通的两方协同签名有什么不同？</w:t>
+              <w:t>这和普通的两方协同签名有什么不同？</w:t>
             </w:r>
           </w:p>
         </w:tc>
@@ -5637,7 +6042,7 @@
                 <w:sz w:val="19"/>
                 <w:szCs w:val="19"/>
               </w:rPr>
-              <w:t xml:space="preserve">"两方 SM2 协同签名本身是已有技术，我们不声称发明了签名算法。我们的贡献在于把'交出份额的条件'和 OAuth 委托授权的实时状态绑在一起，并且和网关的受理事务、下单服务、付款意图组合成一条完整路径。"</w:t>
+              <w:t>两方 SM2 协同签名是已有技术。本项目在这一方向上，将授权检查作为授权侧参与签名的条件，并与受理事务、效果端和付款批准组合；不泛化断言其他产品只核对身份。</w:t>
             </w:r>
           </w:p>
         </w:tc>
@@ -5666,7 +6071,7 @@
                 <w:sz w:val="19"/>
                 <w:szCs w:val="19"/>
               </w:rPr>
-              <w:t xml:space="preserve">网关被攻破了怎么办？</w:t>
+              <w:t>网关被攻破了怎么办？</w:t>
             </w:r>
           </w:p>
         </w:tc>
@@ -5693,7 +6098,7 @@
                 <w:sz w:val="19"/>
                 <w:szCs w:val="19"/>
               </w:rPr>
-              <w:t xml:space="preserve">"网关只有执行域那一半，自己签不出有效签名；下单服务也会独立验签并防止同一个批准被用两次。所以攻破网关最多只能执行授权域已经批准过的那一笔、而且只能一次。但'签名之后才撤销'这种情况目前仍靠网关挡，这是我们写明的局限。下一步要做的'授权状态承诺'就是为了堵这个口子：让签名里带上授权状态的编号，下单服务离线就能判断它新不新。"</w:t>
+              <w:t>"网关只有网关侧签名方那一半，自己签不出有效签名；下单服务也会独立验签并防止同一个批准被用两次。所以攻破网关最多只能执行授权侧签名方已经批准过的那一笔、而且只能一次。但'签名之后才撤销'这种情况目前仍靠网关挡，这是我们写明的局限。下一步要做的'撤销名单快照'就是为了堵这个口子：让签名里带上授权状态的编号，下单服务离线就能判断它新不新。"</w:t>
             </w:r>
           </w:p>
         </w:tc>
@@ -5722,7 +6127,7 @@
                 <w:sz w:val="19"/>
                 <w:szCs w:val="19"/>
               </w:rPr>
-              <w:t xml:space="preserve">为什么不直接做三方门限？</w:t>
+              <w:t>为什么不直接做三方门限？</w:t>
             </w:r>
           </w:p>
         </w:tc>
@@ -5749,7 +6154,7 @@
                 <w:sz w:val="19"/>
                 <w:szCs w:val="19"/>
               </w:rPr>
-              <w:t xml:space="preserve">"SM2 的签名结构让三方以上的门限需要同态加密或零知识证明，三天内做不扎实。我们先把两方做完整、做验证，三方推广已经有设计，决赛前推进。"</w:t>
+              <w:t>"SM2 的签名结构让三方以上的门限需要同态加密或零知识证明，三天内做不扎实。我们先把两方做完整、做验证，三方推广已经有设计，决赛前推进。"</w:t>
             </w:r>
           </w:p>
         </w:tc>
@@ -5778,7 +6183,7 @@
                 <w:sz w:val="19"/>
                 <w:szCs w:val="19"/>
               </w:rPr>
-              <w:t xml:space="preserve">安全性有证明吗？</w:t>
+              <w:t>安全性有证明吗？</w:t>
             </w:r>
           </w:p>
         </w:tc>
@@ -5805,7 +6210,7 @@
                 <w:sz w:val="19"/>
                 <w:szCs w:val="19"/>
               </w:rPr>
-              <w:t xml:space="preserve">"目前是半诚实模型下的论证，加上大量真实负例测试；决赛前计划用形式化工具验证'撤销后不会再被受理'。我们不会说'已经证明绝对安全'。"</w:t>
+              <w:t>"目前是半诚实模型下的论证，加上大量真实负例测试；决赛前计划用形式化工具验证'撤销后不会再被受理'。我们不把测试结果扩大为普适安全保证。"</w:t>
             </w:r>
           </w:p>
         </w:tc>
@@ -5834,7 +6239,7 @@
                 <w:sz w:val="19"/>
                 <w:szCs w:val="19"/>
               </w:rPr>
-              <w:t xml:space="preserve">红叉是真的还是画的？</w:t>
+              <w:t>红叉是真的还是画的？</w:t>
             </w:r>
           </w:p>
         </w:tc>
@@ -5861,7 +6266,7 @@
                 <w:sz w:val="19"/>
                 <w:szCs w:val="19"/>
               </w:rPr>
-              <w:t>"右上角标签写'示意推演'的是讲解动画；'现场运行'和'记录回放'是真实运行的结果，在'运行证据'页都有 run_id 和时间。我们刻意把两者分开显示。"</w:t>
+              <w:t>"右上角标签写'动画示意'的是讲解动画；'现场运行'和'记录回放'是真实运行的结果，在'测试记录'页都有 run_id 和时间。我们刻意把两者分开显示。"</w:t>
             </w:r>
           </w:p>
         </w:tc>
@@ -5890,7 +6295,7 @@
                 <w:sz w:val="19"/>
                 <w:szCs w:val="19"/>
               </w:rPr>
-              <w:t xml:space="preserve">x402 用了真钱吗？</w:t>
+              <w:t>x402 用了真钱吗？</w:t>
             </w:r>
           </w:p>
         </w:tc>
@@ -5917,7 +6322,7 @@
                 <w:sz w:val="19"/>
                 <w:szCs w:val="19"/>
               </w:rPr>
-              <w:t xml:space="preserve">"没有。是本地测试链和自建的测试代币。付款意图已经可以要求双域共签批准，但链上付款签名本身仍是以太坊的格式。"</w:t>
+              <w:t>"没有。是本地测试链和自建的测试代币。付款意图已经可以要求协同签名批准，但链上付款签名本身仍是以太坊的格式。"</w:t>
             </w:r>
           </w:p>
         </w:tc>
@@ -5946,7 +6351,7 @@
                 <w:sz w:val="19"/>
                 <w:szCs w:val="19"/>
               </w:rPr>
-              <w:t xml:space="preserve">代理是真的大模型吗？</w:t>
+              <w:t>代理是真的大模型吗？</w:t>
             </w:r>
           </w:p>
         </w:tc>
@@ -6002,7 +6407,7 @@
                 <w:sz w:val="19"/>
                 <w:szCs w:val="19"/>
               </w:rPr>
-              <w:t xml:space="preserve">和 KITA 那篇论文有什么区别？</w:t>
+              <w:t>和 KITA 那篇论文有什么区别？</w:t>
             </w:r>
           </w:p>
         </w:tc>
@@ -6029,7 +6434,7 @@
                 <w:sz w:val="19"/>
                 <w:szCs w:val="19"/>
               </w:rPr>
-              <w:t xml:space="preserve">"KITA 是让多个大模型评审投票之后释放门限 BLS 签名份额；我们的授权域依据的是可以用密码学验证的委托链和撤销状态，并且用国密 SM2，不需要可信分发者。"</w:t>
+              <w:t>"KITA 是让多个大模型评审投票之后释放门限 BLS 签名份额；我们的授权侧签名方依据的是可以用密码学验证的委托链和撤销状态，并且用国密 SM2，不需要可信分发者。"</w:t>
             </w:r>
           </w:p>
         </w:tc>
@@ -6056,14 +6461,14 @@
           <w:bCs/>
           <w:color w:val="1F2937"/>
         </w:rPr>
-        <w:t xml:space="preserve">遇到答不上的问题</w:t>
-      </w:r>
-      <w:r>
-        <w:rPr>
-          <w:rFonts w:ascii="PingFang SC" w:cs="PingFang SC" w:eastAsia="PingFang SC" w:hAnsi="PingFang SC"/>
-          <w:color w:val="1F2937"/>
-        </w:rPr>
-        <w:t xml:space="preserve">：如实说"这一点我们还没有验证，回去确认后再答复老师"，比临场编造好得多。</w:t>
+        <w:t>遇到答不上的问题</w:t>
+      </w:r>
+      <w:r>
+        <w:rPr>
+          <w:rFonts w:ascii="PingFang SC" w:cs="PingFang SC" w:eastAsia="PingFang SC" w:hAnsi="PingFang SC"/>
+          <w:color w:val="1F2937"/>
+        </w:rPr>
+        <w:t>：如实说"这一点我们还没有验证，回去确认后再答复老师"，比临场编造好得多。</w:t>
       </w:r>
     </w:p>
     <w:p>
@@ -6096,7 +6501,7 @@
           <w:rFonts w:ascii="PingFang SC" w:cs="PingFang SC" w:eastAsia="PingFang SC" w:hAnsi="PingFang SC"/>
           <w:color w:val="1F2937"/>
         </w:rPr>
-        <w:t>：OAuth 是骨架，我们没有改 OAuth 协议本身；我们做的是在它上面补齐 OAuth 管不到的事，并且把签名全部换成国密。论文里这部分写在 4.1"基础机制"，不列为创新点。复赛的创新点是双域共签，而双域共签里授权域核验的，正是这里由 OAuth 签发出来的委托链——这句话是把 OAuth 和创新点连起来的关键。</w:t>
+        <w:t>：OAuth 是骨架，我们没有改 OAuth 协议本身；我们做的是在它上面补齐 OAuth 管不到的事，并且把签名全部换成国密。论文里这部分写在 4.1"基础机制"，不列为创新点。复赛的创新点是协同签名，而协同签名里授权侧签名方核验的，正是这里由 OAuth 签发出来的委托链——这句话是把 OAuth 和创新点连起来的关键。</w:t>
       </w:r>
     </w:p>
     <w:p>
@@ -6171,7 +6576,7 @@
           <w:rFonts w:ascii="PingFang SC" w:cs="PingFang SC" w:eastAsia="PingFang SC" w:hAnsi="PingFang SC"/>
           <w:color w:val="1F2937"/>
         </w:rPr>
-        <w:t>：统筹代理 → 选品代理 → 执行代理，每一级都用 OAuth 令牌交换（Token Exchange，RFC 8693）向授权服务器申请，由授权服务器签发更小的子令牌。代理之间不能私自发令牌。</w:t>
+        <w:t>：统筹代理 → 选品代理 → 下单代理，每一级都用 OAuth 令牌交换（Token Exchange，RFC 8693）向授权服务器申请，由授权服务器签发更小的子令牌。代理之间不能私自发令牌。</w:t>
       </w:r>
     </w:p>
     <w:p>
@@ -6192,7 +6597,7 @@
           <w:rFonts w:ascii="PingFang SC" w:cs="PingFang SC" w:eastAsia="PingFang SC" w:hAnsi="PingFang SC"/>
           <w:color w:val="1F2937"/>
         </w:rPr>
-        <w:t>：执行代理出示令牌，同时附一份用自己私钥签的 AG-Proof（每次请求一份）。</w:t>
+        <w:t>：下单代理出示令牌，同时附一份用自己私钥签的 请求证明（每次请求一份）。</w:t>
       </w:r>
     </w:p>
     <w:p>
@@ -6213,7 +6618,7 @@
           <w:rFonts w:ascii="PingFang SC" w:cs="PingFang SC" w:eastAsia="PingFang SC" w:hAnsi="PingFang SC"/>
           <w:color w:val="1F2937"/>
         </w:rPr>
-        <w:t>：执行网关（OAuth 里的"资源服务器"）验令牌、验 AG-Proof，再在接受事务里查撤销和预算，全部通过才放行。</w:t>
+        <w:t>：工具调用网关（OAuth 里的"资源服务器"）验令牌、验 请求证明，再在受理事务里查撤销和预算，全部通过才放行。</w:t>
       </w:r>
     </w:p>
     <w:tbl>
@@ -6456,7 +6861,7 @@
                 <w:sz w:val="19"/>
                 <w:szCs w:val="19"/>
               </w:rPr>
-              <w:t>统筹、选品、执行三个代理的后端，各自有独立 client_id 和 SM2 私钥</w:t>
+              <w:t>统筹、选品、下单三个代理的后端，各自有独立 client_id 和 SM2 私钥</w:t>
             </w:r>
           </w:p>
         </w:tc>
@@ -6512,7 +6917,7 @@
                 <w:sz w:val="19"/>
                 <w:szCs w:val="19"/>
               </w:rPr>
-              <w:t>执行网关；下游订单服务只信任网关</w:t>
+              <w:t>工具调用网关；下游订单服务只信任网关</w:t>
             </w:r>
           </w:p>
         </w:tc>
@@ -6770,7 +7175,7 @@
                 <w:sz w:val="19"/>
                 <w:szCs w:val="19"/>
               </w:rPr>
-              <w:t>令牌、ID Token、请求证明全部 SM2 签名、SM3 摘要（配置名 GM-MVP-1）；不同用途的令牌用 typ 区分，不能串用</w:t>
+              <w:t>令牌、ID Token、请求证明全部 SM2 签名、SM3 摘要（配置名 国密配置 v1）；不同用途的令牌用 typ 区分，不能串用</w:t>
             </w:r>
           </w:p>
         </w:tc>
@@ -6853,7 +7258,7 @@
                 <w:sz w:val="19"/>
                 <w:szCs w:val="19"/>
               </w:rPr>
-              <w:t>令牌用 ag_cnf 绑定持有者公钥（经 DID 文档和企业登记表确认）；每次请求附 AG-Proof，用 SM3 绑定令牌和完整请求体，并区分用途、防重放（持有者绑定、参数篡改、重放幂等）</w:t>
+              <w:t>令牌用 ag_cnf 绑定持有者公钥（经 DID 文档和企业登记表确认）；每次请求附 请求证明，用 SM3 绑定令牌和完整请求体，并区分用途、防重放（防令牌盗用、防参数篡改、防重放）</w:t>
             </w:r>
           </w:p>
         </w:tc>
@@ -6882,7 +7287,7 @@
                 <w:sz w:val="19"/>
                 <w:szCs w:val="19"/>
               </w:rPr>
-              <w:t>委托收窄</w:t>
+              <w:t>委托降权</w:t>
             </w:r>
           </w:p>
         </w:tc>
@@ -6936,7 +7341,7 @@
                 <w:sz w:val="19"/>
                 <w:szCs w:val="19"/>
               </w:rPr>
-              <w:t>授权服务器逐维比较金额、次数、期限、深度、工具、受众、接收方和资源清单，子授权必须包含于父授权；超出一点就拒绝，不悄悄缩小（委托收窄）</w:t>
+              <w:t>授权服务器逐维比较金额、次数、期限、深度、工具、受众、接收方和资源清单，子授权必须包含于父授权；超出一点就拒绝，不悄悄缩小（委托降权）</w:t>
             </w:r>
           </w:p>
         </w:tc>
@@ -7102,7 +7507,7 @@
                 <w:sz w:val="19"/>
                 <w:szCs w:val="19"/>
               </w:rPr>
-              <w:t>授权树存在数据库里；子额度不是独立钱包，根和所有祖先共享同一笔预算；签发子令牌不算花钱，下单时才在接受事务里原子预留（共享预算）</w:t>
+              <w:t>授权树存在数据库里；子额度不是独立钱包，根和所有祖先共享同一笔预算；签发子令牌不算花钱，下单时才在受理事务里原子预留（共享预算）</w:t>
             </w:r>
           </w:p>
         </w:tc>
@@ -7185,7 +7590,7 @@
                 <w:sz w:val="19"/>
                 <w:szCs w:val="19"/>
               </w:rPr>
-              <w:t>撤销整棵子树；在接受业务的同一个数据库事务里复核根和全部祖先，撤销先提交则新请求一定被拒；令牌最长 300 秒，没有刷新令牌（动态撤销）</w:t>
+              <w:t>撤销整棵子树；在接受业务的同一个数据库事务里复核根和全部祖先，撤销先提交则新请求一定被拒；令牌最长 300 秒，没有刷新令牌（撤销生效）</w:t>
             </w:r>
           </w:p>
         </w:tc>
@@ -7351,7 +7756,7 @@
                 <w:sz w:val="19"/>
                 <w:szCs w:val="19"/>
               </w:rPr>
-              <w:t>双域共签里，授权域出份额之前核验的就是这棵 OAuth 委托树（AS 签名链、撤销、预算）：OAuth 的授权状态直接变成"能不能签出这一笔"的条件</w:t>
+              <w:t>协同签名里，授权侧签名方出份额之前核验的就是这棵 OAuth 委托树（AS 签名链、撤销、预算）：OAuth 的授权状态直接变成"能不能签出这一笔"的条件</w:t>
             </w:r>
           </w:p>
         </w:tc>
@@ -7417,7 +7822,7 @@
           <w:rFonts w:ascii="PingFang SC" w:cs="PingFang SC" w:eastAsia="PingFang SC" w:hAnsi="PingFang SC"/>
           <w:color w:val="1F2937"/>
         </w:rPr>
-        <w:t>AGPoP 参照 DPoP 的思路，但不是 DPoP，不能和标准 DPoP 互通；SM2 的算法标识是我们自己定义的，没有在 IANA 注册。所以不能直接和通用 OAuth / OIDC 客户端互通。</w:t>
+        <w:t>请求证明 参照 DPoP 的思路，但不是 DPoP，不能和标准 DPoP 互通；SM2 的算法标识是我们自己定义的，没有在 IANA 注册。所以不能直接和通用 OAuth / OIDC 客户端互通。</w:t>
       </w:r>
     </w:p>
     <w:p>
@@ -7723,7 +8128,7 @@
                 <w:sz w:val="19"/>
                 <w:szCs w:val="19"/>
               </w:rPr>
-              <w:t>"DPoP 默认只绑定 HTTP 方法、地址和令牌哈希，不签请求体，摘要规定用 SHA-256。我们这里被篡改的往往是请求参数，比如数量和收货地址，所以要把完整请求体签进去；又要用 SM3，就不能再叫 DPoP，所以单独定义了 AGPoP。"</w:t>
+              <w:t>"DPoP 默认只绑定 HTTP 方法、地址和令牌哈希，不签请求体，摘要规定用 SHA-256。我们这里被篡改的往往是请求参数，比如数量和收货地址，所以要把完整请求体签进去；又要用 SM3，就不能再叫 DPoP，所以单独定义了 请求证明。"</w:t>
             </w:r>
           </w:p>
         </w:tc>
@@ -7779,7 +8184,7 @@
                 <w:sz w:val="19"/>
                 <w:szCs w:val="19"/>
               </w:rPr>
-              <w:t>"两层：令牌最长 300 秒、没有刷新令牌；更关键的是网关在接受业务的同一个数据库事务里查根和所有祖先的撤销状态，签名有效也越不过撤销。签名之后才撤销、同时网关又被攻破的情况，是下一步授权状态承诺要解决的。"</w:t>
+              <w:t>"两层：令牌最长 300 秒、没有刷新令牌；更关键的是网关在接受业务的同一个数据库事务里查根和所有祖先的撤销状态，签名有效也越不过撤销。签名之后才撤销、同时网关又被攻破的情况，是下一步撤销名单快照要解决的。"</w:t>
             </w:r>
           </w:p>
         </w:tc>
@@ -8115,7 +8520,7 @@
                 <w:sz w:val="19"/>
                 <w:szCs w:val="19"/>
               </w:rPr>
-              <w:t>"不算主要创新。OAuth、令牌交换、发送者约束都是已有标准，我们不声称首创。我们在这一层做的是补齐和组合：把委托收窄、共享预算、子树撤销放进同一条执行路径，并全部国密化。真正的密码学创新是双域共签，它把这里的授权状态变成了签名条件。"</w:t>
+              <w:t>"不算主要创新。OAuth、令牌交换、发送者约束都是已有标准，我们采用已有标准方向。我们在这一层做的是补齐和组合：把委托降权、共享预算、子树撤销放进同一条执行路径，并全部国密化。真正的密码学创新是协同签名，它把这里的授权状态变成了签名条件。"</w:t>
             </w:r>
           </w:p>
         </w:tc>

</xml_diff>